<commit_message>
exporta contrato en pdf y modals ahora son con icono
</commit_message>
<xml_diff>
--- a/billing/templates/billing/contrato.docx
+++ b/billing/templates/billing/contrato.docx
@@ -1,10 +1,10 @@
 
 <file path=word/document.xml><?xml version="1.0" encoding="utf-8"?>
-<w:document xmlns:o="urn:schemas-microsoft-com:office:office" xmlns:r="http://schemas.openxmlformats.org/officeDocument/2006/relationships" xmlns:v="urn:schemas-microsoft-com:vml" xmlns:w="http://schemas.openxmlformats.org/wordprocessingml/2006/main" xmlns:w10="urn:schemas-microsoft-com:office:word" xmlns:wp="http://schemas.openxmlformats.org/drawingml/2006/wordprocessingDrawing" xmlns:wps="http://schemas.microsoft.com/office/word/2010/wordprocessingShape" xmlns:wpg="http://schemas.microsoft.com/office/word/2010/wordprocessingGroup" xmlns:mc="http://schemas.openxmlformats.org/markup-compatibility/2006" xmlns:wp14="http://schemas.microsoft.com/office/word/2010/wordprocessingDrawing" xmlns:w14="http://schemas.microsoft.com/office/word/2010/wordml" mc:Ignorable="w14 wp14">
+<w:document xmlns:o="urn:schemas-microsoft-com:office:office" xmlns:r="http://schemas.openxmlformats.org/officeDocument/2006/relationships" xmlns:v="urn:schemas-microsoft-com:vml" xmlns:w="http://schemas.openxmlformats.org/wordprocessingml/2006/main" xmlns:w10="urn:schemas-microsoft-com:office:word" xmlns:wp="http://schemas.openxmlformats.org/drawingml/2006/wordprocessingDrawing" xmlns:wps="http://schemas.microsoft.com/office/word/2010/wordprocessingShape" xmlns:wpg="http://schemas.microsoft.com/office/word/2010/wordprocessingGroup" xmlns:mc="http://schemas.openxmlformats.org/markup-compatibility/2006" xmlns:wp14="http://schemas.microsoft.com/office/word/2010/wordprocessingDrawing" xmlns:w14="http://schemas.microsoft.com/office/word/2010/wordml" xmlns:w15="http://schemas.microsoft.com/office/word/2012/wordml" mc:Ignorable="w14 wp14 w15">
   <w:body>
     <w:p>
       <w:pPr>
-        <w:pStyle w:val="Titular"/>
+        <w:pStyle w:val="Ttulogeneral"/>
         <w:jc w:val="both"/>
         <w:rPr>
           <w:rFonts w:ascii="Comfortaa" w:hAnsi="Comfortaa" w:eastAsia="Times New Roman"/>
@@ -27,7 +27,7 @@
     </w:p>
     <w:p>
       <w:pPr>
-        <w:pStyle w:val="Titular"/>
+        <w:pStyle w:val="Ttulogeneral"/>
         <w:rPr>
           <w:rFonts w:ascii="Comfortaa" w:hAnsi="Comfortaa" w:eastAsia="Times New Roman"/>
           <w:color w:val="035941"/>
@@ -50,7 +50,9 @@
     <w:p>
       <w:pPr>
         <w:pStyle w:val="NoSpacing"/>
-        <w:rPr/>
+        <w:rPr>
+          <w:lang w:val="es-CO"/>
+        </w:rPr>
       </w:pPr>
       <w:r>
         <w:rPr>
@@ -59,145 +61,130 @@
           <w:szCs w:val="20"/>
           <w:lang w:val="es-MX" w:eastAsia="es-MX"/>
         </w:rPr>
-        <w:t xml:space="preserve">Fecha de inicio del contrato: </w:t>
-      </w:r>
-      <w:r>
+        <w:t>Fecha de inicio del contrato: {{fecha}}</w:t>
+      </w:r>
+    </w:p>
+    <w:p>
+      <w:pPr>
+        <w:pStyle w:val="Normal"/>
+        <w:shd w:val="clear" w:color="auto" w:fill="FFFFFF"/>
+        <w:spacing w:lineRule="auto" w:line="240" w:before="0" w:after="0"/>
+        <w:jc w:val="both"/>
+        <w:rPr>
+          <w:lang w:val="es-CO"/>
+        </w:rPr>
+      </w:pPr>
+      <w:r>
+        <w:rPr>
+          <w:rFonts w:eastAsia="Times New Roman" w:cs="Times New Roman" w:ascii="Comfortaa Light" w:hAnsi="Comfortaa Light"/>
+          <w:color w:val="000000" w:themeColor="text1"/>
+          <w:sz w:val="20"/>
+          <w:szCs w:val="20"/>
+          <w:lang w:val="es-MX" w:eastAsia="es-MX"/>
+        </w:rPr>
+        <w:t>Numero de Contrato: {{orden}}</w:t>
+      </w:r>
+    </w:p>
+    <w:p>
+      <w:pPr>
+        <w:pStyle w:val="Normal"/>
+        <w:shd w:val="clear" w:color="auto" w:fill="FFFFFF"/>
+        <w:spacing w:lineRule="auto" w:line="240" w:before="0" w:after="0"/>
+        <w:jc w:val="both"/>
+        <w:rPr>
+          <w:rFonts w:ascii="Comfortaa Light" w:hAnsi="Comfortaa Light" w:eastAsia="Times New Roman" w:cs="Times New Roman"/>
+          <w:color w:val="000000" w:themeColor="text1"/>
+          <w:sz w:val="20"/>
+          <w:szCs w:val="20"/>
+          <w:lang w:val="es-MX" w:eastAsia="es-MX"/>
+        </w:rPr>
+      </w:pPr>
+      <w:r>
+        <w:rPr>
+          <w:rFonts w:eastAsia="Times New Roman" w:cs="Times New Roman" w:ascii="Comfortaa Light" w:hAnsi="Comfortaa Light"/>
+          <w:color w:val="000000" w:themeColor="text1"/>
+          <w:sz w:val="20"/>
+          <w:szCs w:val="20"/>
+          <w:lang w:val="es-MX" w:eastAsia="es-MX"/>
+        </w:rPr>
+      </w:r>
+    </w:p>
+    <w:p>
+      <w:pPr>
+        <w:pStyle w:val="NoSpacing"/>
         <w:rPr>
           <w:rFonts w:ascii="Comfortaa Light" w:hAnsi="Comfortaa Light"/>
           <w:sz w:val="20"/>
           <w:szCs w:val="20"/>
           <w:lang w:val="es-MX" w:eastAsia="es-MX"/>
         </w:rPr>
-        <w:t>{{fecha}}</w:t>
-      </w:r>
-    </w:p>
-    <w:p>
-      <w:pPr>
-        <w:pStyle w:val="Normal"/>
-        <w:shd w:val="clear" w:color="auto" w:fill="FFFFFF"/>
-        <w:spacing w:lineRule="auto" w:line="240" w:before="0" w:after="0"/>
-        <w:jc w:val="both"/>
-        <w:rPr/>
-      </w:pPr>
-      <w:r>
-        <w:rPr>
-          <w:rFonts w:eastAsia="Times New Roman" w:cs="Times New Roman" w:ascii="Comfortaa Light" w:hAnsi="Comfortaa Light"/>
-          <w:color w:val="000000" w:themeColor="text1"/>
-          <w:sz w:val="20"/>
-          <w:szCs w:val="20"/>
-          <w:lang w:val="es-MX" w:eastAsia="es-MX"/>
-        </w:rPr>
-        <w:t xml:space="preserve">Numero de Contrato: </w:t>
-      </w:r>
-      <w:r>
-        <w:rPr>
-          <w:rFonts w:eastAsia="Times New Roman" w:cs="Times New Roman" w:ascii="Comfortaa Light" w:hAnsi="Comfortaa Light"/>
-          <w:color w:val="000000" w:themeColor="text1"/>
-          <w:sz w:val="20"/>
-          <w:szCs w:val="20"/>
-          <w:lang w:val="es-MX" w:eastAsia="es-MX"/>
-        </w:rPr>
-        <w:t>{{orden}}</w:t>
-      </w:r>
-    </w:p>
-    <w:p>
-      <w:pPr>
-        <w:pStyle w:val="Normal"/>
-        <w:shd w:val="clear" w:color="auto" w:fill="FFFFFF"/>
-        <w:spacing w:lineRule="auto" w:line="240" w:before="0" w:after="0"/>
-        <w:jc w:val="both"/>
-        <w:rPr>
-          <w:rFonts w:ascii="Comfortaa Light" w:hAnsi="Comfortaa Light" w:eastAsia="Times New Roman" w:cs="Times New Roman"/>
-          <w:color w:val="000000" w:themeColor="text1"/>
-          <w:sz w:val="20"/>
-          <w:szCs w:val="20"/>
-          <w:lang w:val="es-MX" w:eastAsia="es-MX"/>
-        </w:rPr>
-      </w:pPr>
-      <w:r>
-        <w:rPr>
-          <w:rFonts w:eastAsia="Times New Roman" w:cs="Times New Roman" w:ascii="Comfortaa Light" w:hAnsi="Comfortaa Light"/>
-          <w:color w:val="000000" w:themeColor="text1"/>
-          <w:sz w:val="20"/>
-          <w:szCs w:val="20"/>
-          <w:lang w:val="es-MX" w:eastAsia="es-MX"/>
-        </w:rPr>
-      </w:r>
-    </w:p>
-    <w:p>
-      <w:pPr>
-        <w:pStyle w:val="NoSpacing"/>
+      </w:pPr>
+      <w:r>
+        <w:rPr>
+          <w:rFonts w:cs="Times New Roman"/>
+          <w:sz w:val="27"/>
+          <w:szCs w:val="27"/>
+          <w:lang w:val="es-MX" w:eastAsia="es-MX"/>
+        </w:rPr>
+        <w:t>Vendedor</w:t>
+        <w:br/>
+      </w:r>
+      <w:r>
         <w:rPr>
           <w:rFonts w:ascii="Comfortaa Light" w:hAnsi="Comfortaa Light"/>
           <w:sz w:val="20"/>
           <w:szCs w:val="20"/>
           <w:lang w:val="es-MX" w:eastAsia="es-MX"/>
         </w:rPr>
-      </w:pPr>
-      <w:r>
-        <w:rPr>
-          <w:rFonts w:cs="Times New Roman"/>
-          <w:sz w:val="27"/>
-          <w:szCs w:val="27"/>
-          <w:lang w:val="es-MX" w:eastAsia="es-MX"/>
-        </w:rPr>
-        <w:t>Vendedor</w:t>
-        <w:br/>
-      </w:r>
-      <w:r>
+        <w:t>Representante legal: David Marin </w:t>
+      </w:r>
+    </w:p>
+    <w:p>
+      <w:pPr>
+        <w:pStyle w:val="NoSpacing"/>
         <w:rPr>
           <w:rFonts w:ascii="Comfortaa Light" w:hAnsi="Comfortaa Light"/>
           <w:sz w:val="20"/>
           <w:szCs w:val="20"/>
           <w:lang w:val="es-MX" w:eastAsia="es-MX"/>
         </w:rPr>
-        <w:t>Representante legal: David Marin </w:t>
-      </w:r>
-    </w:p>
-    <w:p>
-      <w:pPr>
-        <w:pStyle w:val="NoSpacing"/>
+      </w:pPr>
+      <w:r>
         <w:rPr>
           <w:rFonts w:ascii="Comfortaa Light" w:hAnsi="Comfortaa Light"/>
           <w:sz w:val="20"/>
           <w:szCs w:val="20"/>
           <w:lang w:val="es-MX" w:eastAsia="es-MX"/>
         </w:rPr>
-      </w:pPr>
-      <w:r>
+        <w:t>Treeconomy, INC.</w:t>
+      </w:r>
+    </w:p>
+    <w:p>
+      <w:pPr>
+        <w:pStyle w:val="NoSpacing"/>
         <w:rPr>
           <w:rFonts w:ascii="Comfortaa Light" w:hAnsi="Comfortaa Light"/>
           <w:sz w:val="20"/>
           <w:szCs w:val="20"/>
           <w:lang w:val="es-MX" w:eastAsia="es-MX"/>
         </w:rPr>
-        <w:t>Treeconomy, INC.</w:t>
-      </w:r>
-    </w:p>
-    <w:p>
-      <w:pPr>
-        <w:pStyle w:val="NoSpacing"/>
+      </w:pPr>
+      <w:r>
         <w:rPr>
           <w:rFonts w:ascii="Comfortaa Light" w:hAnsi="Comfortaa Light"/>
           <w:sz w:val="20"/>
           <w:szCs w:val="20"/>
           <w:lang w:val="es-MX" w:eastAsia="es-MX"/>
         </w:rPr>
-      </w:pPr>
-      <w:r>
-        <w:rPr>
-          <w:rFonts w:ascii="Comfortaa Light" w:hAnsi="Comfortaa Light"/>
-          <w:sz w:val="20"/>
-          <w:szCs w:val="20"/>
-          <w:lang w:val="es-MX" w:eastAsia="es-MX"/>
-        </w:rPr>
         <w:t>Para contactarnos: </w:t>
       </w:r>
     </w:p>
     <w:p>
       <w:pPr>
         <w:pStyle w:val="NoSpacing"/>
-        <w:rPr/>
+        <w:rPr>
+          <w:lang w:val="es-CO"/>
+        </w:rPr>
       </w:pPr>
       <w:r>
         <w:rPr>
@@ -245,12 +232,13 @@
     <w:p>
       <w:pPr>
         <w:pStyle w:val="NoSpacing"/>
-        <w:rPr/>
+        <w:rPr>
+          <w:lang w:val="es-CO"/>
+        </w:rPr>
       </w:pPr>
       <w:hyperlink r:id="rId3">
         <w:r>
           <w:rPr>
-            <w:rStyle w:val="ListLabel35"/>
             <w:rFonts w:ascii="Comfortaa Light" w:hAnsi="Comfortaa Light"/>
             <w:sz w:val="20"/>
             <w:szCs w:val="20"/>
@@ -279,8 +267,8 @@
           <w:rFonts w:ascii="Comfortaa Light" w:hAnsi="Comfortaa Light"/>
           <w:sz w:val="20"/>
           <w:szCs w:val="20"/>
+          <w:highlight w:val="white"/>
           <w:u w:val="single"/>
-          <w:shd w:fill="FFFFFF" w:val="clear"/>
           <w:lang w:val="es-MX" w:eastAsia="es-MX"/>
         </w:rPr>
       </w:r>
@@ -310,7 +298,9 @@
     <w:p>
       <w:pPr>
         <w:pStyle w:val="NoSpacing"/>
-        <w:rPr/>
+        <w:rPr>
+          <w:lang w:val="es-CO"/>
+        </w:rPr>
       </w:pPr>
       <w:r>
         <w:rPr>
@@ -319,8 +309,16 @@
           <w:szCs w:val="20"/>
           <w:lang w:val="es-MX" w:eastAsia="es-MX"/>
         </w:rPr>
-        <w:t>Nombre: </w:t>
-      </w:r>
+        <w:t>Nombre: {{comprador_nombre}}</w:t>
+      </w:r>
+    </w:p>
+    <w:p>
+      <w:pPr>
+        <w:pStyle w:val="NoSpacing"/>
+        <w:rPr>
+          <w:lang w:val="es-CO"/>
+        </w:rPr>
+      </w:pPr>
       <w:r>
         <w:rPr>
           <w:rFonts w:ascii="Comfortaa Light" w:hAnsi="Comfortaa Light"/>
@@ -328,13 +326,15 @@
           <w:szCs w:val="20"/>
           <w:lang w:val="es-MX" w:eastAsia="es-MX"/>
         </w:rPr>
-        <w:t>{{comprador_nombre}}</w:t>
+        <w:t>Documento de identidad: {{comprador_id}}.</w:t>
       </w:r>
     </w:p>
     <w:p>
       <w:pPr>
         <w:pStyle w:val="NoSpacing"/>
-        <w:rPr/>
+        <w:rPr>
+          <w:lang w:val="es-CO"/>
+        </w:rPr>
       </w:pPr>
       <w:r>
         <w:rPr>
@@ -343,48 +343,26 @@
           <w:szCs w:val="20"/>
           <w:lang w:val="es-MX" w:eastAsia="es-MX"/>
         </w:rPr>
-        <w:t xml:space="preserve">Documento de identidad: </w:t>
-      </w:r>
-      <w:r>
-        <w:rPr>
-          <w:rFonts w:ascii="Comfortaa Light" w:hAnsi="Comfortaa Light"/>
+        <w:t xml:space="preserve">Correo electrónico y Usuario: </w:t>
+      </w:r>
+      <w:r>
+        <w:rPr>
+          <w:rStyle w:val="EnlacedeInternet"/>
+          <w:rFonts w:eastAsia="Times New Roman" w:cs="Arial" w:ascii="Comfortaa Light" w:hAnsi="Comfortaa Light"/>
+          <w:color w:val="000000" w:themeColor="text1"/>
           <w:sz w:val="20"/>
           <w:szCs w:val="20"/>
           <w:lang w:val="es-MX" w:eastAsia="es-MX"/>
         </w:rPr>
-        <w:t>{{comprador_id}}.</w:t>
+        <w:t>{{comprador_email}}</w:t>
       </w:r>
     </w:p>
     <w:p>
       <w:pPr>
         <w:pStyle w:val="NoSpacing"/>
-        <w:rPr/>
-      </w:pPr>
-      <w:r>
-        <w:rPr>
-          <w:rFonts w:ascii="Comfortaa Light" w:hAnsi="Comfortaa Light"/>
-          <w:sz w:val="20"/>
-          <w:szCs w:val="20"/>
-          <w:lang w:val="es-MX" w:eastAsia="es-MX"/>
-        </w:rPr>
-        <w:t xml:space="preserve">Correo electrónico y Usuario: </w:t>
-      </w:r>
-      <w:r>
-        <w:rPr>
-          <w:rStyle w:val="EnlacedeInternet"/>
-          <w:rFonts w:eastAsia="Times New Roman" w:cs="Arial" w:ascii="Comfortaa Light" w:hAnsi="Comfortaa Light"/>
-          <w:color w:val="000000" w:themeColor="text1"/>
-          <w:sz w:val="20"/>
-          <w:szCs w:val="20"/>
-          <w:lang w:val="es-MX" w:eastAsia="es-MX"/>
-        </w:rPr>
-        <w:t>{{comprador_email}}</w:t>
-      </w:r>
-    </w:p>
-    <w:p>
-      <w:pPr>
-        <w:pStyle w:val="NoSpacing"/>
-        <w:rPr/>
+        <w:rPr>
+          <w:lang w:val="es-CO"/>
+        </w:rPr>
       </w:pPr>
       <w:r>
         <w:rPr>
@@ -451,7 +429,9 @@
     <w:p>
       <w:pPr>
         <w:pStyle w:val="NoSpacing"/>
-        <w:rPr/>
+        <w:rPr>
+          <w:lang w:val="es-CO"/>
+        </w:rPr>
       </w:pPr>
       <w:r>
         <w:rPr>
@@ -460,8 +440,16 @@
           <w:szCs w:val="20"/>
           <w:lang w:val="es-MX" w:eastAsia="es-MX"/>
         </w:rPr>
-        <w:t xml:space="preserve">Nombre: </w:t>
-      </w:r>
+        <w:t>Nombre: {{beneficiario_nombre}}</w:t>
+      </w:r>
+    </w:p>
+    <w:p>
+      <w:pPr>
+        <w:pStyle w:val="NoSpacing"/>
+        <w:rPr>
+          <w:lang w:val="es-CO"/>
+        </w:rPr>
+      </w:pPr>
       <w:r>
         <w:rPr>
           <w:rFonts w:ascii="Comfortaa Light" w:hAnsi="Comfortaa Light"/>
@@ -469,13 +457,15 @@
           <w:szCs w:val="20"/>
           <w:lang w:val="es-MX" w:eastAsia="es-MX"/>
         </w:rPr>
-        <w:t>{{beneficiario_nombre}}</w:t>
+        <w:t>Documento de identidad: {{beneficiario_id}}</w:t>
       </w:r>
     </w:p>
     <w:p>
       <w:pPr>
         <w:pStyle w:val="NoSpacing"/>
-        <w:rPr/>
+        <w:rPr>
+          <w:lang w:val="es-CO"/>
+        </w:rPr>
       </w:pPr>
       <w:r>
         <w:rPr>
@@ -484,8 +474,27 @@
           <w:szCs w:val="20"/>
           <w:lang w:val="es-MX" w:eastAsia="es-MX"/>
         </w:rPr>
-        <w:t xml:space="preserve">Documento de identidad: </w:t>
-      </w:r>
+        <w:t xml:space="preserve">Correo electrónico y Usuario: </w:t>
+      </w:r>
+      <w:r>
+        <w:rPr>
+          <w:rStyle w:val="EnlacedeInternet"/>
+          <w:rFonts w:eastAsia="Times New Roman" w:cs="Arial" w:ascii="Comfortaa Light" w:hAnsi="Comfortaa Light"/>
+          <w:color w:val="000000" w:themeColor="text1"/>
+          <w:sz w:val="20"/>
+          <w:szCs w:val="20"/>
+          <w:lang w:val="es-MX" w:eastAsia="es-MX"/>
+        </w:rPr>
+        <w:t>{{beneficiario_email}}</w:t>
+      </w:r>
+    </w:p>
+    <w:p>
+      <w:pPr>
+        <w:pStyle w:val="NoSpacing"/>
+        <w:rPr>
+          <w:lang w:val="es-CO"/>
+        </w:rPr>
+      </w:pPr>
       <w:r>
         <w:rPr>
           <w:rFonts w:ascii="Comfortaa Light" w:hAnsi="Comfortaa Light"/>
@@ -493,57 +502,7 @@
           <w:szCs w:val="20"/>
           <w:lang w:val="es-MX" w:eastAsia="es-MX"/>
         </w:rPr>
-        <w:t>{{beneficiario_id}}</w:t>
-      </w:r>
-    </w:p>
-    <w:p>
-      <w:pPr>
-        <w:pStyle w:val="NoSpacing"/>
-        <w:rPr/>
-      </w:pPr>
-      <w:r>
-        <w:rPr>
-          <w:rFonts w:ascii="Comfortaa Light" w:hAnsi="Comfortaa Light"/>
-          <w:sz w:val="20"/>
-          <w:szCs w:val="20"/>
-          <w:lang w:val="es-MX" w:eastAsia="es-MX"/>
-        </w:rPr>
-        <w:t xml:space="preserve">Correo electrónico y Usuario: </w:t>
-      </w:r>
-      <w:r>
-        <w:rPr>
-          <w:rStyle w:val="EnlacedeInternet"/>
-          <w:rFonts w:eastAsia="Times New Roman" w:cs="Arial" w:ascii="Comfortaa Light" w:hAnsi="Comfortaa Light"/>
-          <w:color w:val="000000" w:themeColor="text1"/>
-          <w:sz w:val="20"/>
-          <w:szCs w:val="20"/>
-          <w:lang w:val="es-MX" w:eastAsia="es-MX"/>
-        </w:rPr>
-        <w:t>{{beneficiario_email}}</w:t>
-      </w:r>
-    </w:p>
-    <w:p>
-      <w:pPr>
-        <w:pStyle w:val="NoSpacing"/>
-        <w:rPr/>
-      </w:pPr>
-      <w:r>
-        <w:rPr>
-          <w:rFonts w:ascii="Comfortaa Light" w:hAnsi="Comfortaa Light"/>
-          <w:sz w:val="20"/>
-          <w:szCs w:val="20"/>
-          <w:lang w:val="es-MX" w:eastAsia="es-MX"/>
-        </w:rPr>
-        <w:t xml:space="preserve">Número de teléfono: </w:t>
-      </w:r>
-      <w:r>
-        <w:rPr>
-          <w:rFonts w:ascii="Comfortaa Light" w:hAnsi="Comfortaa Light"/>
-          <w:sz w:val="20"/>
-          <w:szCs w:val="20"/>
-          <w:lang w:val="es-MX" w:eastAsia="es-MX"/>
-        </w:rPr>
-        <w:t>{{beneficiario_telefono}}</w:t>
+        <w:t>Número de teléfono: {{beneficiario_telefono}}</w:t>
       </w:r>
     </w:p>
     <w:p>
@@ -610,12 +569,11 @@
           <w:docPartGallery w:val="Table of Contents"/>
           <w:docPartUnique w:val="true"/>
         </w:docPartObj>
-        <w:id w:val="904851175"/>
       </w:sdtPr>
       <w:sdtContent>
         <w:p>
           <w:pPr>
-            <w:pStyle w:val="TOCHeading"/>
+            <w:pStyle w:val="Ttulodelsumario"/>
             <w:rPr/>
           </w:pPr>
           <w:r>
@@ -627,6 +585,7 @@
           <w:pPr>
             <w:pStyle w:val="Sumario1"/>
             <w:tabs>
+              <w:tab w:val="clear" w:pos="720"/>
               <w:tab w:val="right" w:pos="9350" w:leader="dot"/>
             </w:tabs>
             <w:rPr>
@@ -643,8 +602,9 @@
               <w:rStyle w:val="Enlacedelndice"/>
               <w:spacing w:val="5"/>
               <w:iCs/>
+              <w:vanish w:val="false"/>
             </w:rPr>
-            <w:instrText> TOC \z \o "1-3" \u \h</w:instrText>
+            <w:instrText xml:space="preserve"> TOC \z \o "1-3" \u \h</w:instrText>
           </w:r>
           <w:r>
             <w:rPr>
@@ -652,6 +612,7 @@
               <w:rStyle w:val="Enlacedelndice"/>
               <w:spacing w:val="5"/>
               <w:iCs/>
+              <w:vanish w:val="false"/>
             </w:rPr>
             <w:fldChar w:fldCharType="separate"/>
           </w:r>
@@ -661,10 +622,13 @@
                 <w:webHidden/>
                 <w:rStyle w:val="Enlacedelndice"/>
                 <w:iCs/>
+                <w:vanish w:val="false"/>
                 <w:spacing w:val="5"/>
               </w:rPr>
-              <w:t>Introducción</w:t>
-            </w:r>
+              <w:t>I</w:t>
+            </w:r>
+          </w:hyperlink>
+          <w:hyperlink w:anchor="_Toc74153367">
             <w:r>
               <w:rPr>
                 <w:webHidden/>
@@ -675,7 +639,7 @@
               <w:rPr>
                 <w:webHidden/>
               </w:rPr>
-              <w:instrText>PAGEREF _Toc74153367 \h</w:instrText>
+              <w:instrText xml:space="preserve">PAGEREF _Toc74153367 \h</w:instrText>
             </w:r>
             <w:r>
               <w:rPr>
@@ -685,11 +649,13 @@
             </w:r>
             <w:r>
               <w:rPr>
+                <w:webHidden/>
                 <w:rStyle w:val="Enlacedelndice"/>
+                <w:iCs/>
                 <w:vanish w:val="false"/>
-              </w:rPr>
-              <w:tab/>
-              <w:t>2</w:t>
+                <w:spacing w:val="5"/>
+              </w:rPr>
+              <w:t>ntroducción</w:t>
             </w:r>
             <w:r>
               <w:rPr>
@@ -698,11 +664,20 @@
               <w:fldChar w:fldCharType="end"/>
             </w:r>
           </w:hyperlink>
+          <w:r>
+            <w:rPr>
+              <w:rStyle w:val="Enlacedelndice"/>
+              <w:vanish w:val="false"/>
+            </w:rPr>
+            <w:tab/>
+            <w:t>2</w:t>
+          </w:r>
         </w:p>
         <w:p>
           <w:pPr>
             <w:pStyle w:val="Sumario1"/>
             <w:tabs>
+              <w:tab w:val="clear" w:pos="720"/>
               <w:tab w:val="right" w:pos="9350" w:leader="dot"/>
             </w:tabs>
             <w:rPr>
@@ -714,13 +689,6 @@
             <w:r>
               <w:rPr>
                 <w:webHidden/>
-                <w:rStyle w:val="Enlacedelndice"/>
-              </w:rPr>
-              <w:t>Capítulo 1: Vocabulario:</w:t>
-            </w:r>
-            <w:r>
-              <w:rPr>
-                <w:webHidden/>
               </w:rPr>
               <w:fldChar w:fldCharType="begin"/>
             </w:r>
@@ -728,7 +696,7 @@
               <w:rPr>
                 <w:webHidden/>
               </w:rPr>
-              <w:instrText>PAGEREF _Toc74153368 \h</w:instrText>
+              <w:instrText xml:space="preserve">PAGEREF _Toc74153368 \h</w:instrText>
             </w:r>
             <w:r>
               <w:rPr>
@@ -738,9 +706,11 @@
             </w:r>
             <w:r>
               <w:rPr>
+                <w:webHidden/>
                 <w:rStyle w:val="Enlacedelndice"/>
                 <w:vanish w:val="false"/>
               </w:rPr>
+              <w:t>Capítulo 1: Vocabulario:</w:t>
               <w:tab/>
               <w:t>2</w:t>
             </w:r>
@@ -756,6 +726,7 @@
           <w:pPr>
             <w:pStyle w:val="Sumario1"/>
             <w:tabs>
+              <w:tab w:val="clear" w:pos="720"/>
               <w:tab w:val="right" w:pos="9350" w:leader="dot"/>
             </w:tabs>
             <w:rPr>
@@ -767,13 +738,6 @@
             <w:r>
               <w:rPr>
                 <w:webHidden/>
-                <w:rStyle w:val="Enlacedelndice"/>
-              </w:rPr>
-              <w:t>Capítulo 2: Comisión por parte de Treeconomy:</w:t>
-            </w:r>
-            <w:r>
-              <w:rPr>
-                <w:webHidden/>
               </w:rPr>
               <w:fldChar w:fldCharType="begin"/>
             </w:r>
@@ -781,7 +745,7 @@
               <w:rPr>
                 <w:webHidden/>
               </w:rPr>
-              <w:instrText>PAGEREF _Toc74153369 \h</w:instrText>
+              <w:instrText xml:space="preserve">PAGEREF _Toc74153369 \h</w:instrText>
             </w:r>
             <w:r>
               <w:rPr>
@@ -791,9 +755,11 @@
             </w:r>
             <w:r>
               <w:rPr>
+                <w:webHidden/>
                 <w:rStyle w:val="Enlacedelndice"/>
                 <w:vanish w:val="false"/>
               </w:rPr>
+              <w:t>Capítulo 2: Comisión por parte de Treeconomy:</w:t>
               <w:tab/>
               <w:t>4</w:t>
             </w:r>
@@ -809,6 +775,7 @@
           <w:pPr>
             <w:pStyle w:val="Sumario1"/>
             <w:tabs>
+              <w:tab w:val="clear" w:pos="720"/>
               <w:tab w:val="right" w:pos="9350" w:leader="dot"/>
             </w:tabs>
             <w:rPr>
@@ -820,33 +787,30 @@
             <w:r>
               <w:rPr>
                 <w:webHidden/>
+              </w:rPr>
+              <w:fldChar w:fldCharType="begin"/>
+            </w:r>
+            <w:r>
+              <w:rPr>
+                <w:webHidden/>
+              </w:rPr>
+              <w:instrText xml:space="preserve">PAGEREF _Toc74153370 \h</w:instrText>
+            </w:r>
+            <w:r>
+              <w:rPr>
+                <w:webHidden/>
+              </w:rPr>
+              <w:fldChar w:fldCharType="separate"/>
+            </w:r>
+            <w:r>
+              <w:rPr>
+                <w:webHidden/>
                 <w:rStyle w:val="Enlacedelndice"/>
+                <w:iCs/>
+                <w:vanish w:val="false"/>
+                <w:spacing w:val="5"/>
               </w:rPr>
               <w:t>Capítulo 3: Crear una cuenta de comprador</w:t>
-            </w:r>
-            <w:r>
-              <w:rPr>
-                <w:webHidden/>
-              </w:rPr>
-              <w:fldChar w:fldCharType="begin"/>
-            </w:r>
-            <w:r>
-              <w:rPr>
-                <w:webHidden/>
-              </w:rPr>
-              <w:instrText>PAGEREF _Toc74153370 \h</w:instrText>
-            </w:r>
-            <w:r>
-              <w:rPr>
-                <w:webHidden/>
-              </w:rPr>
-              <w:fldChar w:fldCharType="separate"/>
-            </w:r>
-            <w:r>
-              <w:rPr>
-                <w:rStyle w:val="Enlacedelndice"/>
-                <w:vanish w:val="false"/>
-              </w:rPr>
               <w:tab/>
               <w:t>4</w:t>
             </w:r>
@@ -862,6 +826,7 @@
           <w:pPr>
             <w:pStyle w:val="Sumario1"/>
             <w:tabs>
+              <w:tab w:val="clear" w:pos="720"/>
               <w:tab w:val="right" w:pos="9350" w:leader="dot"/>
             </w:tabs>
             <w:rPr>
@@ -875,9 +840,10 @@
                 <w:webHidden/>
                 <w:rStyle w:val="Enlacedelndice"/>
                 <w:iCs/>
+                <w:vanish w:val="false"/>
                 <w:spacing w:val="5"/>
               </w:rPr>
-              <w:t>Capítulo 4: La Compra de Arboles</w:t>
+              <w:t>Capítulo 4: La Compra de Arboles……………………………………………………………..</w:t>
             </w:r>
             <w:r>
               <w:rPr>
@@ -889,7 +855,7 @@
               <w:rPr>
                 <w:webHidden/>
               </w:rPr>
-              <w:instrText>PAGEREF _Toc74153371 \h</w:instrText>
+              <w:instrText xml:space="preserve">PAGEREF _Toc74153371 \h</w:instrText>
             </w:r>
             <w:r>
               <w:rPr>
@@ -902,7 +868,6 @@
                 <w:rStyle w:val="Enlacedelndice"/>
                 <w:vanish w:val="false"/>
               </w:rPr>
-              <w:tab/>
               <w:t>5</w:t>
             </w:r>
             <w:r>
@@ -917,6 +882,7 @@
           <w:pPr>
             <w:pStyle w:val="Sumario1"/>
             <w:tabs>
+              <w:tab w:val="clear" w:pos="720"/>
               <w:tab w:val="right" w:pos="9350" w:leader="dot"/>
             </w:tabs>
             <w:rPr>
@@ -930,9 +896,10 @@
                 <w:webHidden/>
                 <w:rStyle w:val="Enlacedelndice"/>
                 <w:rFonts w:eastAsia="Times New Roman"/>
+                <w:vanish w:val="false"/>
                 <w:lang w:eastAsia="es-MX"/>
               </w:rPr>
-              <w:t>Capítulo 5: Seguros</w:t>
+              <w:t>Capítulo 5: Seguros…………………………………………………………………………………...</w:t>
             </w:r>
             <w:r>
               <w:rPr>
@@ -944,7 +911,7 @@
               <w:rPr>
                 <w:webHidden/>
               </w:rPr>
-              <w:instrText>PAGEREF _Toc74153372 \h</w:instrText>
+              <w:instrText xml:space="preserve">PAGEREF _Toc74153372 \h</w:instrText>
             </w:r>
             <w:r>
               <w:rPr>
@@ -957,8 +924,7 @@
                 <w:rStyle w:val="Enlacedelndice"/>
                 <w:vanish w:val="false"/>
               </w:rPr>
-              <w:tab/>
-              <w:t>6</w:t>
+              <w:t>5</w:t>
             </w:r>
             <w:r>
               <w:rPr>
@@ -972,6 +938,7 @@
           <w:pPr>
             <w:pStyle w:val="Sumario1"/>
             <w:tabs>
+              <w:tab w:val="clear" w:pos="720"/>
               <w:tab w:val="right" w:pos="9350" w:leader="dot"/>
             </w:tabs>
             <w:rPr>
@@ -985,6 +952,7 @@
                 <w:webHidden/>
                 <w:rStyle w:val="Enlacedelndice"/>
                 <w:iCs/>
+                <w:vanish w:val="false"/>
                 <w:spacing w:val="5"/>
               </w:rPr>
               <w:t>Capítulo</w:t>
@@ -1005,7 +973,7 @@
                 <w:iCs/>
                 <w:spacing w:val="5"/>
               </w:rPr>
-              <w:t>6: Designar un tercero de confianza</w:t>
+              <w:t>6: Designar un tercero de confianza……………………………………………...</w:t>
             </w:r>
             <w:r>
               <w:rPr>
@@ -1017,7 +985,7 @@
               <w:rPr>
                 <w:webHidden/>
               </w:rPr>
-              <w:instrText>PAGEREF _Toc74153373 \h</w:instrText>
+              <w:instrText xml:space="preserve">PAGEREF _Toc74153373 \h</w:instrText>
             </w:r>
             <w:r>
               <w:rPr>
@@ -1030,8 +998,7 @@
                 <w:rStyle w:val="Enlacedelndice"/>
                 <w:vanish w:val="false"/>
               </w:rPr>
-              <w:tab/>
-              <w:t>6</w:t>
+              <w:t>5</w:t>
             </w:r>
             <w:r>
               <w:rPr>
@@ -1045,6 +1012,7 @@
           <w:pPr>
             <w:pStyle w:val="Sumario1"/>
             <w:tabs>
+              <w:tab w:val="clear" w:pos="720"/>
               <w:tab w:val="right" w:pos="9350" w:leader="dot"/>
             </w:tabs>
             <w:rPr>
@@ -1058,9 +1026,10 @@
                 <w:webHidden/>
                 <w:rStyle w:val="Enlacedelndice"/>
                 <w:iCs/>
+                <w:vanish w:val="false"/>
                 <w:spacing w:val="5"/>
               </w:rPr>
-              <w:t>Capítulo 7: Proceso de Compra</w:t>
+              <w:t>Capítulo 7: Proceso de Compra…………………………………………………………………</w:t>
             </w:r>
             <w:r>
               <w:rPr>
@@ -1072,7 +1041,7 @@
               <w:rPr>
                 <w:webHidden/>
               </w:rPr>
-              <w:instrText>PAGEREF _Toc74153374 \h</w:instrText>
+              <w:instrText xml:space="preserve">PAGEREF _Toc74153374 \h</w:instrText>
             </w:r>
             <w:r>
               <w:rPr>
@@ -1085,7 +1054,6 @@
                 <w:rStyle w:val="Enlacedelndice"/>
                 <w:vanish w:val="false"/>
               </w:rPr>
-              <w:tab/>
               <w:t>6</w:t>
             </w:r>
             <w:r>
@@ -1100,6 +1068,7 @@
           <w:pPr>
             <w:pStyle w:val="Sumario1"/>
             <w:tabs>
+              <w:tab w:val="clear" w:pos="720"/>
               <w:tab w:val="right" w:pos="9350" w:leader="dot"/>
             </w:tabs>
             <w:rPr>
@@ -1113,9 +1082,10 @@
                 <w:webHidden/>
                 <w:rStyle w:val="Enlacedelndice"/>
                 <w:iCs/>
+                <w:vanish w:val="false"/>
                 <w:spacing w:val="5"/>
               </w:rPr>
-              <w:t>Capítulo 8: envío y entrega</w:t>
+              <w:t>Capítulo 8: envío y entrega……………………………………………………………………...</w:t>
             </w:r>
             <w:r>
               <w:rPr>
@@ -1127,7 +1097,7 @@
               <w:rPr>
                 <w:webHidden/>
               </w:rPr>
-              <w:instrText>PAGEREF _Toc74153375 \h</w:instrText>
+              <w:instrText xml:space="preserve">PAGEREF _Toc74153375 \h</w:instrText>
             </w:r>
             <w:r>
               <w:rPr>
@@ -1140,7 +1110,74 @@
                 <w:rStyle w:val="Enlacedelndice"/>
                 <w:vanish w:val="false"/>
               </w:rPr>
-              <w:tab/>
+              <w:t>7</w:t>
+            </w:r>
+            <w:r>
+              <w:rPr>
+                <w:webHidden/>
+              </w:rPr>
+              <w:fldChar w:fldCharType="end"/>
+            </w:r>
+          </w:hyperlink>
+        </w:p>
+        <w:p>
+          <w:pPr>
+            <w:sectPr>
+              <w:headerReference w:type="even" r:id="rId4"/>
+              <w:headerReference w:type="default" r:id="rId5"/>
+              <w:headerReference w:type="first" r:id="rId6"/>
+              <w:footerReference w:type="even" r:id="rId7"/>
+              <w:footerReference w:type="default" r:id="rId8"/>
+              <w:footerReference w:type="first" r:id="rId9"/>
+              <w:type w:val="nextPage"/>
+              <w:pgSz w:w="12240" w:h="15840"/>
+              <w:pgMar w:left="1440" w:right="1440" w:gutter="0" w:header="720" w:top="1440" w:footer="720" w:bottom="1440"/>
+              <w:pgNumType w:fmt="decimal"/>
+              <w:formProt w:val="false"/>
+              <w:textDirection w:val="lrTb"/>
+              <w:docGrid w:type="default" w:linePitch="360" w:charSpace="8192"/>
+            </w:sectPr>
+            <w:pStyle w:val="Sumario1"/>
+            <w:tabs>
+              <w:tab w:val="clear" w:pos="720"/>
+              <w:tab w:val="right" w:pos="9350" w:leader="dot"/>
+            </w:tabs>
+            <w:rPr/>
+          </w:pPr>
+          <w:hyperlink w:anchor="_Toc74153376">
+            <w:r>
+              <w:rPr>
+                <w:webHidden/>
+                <w:rStyle w:val="Enlacedelndice"/>
+                <w:iCs/>
+                <w:vanish w:val="false"/>
+                <w:spacing w:val="5"/>
+              </w:rPr>
+              <w:t>Capítulo 9: Prueba………………………………………………………………………………….</w:t>
+            </w:r>
+            <w:r>
+              <w:rPr>
+                <w:webHidden/>
+              </w:rPr>
+              <w:fldChar w:fldCharType="begin"/>
+            </w:r>
+            <w:r>
+              <w:rPr>
+                <w:webHidden/>
+              </w:rPr>
+              <w:instrText xml:space="preserve">PAGEREF _Toc74153376 \h</w:instrText>
+            </w:r>
+            <w:r>
+              <w:rPr>
+                <w:webHidden/>
+              </w:rPr>
+              <w:fldChar w:fldCharType="separate"/>
+            </w:r>
+            <w:r>
+              <w:rPr>
+                <w:rStyle w:val="Enlacedelndice"/>
+                <w:vanish w:val="false"/>
+              </w:rPr>
               <w:t>7</w:t>
             </w:r>
             <w:r>
@@ -1155,61 +1192,7 @@
           <w:pPr>
             <w:pStyle w:val="Sumario1"/>
             <w:tabs>
-              <w:tab w:val="right" w:pos="9350" w:leader="dot"/>
-            </w:tabs>
-            <w:rPr>
-              <w:rFonts w:eastAsia="" w:eastAsiaTheme="minorEastAsia"/>
-              <w:lang w:val="es-MX" w:eastAsia="es-MX"/>
-            </w:rPr>
-          </w:pPr>
-          <w:hyperlink w:anchor="_Toc74153376">
-            <w:r>
-              <w:rPr>
-                <w:webHidden/>
-                <w:rStyle w:val="Enlacedelndice"/>
-                <w:iCs/>
-                <w:spacing w:val="5"/>
-              </w:rPr>
-              <w:t>Capítulo 9: Prueba</w:t>
-            </w:r>
-            <w:r>
-              <w:rPr>
-                <w:webHidden/>
-              </w:rPr>
-              <w:fldChar w:fldCharType="begin"/>
-            </w:r>
-            <w:r>
-              <w:rPr>
-                <w:webHidden/>
-              </w:rPr>
-              <w:instrText>PAGEREF _Toc74153376 \h</w:instrText>
-            </w:r>
-            <w:r>
-              <w:rPr>
-                <w:webHidden/>
-              </w:rPr>
-              <w:fldChar w:fldCharType="separate"/>
-            </w:r>
-            <w:r>
-              <w:rPr>
-                <w:rStyle w:val="Enlacedelndice"/>
-                <w:vanish w:val="false"/>
-              </w:rPr>
-              <w:tab/>
-              <w:t>8</w:t>
-            </w:r>
-            <w:r>
-              <w:rPr>
-                <w:webHidden/>
-              </w:rPr>
-              <w:fldChar w:fldCharType="end"/>
-            </w:r>
-          </w:hyperlink>
-        </w:p>
-        <w:p>
-          <w:pPr>
-            <w:pStyle w:val="Sumario1"/>
-            <w:tabs>
+              <w:tab w:val="clear" w:pos="720"/>
               <w:tab w:val="right" w:pos="9350" w:leader="dot"/>
             </w:tabs>
             <w:rPr>
@@ -1223,9 +1206,10 @@
                 <w:webHidden/>
                 <w:rStyle w:val="Enlacedelndice"/>
                 <w:iCs/>
+                <w:vanish w:val="false"/>
                 <w:spacing w:val="5"/>
               </w:rPr>
-              <w:t>Capítulo 10: derecho de desistimiento</w:t>
+              <w:t>Capítulo 10: derecho de desistimiento……………………………………………………….</w:t>
             </w:r>
             <w:r>
               <w:rPr>
@@ -1237,7 +1221,7 @@
               <w:rPr>
                 <w:webHidden/>
               </w:rPr>
-              <w:instrText>PAGEREF _Toc74153377 \h</w:instrText>
+              <w:instrText xml:space="preserve">PAGEREF _Toc74153377 \h</w:instrText>
             </w:r>
             <w:r>
               <w:rPr>
@@ -1250,7 +1234,6 @@
                 <w:rStyle w:val="Enlacedelndice"/>
                 <w:vanish w:val="false"/>
               </w:rPr>
-              <w:tab/>
               <w:t>8</w:t>
             </w:r>
             <w:r>
@@ -1265,6 +1248,7 @@
           <w:pPr>
             <w:pStyle w:val="Sumario1"/>
             <w:tabs>
+              <w:tab w:val="clear" w:pos="720"/>
               <w:tab w:val="right" w:pos="9350" w:leader="dot"/>
             </w:tabs>
             <w:rPr>
@@ -1278,9 +1262,10 @@
                 <w:webHidden/>
                 <w:rStyle w:val="Enlacedelndice"/>
                 <w:iCs/>
+                <w:vanish w:val="false"/>
                 <w:spacing w:val="5"/>
               </w:rPr>
-              <w:t>Capítulo 11: El uso del servicio de comentarios en línea.</w:t>
+              <w:t>Capítulo 11: El uso del servicio de comentarios en línea……………………………….</w:t>
             </w:r>
             <w:r>
               <w:rPr>
@@ -1292,7 +1277,7 @@
               <w:rPr>
                 <w:webHidden/>
               </w:rPr>
-              <w:instrText>PAGEREF _Toc74153378 \h</w:instrText>
+              <w:instrText xml:space="preserve">PAGEREF _Toc74153378 \h</w:instrText>
             </w:r>
             <w:r>
               <w:rPr>
@@ -1305,8 +1290,7 @@
                 <w:rStyle w:val="Enlacedelndice"/>
                 <w:vanish w:val="false"/>
               </w:rPr>
-              <w:tab/>
-              <w:t>9</w:t>
+              <w:t>8</w:t>
             </w:r>
             <w:r>
               <w:rPr>
@@ -1320,6 +1304,7 @@
           <w:pPr>
             <w:pStyle w:val="Sumario1"/>
             <w:tabs>
+              <w:tab w:val="clear" w:pos="720"/>
               <w:tab w:val="right" w:pos="9350" w:leader="dot"/>
             </w:tabs>
             <w:rPr>
@@ -1333,9 +1318,10 @@
                 <w:webHidden/>
                 <w:rStyle w:val="Enlacedelndice"/>
                 <w:iCs/>
+                <w:vanish w:val="false"/>
                 <w:spacing w:val="5"/>
               </w:rPr>
-              <w:t>Capítulo 12: nuestras ofertas</w:t>
+              <w:t>Capítulo 12: nuestras ofertas…………………………………………………………………...</w:t>
             </w:r>
             <w:r>
               <w:rPr>
@@ -1347,7 +1333,7 @@
               <w:rPr>
                 <w:webHidden/>
               </w:rPr>
-              <w:instrText>PAGEREF _Toc74153379 \h</w:instrText>
+              <w:instrText xml:space="preserve">PAGEREF _Toc74153379 \h</w:instrText>
             </w:r>
             <w:r>
               <w:rPr>
@@ -1360,8 +1346,7 @@
                 <w:rStyle w:val="Enlacedelndice"/>
                 <w:vanish w:val="false"/>
               </w:rPr>
-              <w:tab/>
-              <w:t>10</w:t>
+              <w:t>9</w:t>
             </w:r>
             <w:r>
               <w:rPr>
@@ -1375,6 +1360,7 @@
           <w:pPr>
             <w:pStyle w:val="Sumario1"/>
             <w:tabs>
+              <w:tab w:val="clear" w:pos="720"/>
               <w:tab w:val="right" w:pos="9350" w:leader="dot"/>
             </w:tabs>
             <w:rPr>
@@ -1388,9 +1374,10 @@
                 <w:webHidden/>
                 <w:rStyle w:val="Enlacedelndice"/>
                 <w:iCs/>
+                <w:vanish w:val="false"/>
                 <w:spacing w:val="5"/>
               </w:rPr>
-              <w:t>Capítulo 13: La naturaleza legal de la relación contractual entre Treeconomy y sus clientes.</w:t>
+              <w:t>Capítulo 13: La naturaleza legal de la relación contractual entre Treeconomy y sus clientes………………………………………………………………………………………….</w:t>
             </w:r>
             <w:r>
               <w:rPr>
@@ -1402,7 +1389,7 @@
               <w:rPr>
                 <w:webHidden/>
               </w:rPr>
-              <w:instrText>PAGEREF _Toc74153380 \h</w:instrText>
+              <w:instrText xml:space="preserve">PAGEREF _Toc74153380 \h</w:instrText>
             </w:r>
             <w:r>
               <w:rPr>
@@ -1415,8 +1402,7 @@
                 <w:rStyle w:val="Enlacedelndice"/>
                 <w:vanish w:val="false"/>
               </w:rPr>
-              <w:tab/>
-              <w:t>12</w:t>
+              <w:t>11</w:t>
             </w:r>
             <w:r>
               <w:rPr>
@@ -1430,6 +1416,7 @@
           <w:pPr>
             <w:pStyle w:val="Sumario1"/>
             <w:tabs>
+              <w:tab w:val="clear" w:pos="720"/>
               <w:tab w:val="right" w:pos="9350" w:leader="dot"/>
             </w:tabs>
             <w:rPr>
@@ -1441,13 +1428,6 @@
             <w:r>
               <w:rPr>
                 <w:webHidden/>
-                <w:rStyle w:val="Enlacedelndice"/>
-              </w:rPr>
-              <w:t>Capítulo 14: Transferencia anticipada de árboles por parte del Comprador</w:t>
-            </w:r>
-            <w:r>
-              <w:rPr>
-                <w:webHidden/>
               </w:rPr>
               <w:fldChar w:fldCharType="begin"/>
             </w:r>
@@ -1455,7 +1435,7 @@
               <w:rPr>
                 <w:webHidden/>
               </w:rPr>
-              <w:instrText>PAGEREF _Toc74153381 \h</w:instrText>
+              <w:instrText xml:space="preserve">PAGEREF _Toc74153381 \h</w:instrText>
             </w:r>
             <w:r>
               <w:rPr>
@@ -1465,9 +1445,11 @@
             </w:r>
             <w:r>
               <w:rPr>
+                <w:webHidden/>
                 <w:rStyle w:val="Enlacedelndice"/>
                 <w:vanish w:val="false"/>
               </w:rPr>
+              <w:t>Capítulo 14: Transferencia anticipada de árboles por parte del Comprador</w:t>
               <w:tab/>
               <w:t>14</w:t>
             </w:r>
@@ -1483,6 +1465,7 @@
           <w:pPr>
             <w:pStyle w:val="Sumario1"/>
             <w:tabs>
+              <w:tab w:val="clear" w:pos="720"/>
               <w:tab w:val="right" w:pos="9350" w:leader="dot"/>
             </w:tabs>
             <w:rPr>
@@ -1496,9 +1479,10 @@
                 <w:webHidden/>
                 <w:rStyle w:val="Enlacedelndice"/>
                 <w:rFonts w:eastAsia="Times New Roman"/>
+                <w:vanish w:val="false"/>
                 <w:lang w:eastAsia="es-MX"/>
               </w:rPr>
-              <w:t>Capítulo 15: Pago</w:t>
+              <w:t>Capítulo 15: Pago…………………………………………………………………………………….</w:t>
             </w:r>
             <w:r>
               <w:rPr>
@@ -1510,7 +1494,7 @@
               <w:rPr>
                 <w:webHidden/>
               </w:rPr>
-              <w:instrText>PAGEREF _Toc74153382 \h</w:instrText>
+              <w:instrText xml:space="preserve">PAGEREF _Toc74153382 \h</w:instrText>
             </w:r>
             <w:r>
               <w:rPr>
@@ -1523,8 +1507,7 @@
                 <w:rStyle w:val="Enlacedelndice"/>
                 <w:vanish w:val="false"/>
               </w:rPr>
-              <w:tab/>
-              <w:t>15</w:t>
+              <w:t>14</w:t>
             </w:r>
             <w:r>
               <w:rPr>
@@ -1538,6 +1521,7 @@
           <w:pPr>
             <w:pStyle w:val="Sumario1"/>
             <w:tabs>
+              <w:tab w:val="clear" w:pos="720"/>
               <w:tab w:val="right" w:pos="9350" w:leader="dot"/>
             </w:tabs>
             <w:rPr>
@@ -1551,9 +1535,10 @@
                 <w:webHidden/>
                 <w:rStyle w:val="Enlacedelndice"/>
                 <w:rFonts w:eastAsia="Times New Roman"/>
+                <w:vanish w:val="false"/>
                 <w:lang w:eastAsia="es-MX"/>
               </w:rPr>
-              <w:t>Capítulo 16: propiedad intelectual</w:t>
+              <w:t>Capítulo 16: propiedad intelectual………………………………………………………………</w:t>
             </w:r>
             <w:r>
               <w:rPr>
@@ -1565,7 +1550,7 @@
               <w:rPr>
                 <w:webHidden/>
               </w:rPr>
-              <w:instrText>PAGEREF _Toc74153383 \h</w:instrText>
+              <w:instrText xml:space="preserve">PAGEREF _Toc74153383 \h</w:instrText>
             </w:r>
             <w:r>
               <w:rPr>
@@ -1578,8 +1563,7 @@
                 <w:rStyle w:val="Enlacedelndice"/>
                 <w:vanish w:val="false"/>
               </w:rPr>
-              <w:tab/>
-              <w:t>16</w:t>
+              <w:t>14</w:t>
             </w:r>
             <w:r>
               <w:rPr>
@@ -1593,6 +1577,7 @@
           <w:pPr>
             <w:pStyle w:val="Sumario1"/>
             <w:tabs>
+              <w:tab w:val="clear" w:pos="720"/>
               <w:tab w:val="right" w:pos="9350" w:leader="dot"/>
             </w:tabs>
             <w:rPr>
@@ -1606,9 +1591,10 @@
                 <w:webHidden/>
                 <w:rStyle w:val="Enlacedelndice"/>
                 <w:rFonts w:eastAsia="Times New Roman"/>
+                <w:vanish w:val="false"/>
                 <w:lang w:eastAsia="es-MX"/>
               </w:rPr>
-              <w:t>Capítulo 17: Uso del sitio web de la empresa Treeconomy</w:t>
+              <w:t>Capítulo 17: Uso del sitio web de la empresa Treeconomy……………………………….</w:t>
             </w:r>
             <w:r>
               <w:rPr>
@@ -1620,7 +1606,7 @@
               <w:rPr>
                 <w:webHidden/>
               </w:rPr>
-              <w:instrText>PAGEREF _Toc74153384 \h</w:instrText>
+              <w:instrText xml:space="preserve">PAGEREF _Toc74153384 \h</w:instrText>
             </w:r>
             <w:r>
               <w:rPr>
@@ -1633,8 +1619,7 @@
                 <w:rStyle w:val="Enlacedelndice"/>
                 <w:vanish w:val="false"/>
               </w:rPr>
-              <w:tab/>
-              <w:t>17</w:t>
+              <w:t>15</w:t>
             </w:r>
             <w:r>
               <w:rPr>
@@ -1648,6 +1633,7 @@
           <w:pPr>
             <w:pStyle w:val="Sumario1"/>
             <w:tabs>
+              <w:tab w:val="clear" w:pos="720"/>
               <w:tab w:val="right" w:pos="9350" w:leader="dot"/>
             </w:tabs>
             <w:rPr>
@@ -1661,9 +1647,10 @@
                 <w:webHidden/>
                 <w:rStyle w:val="Enlacedelndice"/>
                 <w:rFonts w:eastAsia="Times New Roman"/>
+                <w:vanish w:val="false"/>
                 <w:lang w:eastAsia="es-MX"/>
               </w:rPr>
-              <w:t>Capítulo 18: Protección de datos personales.</w:t>
+              <w:t>Capítulo 18: Protección de datos personales…………………………………………………</w:t>
             </w:r>
             <w:r>
               <w:rPr>
@@ -1675,7 +1662,7 @@
               <w:rPr>
                 <w:webHidden/>
               </w:rPr>
-              <w:instrText>PAGEREF _Toc74153385 \h</w:instrText>
+              <w:instrText xml:space="preserve">PAGEREF _Toc74153385 \h</w:instrText>
             </w:r>
             <w:r>
               <w:rPr>
@@ -1688,8 +1675,7 @@
                 <w:rStyle w:val="Enlacedelndice"/>
                 <w:vanish w:val="false"/>
               </w:rPr>
-              <w:tab/>
-              <w:t>18</w:t>
+              <w:t>16</w:t>
             </w:r>
             <w:r>
               <w:rPr>
@@ -1703,6 +1689,7 @@
           <w:pPr>
             <w:pStyle w:val="Sumario1"/>
             <w:tabs>
+              <w:tab w:val="clear" w:pos="720"/>
               <w:tab w:val="right" w:pos="9350" w:leader="dot"/>
             </w:tabs>
             <w:rPr>
@@ -1716,9 +1703,10 @@
                 <w:webHidden/>
                 <w:rStyle w:val="Enlacedelndice"/>
                 <w:rFonts w:eastAsia="Times New Roman"/>
+                <w:vanish w:val="false"/>
                 <w:lang w:eastAsia="es-MX"/>
               </w:rPr>
-              <w:t>Capítulo 19: Ley aplicable y jurisdicciones</w:t>
+              <w:t>Capítulo 19: Ley aplicable y jurisdicciones……………………………………………………</w:t>
             </w:r>
             <w:r>
               <w:rPr>
@@ -1730,7 +1718,7 @@
               <w:rPr>
                 <w:webHidden/>
               </w:rPr>
-              <w:instrText>PAGEREF _Toc74153386 \h</w:instrText>
+              <w:instrText xml:space="preserve">PAGEREF _Toc74153386 \h</w:instrText>
             </w:r>
             <w:r>
               <w:rPr>
@@ -1743,8 +1731,7 @@
                 <w:rStyle w:val="Enlacedelndice"/>
                 <w:vanish w:val="false"/>
               </w:rPr>
-              <w:tab/>
-              <w:t>18</w:t>
+              <w:t>17</w:t>
             </w:r>
             <w:r>
               <w:rPr>
@@ -1758,6 +1745,7 @@
           <w:pPr>
             <w:pStyle w:val="Sumario1"/>
             <w:tabs>
+              <w:tab w:val="clear" w:pos="720"/>
               <w:tab w:val="right" w:pos="9350" w:leader="dot"/>
             </w:tabs>
             <w:rPr>
@@ -1771,9 +1759,10 @@
                 <w:webHidden/>
                 <w:rStyle w:val="Enlacedelndice"/>
                 <w:rFonts w:eastAsia="Times New Roman"/>
+                <w:vanish w:val="false"/>
                 <w:lang w:eastAsia="es-MX"/>
               </w:rPr>
-              <w:t>Capítulo 20: Fuerza mayor</w:t>
+              <w:t>Capítulo 20: Fuerza mayor………………………………………………………………………..</w:t>
             </w:r>
             <w:r>
               <w:rPr>
@@ -1785,7 +1774,7 @@
               <w:rPr>
                 <w:webHidden/>
               </w:rPr>
-              <w:instrText>PAGEREF _Toc74153387 \h</w:instrText>
+              <w:instrText xml:space="preserve">PAGEREF _Toc74153387 \h</w:instrText>
             </w:r>
             <w:r>
               <w:rPr>
@@ -1798,8 +1787,7 @@
                 <w:rStyle w:val="Enlacedelndice"/>
                 <w:vanish w:val="false"/>
               </w:rPr>
-              <w:tab/>
-              <w:t>19</w:t>
+              <w:t>17</w:t>
             </w:r>
             <w:r>
               <w:rPr>
@@ -1813,6 +1801,7 @@
           <w:pPr>
             <w:pStyle w:val="Sumario1"/>
             <w:tabs>
+              <w:tab w:val="clear" w:pos="720"/>
               <w:tab w:val="right" w:pos="9350" w:leader="dot"/>
             </w:tabs>
             <w:rPr>
@@ -1826,9 +1815,10 @@
                 <w:webHidden/>
                 <w:rStyle w:val="Enlacedelndice"/>
                 <w:rFonts w:eastAsia="Times New Roman"/>
+                <w:vanish w:val="false"/>
                 <w:lang w:eastAsia="es-MX"/>
               </w:rPr>
-              <w:t>Capítulo 22: riesgos</w:t>
+              <w:t>Capítulo 22: riesgos…………………………………………………………………………………</w:t>
             </w:r>
             <w:r>
               <w:rPr>
@@ -1840,7 +1830,7 @@
               <w:rPr>
                 <w:webHidden/>
               </w:rPr>
-              <w:instrText>PAGEREF _Toc74153388 \h</w:instrText>
+              <w:instrText xml:space="preserve">PAGEREF _Toc74153388 \h</w:instrText>
             </w:r>
             <w:r>
               <w:rPr>
@@ -1853,8 +1843,7 @@
                 <w:rStyle w:val="Enlacedelndice"/>
                 <w:vanish w:val="false"/>
               </w:rPr>
-              <w:tab/>
-              <w:t>20</w:t>
+              <w:t>18</w:t>
             </w:r>
             <w:r>
               <w:rPr>
@@ -1868,6 +1857,7 @@
           <w:pPr>
             <w:pStyle w:val="Sumario1"/>
             <w:tabs>
+              <w:tab w:val="clear" w:pos="720"/>
               <w:tab w:val="right" w:pos="9350" w:leader="dot"/>
             </w:tabs>
             <w:rPr>
@@ -1881,9 +1871,10 @@
                 <w:webHidden/>
                 <w:rStyle w:val="Enlacedelndice"/>
                 <w:rFonts w:eastAsia="Times New Roman"/>
+                <w:vanish w:val="false"/>
                 <w:lang w:eastAsia="es-MX"/>
               </w:rPr>
-              <w:t>Capítulo 23: Estipulación para terceros.</w:t>
+              <w:t>Capítulo 23: Estipulación para terceros………………………………………………………..</w:t>
             </w:r>
             <w:r>
               <w:rPr>
@@ -1895,7 +1886,7 @@
               <w:rPr>
                 <w:webHidden/>
               </w:rPr>
-              <w:instrText>PAGEREF _Toc74153389 \h</w:instrText>
+              <w:instrText xml:space="preserve">PAGEREF _Toc74153389 \h</w:instrText>
             </w:r>
             <w:r>
               <w:rPr>
@@ -1908,8 +1899,7 @@
                 <w:rStyle w:val="Enlacedelndice"/>
                 <w:vanish w:val="false"/>
               </w:rPr>
-              <w:tab/>
-              <w:t>22</w:t>
+              <w:t>20</w:t>
             </w:r>
             <w:r>
               <w:rPr>
@@ -1923,6 +1913,7 @@
           <w:pPr>
             <w:pStyle w:val="Sumario1"/>
             <w:tabs>
+              <w:tab w:val="clear" w:pos="720"/>
               <w:tab w:val="right" w:pos="9350" w:leader="dot"/>
             </w:tabs>
             <w:rPr>
@@ -1936,9 +1927,10 @@
                 <w:webHidden/>
                 <w:rStyle w:val="Enlacedelndice"/>
                 <w:rFonts w:eastAsia="Times New Roman"/>
+                <w:vanish w:val="false"/>
                 <w:lang w:eastAsia="es-MX"/>
               </w:rPr>
-              <w:t>Capítulo 24: disposiciones finales</w:t>
+              <w:t>Capítulo 24: disposiciones finales……………………………………………………………….</w:t>
             </w:r>
             <w:r>
               <w:rPr>
@@ -1950,7 +1942,7 @@
               <w:rPr>
                 <w:webHidden/>
               </w:rPr>
-              <w:instrText>PAGEREF _Toc74153390 \h</w:instrText>
+              <w:instrText xml:space="preserve">PAGEREF _Toc74153390 \h</w:instrText>
             </w:r>
             <w:r>
               <w:rPr>
@@ -1963,8 +1955,7 @@
                 <w:rStyle w:val="Enlacedelndice"/>
                 <w:vanish w:val="false"/>
               </w:rPr>
-              <w:tab/>
-              <w:t>22</w:t>
+              <w:t>20</w:t>
             </w:r>
             <w:r>
               <w:rPr>
@@ -1995,6 +1986,7 @@
             <w:rPr>
               <w:b/>
               <w:bCs/>
+              <w:lang w:val="es-ES"/>
             </w:rPr>
             <w:fldChar w:fldCharType="end"/>
           </w:r>
@@ -2124,7 +2116,7 @@
         <w:spacing w:lineRule="auto" w:line="240" w:before="0" w:after="100"/>
         <w:jc w:val="both"/>
         <w:rPr>
-          <w:rStyle w:val="Ttulo1Car"/>
+          <w:rStyle w:val="Heading1Char"/>
         </w:rPr>
       </w:pPr>
       <w:r>
@@ -2138,13 +2130,13 @@
         <w:spacing w:lineRule="auto" w:line="240" w:before="0" w:after="100"/>
         <w:jc w:val="both"/>
         <w:rPr>
-          <w:rStyle w:val="Ttulo1Car"/>
+          <w:rStyle w:val="Heading1Char"/>
         </w:rPr>
       </w:pPr>
       <w:bookmarkStart w:id="2" w:name="_Toc74153368"/>
       <w:r>
         <w:rPr>
-          <w:rStyle w:val="Ttulo1Car"/>
+          <w:rStyle w:val="Heading1Char"/>
         </w:rPr>
         <w:t>Capítulo 1: Vocabulario:</w:t>
       </w:r>
@@ -2182,6 +2174,19 @@
     </w:p>
     <w:p>
       <w:pPr>
+        <w:sectPr>
+          <w:headerReference w:type="even" r:id="rId10"/>
+          <w:headerReference w:type="default" r:id="rId11"/>
+          <w:headerReference w:type="first" r:id="rId12"/>
+          <w:footerReference w:type="default" r:id="rId13"/>
+          <w:type w:val="nextPage"/>
+          <w:pgSz w:w="12240" w:h="15840"/>
+          <w:pgMar w:left="1440" w:right="1440" w:gutter="0" w:header="720" w:top="1440" w:footer="720" w:bottom="1440"/>
+          <w:pgNumType w:fmt="decimal"/>
+          <w:formProt w:val="false"/>
+          <w:textDirection w:val="lrTb"/>
+          <w:docGrid w:type="default" w:linePitch="360" w:charSpace="8192"/>
+        </w:sectPr>
         <w:pStyle w:val="Normal"/>
         <w:shd w:val="clear" w:color="auto" w:fill="FFFFFF"/>
         <w:spacing w:lineRule="auto" w:line="240" w:before="0" w:after="100"/>
@@ -2214,7 +2219,7 @@
           <w:szCs w:val="24"/>
           <w:lang w:val="es-MX" w:eastAsia="es-MX"/>
         </w:rPr>
-        <w:t>refiere a un árbol, tanto a su especie como al área forestal donde se encuentra (incluidas sus coordenadas GPS). </w:t>
+        <w:t>refiere a un árbol, tanto a su especie como al área forestal donde se encuentra (incluidas sus coordenadas GPS)</w:t>
       </w:r>
     </w:p>
     <w:p>
@@ -2744,7 +2749,7 @@
         <w:spacing w:lineRule="auto" w:line="240" w:before="0" w:after="100"/>
         <w:jc w:val="both"/>
         <w:rPr>
-          <w:rStyle w:val="Ttulo1Car"/>
+          <w:rStyle w:val="Heading1Char"/>
         </w:rPr>
       </w:pPr>
       <w:r>
@@ -2807,13 +2812,13 @@
         <w:spacing w:lineRule="auto" w:line="240" w:before="0" w:after="100"/>
         <w:jc w:val="both"/>
         <w:rPr>
-          <w:rStyle w:val="Ttulo1Car"/>
+          <w:rStyle w:val="Heading1Char"/>
         </w:rPr>
       </w:pPr>
       <w:bookmarkStart w:id="3" w:name="_Toc74153369"/>
       <w:r>
         <w:rPr>
-          <w:rStyle w:val="Ttulo1Car"/>
+          <w:rStyle w:val="Heading1Char"/>
         </w:rPr>
         <w:t>Capítulo 2: Comisión por parte de Treeconomy:</w:t>
       </w:r>
@@ -2826,7 +2831,7 @@
         <w:spacing w:lineRule="auto" w:line="240" w:before="0" w:after="100"/>
         <w:jc w:val="both"/>
         <w:rPr>
-          <w:rStyle w:val="Ttulo1Car"/>
+          <w:rStyle w:val="Heading1Char"/>
         </w:rPr>
       </w:pPr>
       <w:r>
@@ -6932,6 +6937,17 @@
     </w:p>
     <w:p>
       <w:pPr>
+        <w:sectPr>
+          <w:headerReference w:type="default" r:id="rId14"/>
+          <w:footerReference w:type="default" r:id="rId15"/>
+          <w:type w:val="nextPage"/>
+          <w:pgSz w:w="12240" w:h="15840"/>
+          <w:pgMar w:left="1440" w:right="1440" w:gutter="0" w:header="720" w:top="1440" w:footer="720" w:bottom="1440"/>
+          <w:pgNumType w:fmt="decimal"/>
+          <w:formProt w:val="false"/>
+          <w:textDirection w:val="lrTb"/>
+          <w:docGrid w:type="default" w:linePitch="360" w:charSpace="8192"/>
+        </w:sectPr>
         <w:pStyle w:val="Normal"/>
         <w:shd w:val="clear" w:color="auto" w:fill="FFFFFF"/>
         <w:spacing w:lineRule="auto" w:line="240" w:before="0" w:after="100"/>
@@ -6993,26 +7009,8 @@
           <w:lang w:val="es-MX" w:eastAsia="es-MX"/>
         </w:rPr>
         <w:t>Además, y al recopilar información relacionada con la adquisición de un Producto, Treeconomy utiliza los datos personales proporcionados por el Comprador y / o el Usuario en esta ocasión para gestionar la publicación de contenido en su Sitio.</w:t>
-      </w:r>
-      <w:r>
-        <w:rPr>
-          <w:rFonts w:eastAsia="Times New Roman" w:cs="Times New Roman" w:ascii="Comfortaa Light" w:hAnsi="Comfortaa Light"/>
-          <w:color w:val="000000" w:themeColor="text1"/>
-          <w:sz w:val="27"/>
-          <w:szCs w:val="27"/>
-          <w:lang w:val="es-MX" w:eastAsia="es-MX"/>
-        </w:rPr>
-        <w:br/>
-        <w:br/>
-      </w:r>
-      <w:r>
-        <w:rPr>
-          <w:rFonts w:eastAsia="Times New Roman" w:cs="Arial" w:ascii="Comfortaa Light" w:hAnsi="Comfortaa Light"/>
-          <w:color w:val="000000" w:themeColor="text1"/>
-          <w:sz w:val="24"/>
-          <w:szCs w:val="24"/>
-          <w:lang w:val="es-MX" w:eastAsia="es-MX"/>
-        </w:rPr>
+        <w:br/>
+        <w:br/>
         <w:t>De conformidad Ley de protección de datos, Treeconomy informa al Comprador y / o al Usuario que tiene derecho a rectificar, consultar o modificar y eliminar los datos que se le comuniquen.</w:t>
       </w:r>
       <w:r>
@@ -7054,26 +7052,8 @@
           <w:lang w:val="es-MX" w:eastAsia="es-MX"/>
         </w:rPr>
         <w:t>Finalmente, al navegar por el sitio web, el Comprador y / o el Usuario aceptan el uso de cookies con fines estadísticos.</w:t>
-      </w:r>
-      <w:r>
-        <w:rPr>
-          <w:rFonts w:eastAsia="Times New Roman" w:cs="Times New Roman" w:ascii="Comfortaa Light" w:hAnsi="Comfortaa Light"/>
-          <w:color w:val="000000" w:themeColor="text1"/>
-          <w:sz w:val="27"/>
-          <w:szCs w:val="27"/>
-          <w:lang w:val="es-MX" w:eastAsia="es-MX"/>
-        </w:rPr>
-        <w:br/>
-        <w:br/>
-      </w:r>
-      <w:r>
-        <w:rPr>
-          <w:rFonts w:eastAsia="Times New Roman" w:cs="Arial" w:ascii="Comfortaa Light" w:hAnsi="Comfortaa Light"/>
-          <w:color w:val="000000" w:themeColor="text1"/>
-          <w:sz w:val="24"/>
-          <w:szCs w:val="24"/>
-          <w:lang w:val="es-MX" w:eastAsia="es-MX"/>
-        </w:rPr>
+        <w:br/>
+        <w:br/>
         <w:t>Estos son pequeños archivos de texto almacenados en el disco duro del Comprador y / o del Usuario.</w:t>
       </w:r>
       <w:r>
@@ -7318,11 +7298,95 @@
     </w:p>
     <w:p>
       <w:pPr>
+        <w:sectPr>
+          <w:headerReference w:type="even" r:id="rId16"/>
+          <w:headerReference w:type="default" r:id="rId17"/>
+          <w:headerReference w:type="first" r:id="rId18"/>
+          <w:footerReference w:type="default" r:id="rId19"/>
+          <w:type w:val="nextPage"/>
+          <w:pgSz w:w="12240" w:h="15840"/>
+          <w:pgMar w:left="1440" w:right="1440" w:gutter="0" w:header="720" w:top="1440" w:footer="720" w:bottom="1440"/>
+          <w:pgNumType w:fmt="decimal"/>
+          <w:formProt w:val="false"/>
+          <w:textDirection w:val="lrTb"/>
+          <w:docGrid w:type="default" w:linePitch="360" w:charSpace="8192"/>
+        </w:sectPr>
         <w:pStyle w:val="Normal"/>
         <w:shd w:val="clear" w:color="auto" w:fill="FFFFFF"/>
         <w:spacing w:lineRule="auto" w:line="240" w:before="0" w:after="100"/>
         <w:jc w:val="both"/>
         <w:rPr>
+          <w:rFonts w:ascii="Comfortaa Light" w:hAnsi="Comfortaa Light" w:eastAsia="Times New Roman" w:cs="Arial"/>
+          <w:color w:val="000000" w:themeColor="text1"/>
+          <w:sz w:val="24"/>
+          <w:szCs w:val="24"/>
+          <w:lang w:val="es-MX" w:eastAsia="es-MX"/>
+        </w:rPr>
+      </w:pPr>
+      <w:r>
+        <w:rPr>
+          <w:rFonts w:eastAsia="Times New Roman" w:cs="Arial" w:ascii="Comfortaa Light" w:hAnsi="Comfortaa Light"/>
+          <w:color w:val="000000" w:themeColor="text1"/>
+          <w:sz w:val="24"/>
+          <w:szCs w:val="24"/>
+          <w:lang w:val="es-MX" w:eastAsia="es-MX"/>
+        </w:rPr>
+        <w:t>Treeconomy ofrece a los clientes la oportunidad de alentar a otras personas (personas y profesionales) a realizar una de sus ofertas a cambio de beneficios promocionales, de esta manera el cliente transforma su estado de Cliente a Cliente Comisionista.</w:t>
+      </w:r>
+      <w:r>
+        <w:rPr>
+          <w:rFonts w:eastAsia="Times New Roman" w:cs="Times New Roman" w:ascii="Comfortaa Light" w:hAnsi="Comfortaa Light"/>
+          <w:color w:val="000000" w:themeColor="text1"/>
+          <w:sz w:val="27"/>
+          <w:szCs w:val="27"/>
+          <w:lang w:val="es-MX" w:eastAsia="es-MX"/>
+        </w:rPr>
+        <w:t xml:space="preserve"> </w:t>
+      </w:r>
+      <w:r>
+        <w:rPr>
+          <w:rFonts w:eastAsia="Times New Roman" w:cs="Arial" w:ascii="Comfortaa Light" w:hAnsi="Comfortaa Light"/>
+          <w:color w:val="000000" w:themeColor="text1"/>
+          <w:sz w:val="24"/>
+          <w:szCs w:val="24"/>
+          <w:lang w:val="es-MX" w:eastAsia="es-MX"/>
+        </w:rPr>
+        <w:t>El cliente comisionista debe ser un cliente activo de Treeconomy que se haya suscrito a al menos una de las ofertas de Treeconomy.</w:t>
+      </w:r>
+      <w:r>
+        <w:rPr>
+          <w:rFonts w:eastAsia="Times New Roman" w:cs="Times New Roman" w:ascii="Comfortaa Light" w:hAnsi="Comfortaa Light"/>
+          <w:color w:val="000000" w:themeColor="text1"/>
+          <w:sz w:val="27"/>
+          <w:szCs w:val="27"/>
+          <w:lang w:val="es-MX" w:eastAsia="es-MX"/>
+        </w:rPr>
+        <w:t xml:space="preserve"> </w:t>
+      </w:r>
+      <w:r>
+        <w:rPr>
+          <w:rFonts w:eastAsia="Times New Roman" w:cs="Arial" w:ascii="Comfortaa Light" w:hAnsi="Comfortaa Light"/>
+          <w:color w:val="000000" w:themeColor="text1"/>
+          <w:sz w:val="24"/>
+          <w:szCs w:val="24"/>
+          <w:lang w:val="es-MX" w:eastAsia="es-MX"/>
+        </w:rPr>
+        <w:br/>
+        <w:t>Para que se valide la Comisión, se debe ingresar el código del comisionista antes del registro del cliente referido, Código que será previamente entregado por Treeconomy al comisionista interesado en promocionar a Treeconomy.</w:t>
+        <w:br/>
+        <w:t>Cuando uno o más clientes han comprado uno o varios arboles gracias al esfuerzo realizado por el comisionista, este recibirá un 3% de la venta sin incluir impuestos, pago sujeto a que el nuevo cliente usara el código suministrado al comisionista por parte de Treeconomy</w:t>
+        <w:br/>
+        <w:br/>
+        <w:t>El auto venta o compra dentro del mismo hogar no está permitido. cliente referido deb</w:t>
+      </w:r>
+    </w:p>
+    <w:p>
+      <w:pPr>
+        <w:pStyle w:val="Normal"/>
+        <w:shd w:val="clear" w:color="auto" w:fill="FFFFFF"/>
+        <w:spacing w:lineRule="auto" w:line="240" w:before="0" w:after="100"/>
+        <w:jc w:val="both"/>
+        <w:rPr>
           <w:rFonts w:ascii="Comfortaa Light" w:hAnsi="Comfortaa Light" w:eastAsia="Times New Roman" w:cs="Times New Roman"/>
           <w:color w:val="000000" w:themeColor="text1"/>
           <w:sz w:val="27"/>
@@ -7338,89 +7402,7 @@
           <w:szCs w:val="24"/>
           <w:lang w:val="es-MX" w:eastAsia="es-MX"/>
         </w:rPr>
-        <w:t>Treeconomy ofrece a los clientes la oportunidad de alentar a otras personas (personas y profesionales) a realizar una de sus ofertas a cambio de beneficios promocionales, de esta manera el cliente transforma su estado de Cliente a Cliente Comisionista.</w:t>
-      </w:r>
-      <w:r>
-        <w:rPr>
-          <w:rFonts w:eastAsia="Times New Roman" w:cs="Times New Roman" w:ascii="Comfortaa Light" w:hAnsi="Comfortaa Light"/>
-          <w:color w:val="000000" w:themeColor="text1"/>
-          <w:sz w:val="27"/>
-          <w:szCs w:val="27"/>
-          <w:lang w:val="es-MX" w:eastAsia="es-MX"/>
-        </w:rPr>
-        <w:t xml:space="preserve"> </w:t>
-      </w:r>
-      <w:r>
-        <w:rPr>
-          <w:rFonts w:eastAsia="Times New Roman" w:cs="Arial" w:ascii="Comfortaa Light" w:hAnsi="Comfortaa Light"/>
-          <w:color w:val="000000" w:themeColor="text1"/>
-          <w:sz w:val="24"/>
-          <w:szCs w:val="24"/>
-          <w:lang w:val="es-MX" w:eastAsia="es-MX"/>
-        </w:rPr>
-        <w:t>El cliente comisionista debe ser un cliente activo de Treeconomy que se haya suscrito a al menos una de las ofertas de Treeconomy.</w:t>
-      </w:r>
-      <w:r>
-        <w:rPr>
-          <w:rFonts w:eastAsia="Times New Roman" w:cs="Times New Roman" w:ascii="Comfortaa Light" w:hAnsi="Comfortaa Light"/>
-          <w:color w:val="000000" w:themeColor="text1"/>
-          <w:sz w:val="27"/>
-          <w:szCs w:val="27"/>
-          <w:lang w:val="es-MX" w:eastAsia="es-MX"/>
-        </w:rPr>
-        <w:t xml:space="preserve"> </w:t>
-        <w:br/>
-      </w:r>
-      <w:r>
-        <w:rPr>
-          <w:rFonts w:eastAsia="Times New Roman" w:cs="Arial" w:ascii="Comfortaa Light" w:hAnsi="Comfortaa Light"/>
-          <w:color w:val="000000" w:themeColor="text1"/>
-          <w:sz w:val="24"/>
-          <w:szCs w:val="24"/>
-          <w:lang w:val="es-MX" w:eastAsia="es-MX"/>
-        </w:rPr>
-        <w:t>Para que se valide la Comisión, se debe ingresar el código del comisionista antes del registro del cliente referido, Código que será previamente entregado por Treeconomy al comisionista interesado en promocionar a Treeconomy.</w:t>
-      </w:r>
-      <w:r>
-        <w:rPr>
-          <w:rFonts w:eastAsia="Times New Roman" w:cs="Times New Roman" w:ascii="Comfortaa Light" w:hAnsi="Comfortaa Light"/>
-          <w:color w:val="000000" w:themeColor="text1"/>
-          <w:sz w:val="27"/>
-          <w:szCs w:val="27"/>
-          <w:lang w:val="es-MX" w:eastAsia="es-MX"/>
-        </w:rPr>
-        <w:br/>
-      </w:r>
-      <w:r>
-        <w:rPr>
-          <w:rFonts w:eastAsia="Times New Roman" w:cs="Arial" w:ascii="Comfortaa Light" w:hAnsi="Comfortaa Light"/>
-          <w:color w:val="000000" w:themeColor="text1"/>
-          <w:sz w:val="24"/>
-          <w:szCs w:val="24"/>
-          <w:lang w:val="es-MX" w:eastAsia="es-MX"/>
-        </w:rPr>
-        <w:t>Cuando uno o más clientes han comprado uno o varios arboles gracias al esfuerzo realizado por el comisionista, este recibirá un 3% de la venta sin incluir impuestos, pago sujeto a que el nuevo cliente usara el código suministrado al comisionista por parte de Treeconomy</w:t>
-      </w:r>
-      <w:r>
-        <w:rPr>
-          <w:rFonts w:eastAsia="Times New Roman" w:cs="Times New Roman" w:ascii="Comfortaa Light" w:hAnsi="Comfortaa Light"/>
-          <w:color w:val="000000" w:themeColor="text1"/>
-          <w:sz w:val="27"/>
-          <w:szCs w:val="27"/>
-          <w:lang w:val="es-MX" w:eastAsia="es-MX"/>
-        </w:rPr>
-        <w:br/>
-        <w:br/>
-      </w:r>
-      <w:r>
-        <w:rPr>
-          <w:rFonts w:eastAsia="Times New Roman" w:cs="Arial" w:ascii="Comfortaa Light" w:hAnsi="Comfortaa Light"/>
-          <w:color w:val="000000" w:themeColor="text1"/>
-          <w:sz w:val="24"/>
-          <w:szCs w:val="24"/>
-          <w:lang w:val="es-MX" w:eastAsia="es-MX"/>
-        </w:rPr>
-        <w:t>El auto venta o compra dentro del mismo hogar no está permitido. cliente referido debe tener una dirección de correo electrónico y una dirección de facturación diferentes a las de sus clientes referidos. Solo el usuario final del producto será considerado como cliente referido. El cliente referido debe utilizar su propio medio de pago (si el cliente referido utiliza la misma tarjeta de crédito que su padrino, por ejemplo, la Comisión no se tendrá en cuenta). La Comisión opera en un entorno privado. El cliente referido debe ser conocido, amigo o pariente de su patrocinador. Se excluirán las órdenes artificiales para inflar el número de ahijados.</w:t>
+        <w:t>tener una dirección de correo electrónico y una dirección de facturación diferentes a las de sus clientes referidos. Solo el usuario final del producto será considerado como cliente referido. El cliente referido debe utilizar su propio medio de pago (si el cliente referido utiliza la misma tarjeta de crédito que su padrino, por ejemplo, la Comisión no se tendrá en cuenta). La Comisión opera en un entorno privado. El cliente referido debe ser conocido, amigo o pariente de su patrocinador. Se excluirán las órdenes artificiales para inflar el número de ahijados.</w:t>
       </w:r>
       <w:r>
         <w:rPr>
@@ -8162,88 +8144,6 @@
         </w:rPr>
       </w:pPr>
       <w:r>
-        <mc:AlternateContent>
-          <mc:Choice Requires="wps">
-            <w:drawing>
-              <wp:anchor behindDoc="1" distT="0" distB="0" distL="114300" distR="114300" simplePos="0" locked="0" layoutInCell="1" allowOverlap="1" relativeHeight="26" wp14:anchorId="67428355">
-                <wp:simplePos x="0" y="0"/>
-                <wp:positionH relativeFrom="column">
-                  <wp:posOffset>490855</wp:posOffset>
-                </wp:positionH>
-                <wp:positionV relativeFrom="paragraph">
-                  <wp:posOffset>2181860</wp:posOffset>
-                </wp:positionV>
-                <wp:extent cx="4563745" cy="2399030"/>
-                <wp:effectExtent l="0" t="0" r="0" b="0"/>
-                <wp:wrapNone/>
-                <wp:docPr id="1" name="Imagen 1" descr="Logotipo&#10;&#10;Descripción generada automáticamente"/>
-                <a:graphic xmlns:a="http://schemas.openxmlformats.org/drawingml/2006/main">
-                  <a:graphicData uri="http://schemas.openxmlformats.org/drawingml/2006/picture">
-                    <pic:pic xmlns:pic="http://schemas.openxmlformats.org/drawingml/2006/picture">
-                      <pic:nvPicPr>
-                        <pic:cNvPr id="0" name="Imagen 1" descr="Logotipo&#10;&#10;Descripción generada automáticamente"/>
-                        <pic:cNvPicPr/>
-                      </pic:nvPicPr>
-                      <pic:blipFill>
-                        <a:blip r:embed="rId4"/>
-                        <a:stretch/>
-                      </pic:blipFill>
-                      <pic:spPr>
-                        <a:xfrm>
-                          <a:off x="0" y="0"/>
-                          <a:ext cx="4563000" cy="2398320"/>
-                        </a:xfrm>
-                        <a:prstGeom prst="rect">
-                          <a:avLst/>
-                        </a:prstGeom>
-                        <a:ln>
-                          <a:noFill/>
-                        </a:ln>
-                        <a:effectLst>
-                          <a:outerShdw algn="ctr" blurRad="50800" dir="5400000" dist="50800" rotWithShape="0">
-                            <a:srgbClr val="000000">
-                              <a:alpha val="0"/>
-                            </a:srgbClr>
-                          </a:outerShdw>
-                        </a:effectLst>
-                      </pic:spPr>
-                    </pic:pic>
-                  </a:graphicData>
-                </a:graphic>
-              </wp:anchor>
-            </w:drawing>
-          </mc:Choice>
-          <mc:Fallback>
-            <w:pict>
-              <v:shapetype id="shapetype_75" coordsize="21600,21600" o:spt="75" o:preferrelative="t" path="m@4@5l@4@11@9@11@9@5xe" filled="f" stroked="f">
-                <v:stroke joinstyle="miter"/>
-                <v:formulas>
-                  <v:f eqn="if lineDrawn pixelLineWidth 0"/>
-                  <v:f eqn="sum @0 1 0"/>
-                  <v:f eqn="sum 0 0 @1"/>
-                  <v:f eqn="prod @2 1 2"/>
-                  <v:f eqn="prod @3 21600 pixelWidth"/>
-                  <v:f eqn="prod @3 21600 pixelHeight"/>
-                  <v:f eqn="sum @0 0 1"/>
-                  <v:f eqn="prod @6 1 2"/>
-                  <v:f eqn="prod @7 21600 pixelWidth"/>
-                  <v:f eqn="sum @8 21600 0"/>
-                  <v:f eqn="prod @7 21600 pixelHeight"/>
-                  <v:f eqn="sum @10 21600 0"/>
-                </v:formulas>
-                <v:path o:extrusionok="f" gradientshapeok="t" o:connecttype="rect"/>
-                <o:lock v:ext="edit" aspectratio="t"/>
-              </v:shapetype>
-              <v:shape id="shape_0" ID="Imagen 1" stroked="f" style="position:absolute;margin-left:38.65pt;margin-top:171.8pt;width:359.25pt;height:188.8pt" wp14:anchorId="67428355" type="shapetype_75">
-                <v:imagedata r:id="rId4" o:detectmouseclick="t"/>
-                <w10:wrap type="none"/>
-                <v:stroke color="#3465a4" joinstyle="round" endcap="flat"/>
-              </v:shape>
-            </w:pict>
-          </mc:Fallback>
-        </mc:AlternateContent>
-      </w:r>
-      <w:r>
         <w:rPr>
           <w:rFonts w:eastAsia="Times New Roman" w:cs="Arial" w:ascii="Comfortaa Light" w:hAnsi="Comfortaa Light"/>
           <w:color w:val="000000" w:themeColor="text1"/>
@@ -8312,38 +8212,551 @@
           <w:szCs w:val="24"/>
           <w:lang w:val="es-MX" w:eastAsia="es-MX"/>
         </w:rPr>
-        <w:t>En el caso de que una de las disposiciones de los Términos y Condiciones Generales se declare nula y sin efecto, se considerará no escrita, sin que esto afecte la validez de las otras disposiciones, a menos que la disposición declarada n</w:t>
-      </w:r>
-      <w:r>
-        <w:rPr>
-          <w:lang w:val="es-MX"/>
-        </w:rPr>
-        <w:t xml:space="preserve"> </w:t>
-      </w:r>
-      <w:r>
-        <w:rPr>
-          <w:rFonts w:eastAsia="Times New Roman" w:cs="Arial" w:ascii="Comfortaa Light" w:hAnsi="Comfortaa Light"/>
-          <w:color w:val="000000" w:themeColor="text1"/>
-          <w:sz w:val="24"/>
-          <w:szCs w:val="24"/>
-          <w:lang w:val="es-MX" w:eastAsia="es-MX"/>
-        </w:rPr>
-        <w:t>ula y sin valor sea esencial y decisiva.</w:t>
+        <w:t>En el caso de que una de las disposiciones de los Términos y Condiciones Generales se declare nula y sin efecto, se considerará no escrita, sin que esto afecte la validez de las otras disposiciones, a menos que la disposición declarada nula y sin valor sea esencial y decisiva.</w:t>
+      </w:r>
+    </w:p>
+    <w:p>
+      <w:pPr>
+        <w:pStyle w:val="Normal"/>
+        <w:shd w:val="clear" w:color="auto" w:fill="FFFFFF"/>
+        <w:spacing w:lineRule="auto" w:line="240" w:before="0" w:after="100"/>
+        <w:jc w:val="both"/>
+        <w:rPr>
+          <w:rFonts w:ascii="Comfortaa Light" w:hAnsi="Comfortaa Light" w:eastAsia="Times New Roman" w:cs="Arial"/>
+          <w:color w:val="000000" w:themeColor="text1"/>
+          <w:sz w:val="24"/>
+          <w:szCs w:val="24"/>
+          <w:lang w:val="es-MX" w:eastAsia="es-MX"/>
+        </w:rPr>
+      </w:pPr>
+      <w:r>
+        <w:rPr>
+          <w:rFonts w:eastAsia="Times New Roman" w:cs="Arial" w:ascii="Comfortaa Light" w:hAnsi="Comfortaa Light"/>
+          <w:color w:val="000000" w:themeColor="text1"/>
+          <w:sz w:val="24"/>
+          <w:szCs w:val="24"/>
+          <w:lang w:val="es-MX" w:eastAsia="es-MX"/>
+        </w:rPr>
+      </w:r>
+    </w:p>
+    <w:p>
+      <w:pPr>
+        <w:pStyle w:val="Normal"/>
+        <w:shd w:val="clear" w:color="auto" w:fill="FFFFFF"/>
+        <w:spacing w:lineRule="auto" w:line="240" w:before="0" w:after="100"/>
+        <w:jc w:val="both"/>
+        <w:rPr>
+          <w:rFonts w:ascii="Comfortaa Light" w:hAnsi="Comfortaa Light" w:eastAsia="Times New Roman" w:cs="Arial"/>
+          <w:color w:val="000000" w:themeColor="text1"/>
+          <w:sz w:val="24"/>
+          <w:szCs w:val="24"/>
+          <w:lang w:val="es-MX" w:eastAsia="es-MX"/>
+        </w:rPr>
+      </w:pPr>
+      <w:r>
+        <w:rPr>
+          <w:rFonts w:eastAsia="Times New Roman" w:cs="Arial" w:ascii="Comfortaa Light" w:hAnsi="Comfortaa Light"/>
+          <w:color w:val="000000" w:themeColor="text1"/>
+          <w:sz w:val="24"/>
+          <w:szCs w:val="24"/>
+          <w:lang w:val="es-MX" w:eastAsia="es-MX"/>
+        </w:rPr>
+      </w:r>
+    </w:p>
+    <w:p>
+      <w:pPr>
+        <w:pStyle w:val="Normal"/>
+        <w:shd w:val="clear" w:color="auto" w:fill="FFFFFF"/>
+        <w:spacing w:lineRule="auto" w:line="240" w:before="0" w:after="100"/>
+        <w:jc w:val="both"/>
+        <w:rPr>
+          <w:rFonts w:ascii="Comfortaa Light" w:hAnsi="Comfortaa Light" w:eastAsia="Times New Roman" w:cs="Arial"/>
+          <w:color w:val="000000" w:themeColor="text1"/>
+          <w:sz w:val="24"/>
+          <w:szCs w:val="24"/>
+          <w:lang w:val="es-MX" w:eastAsia="es-MX"/>
+        </w:rPr>
+      </w:pPr>
+      <w:r>
+        <w:rPr>
+          <w:rFonts w:eastAsia="Times New Roman" w:cs="Arial" w:ascii="Comfortaa Light" w:hAnsi="Comfortaa Light"/>
+          <w:color w:val="000000" w:themeColor="text1"/>
+          <w:sz w:val="24"/>
+          <w:szCs w:val="24"/>
+          <w:lang w:val="es-MX" w:eastAsia="es-MX"/>
+        </w:rPr>
+      </w:r>
+    </w:p>
+    <w:p>
+      <w:pPr>
+        <w:pStyle w:val="Normal"/>
+        <w:shd w:val="clear" w:color="auto" w:fill="FFFFFF"/>
+        <w:spacing w:lineRule="auto" w:line="240" w:before="0" w:after="100"/>
+        <w:jc w:val="both"/>
+        <w:rPr>
+          <w:rFonts w:ascii="Comfortaa Light" w:hAnsi="Comfortaa Light" w:eastAsia="Times New Roman" w:cs="Arial"/>
+          <w:color w:val="000000" w:themeColor="text1"/>
+          <w:sz w:val="24"/>
+          <w:szCs w:val="24"/>
+          <w:lang w:val="es-MX" w:eastAsia="es-MX"/>
+        </w:rPr>
+      </w:pPr>
+      <w:r>
+        <w:rPr>
+          <w:rFonts w:eastAsia="Times New Roman" w:cs="Arial" w:ascii="Comfortaa Light" w:hAnsi="Comfortaa Light"/>
+          <w:color w:val="000000" w:themeColor="text1"/>
+          <w:sz w:val="24"/>
+          <w:szCs w:val="24"/>
+          <w:lang w:val="es-MX" w:eastAsia="es-MX"/>
+        </w:rPr>
+      </w:r>
+    </w:p>
+    <w:p>
+      <w:pPr>
+        <w:pStyle w:val="Normal"/>
+        <w:shd w:val="clear" w:color="auto" w:fill="FFFFFF"/>
+        <w:spacing w:lineRule="auto" w:line="240" w:before="0" w:after="100"/>
+        <w:jc w:val="both"/>
+        <w:rPr>
+          <w:rFonts w:ascii="Comfortaa Light" w:hAnsi="Comfortaa Light" w:eastAsia="Times New Roman" w:cs="Arial"/>
+          <w:color w:val="000000" w:themeColor="text1"/>
+          <w:sz w:val="24"/>
+          <w:szCs w:val="24"/>
+          <w:lang w:val="es-MX" w:eastAsia="es-MX"/>
+        </w:rPr>
+      </w:pPr>
+      <w:r>
+        <w:rPr>
+          <w:rFonts w:eastAsia="Times New Roman" w:cs="Arial" w:ascii="Comfortaa Light" w:hAnsi="Comfortaa Light"/>
+          <w:color w:val="000000" w:themeColor="text1"/>
+          <w:sz w:val="24"/>
+          <w:szCs w:val="24"/>
+          <w:lang w:val="es-MX" w:eastAsia="es-MX"/>
+        </w:rPr>
+      </w:r>
+    </w:p>
+    <w:p>
+      <w:pPr>
+        <w:pStyle w:val="Normal"/>
+        <w:shd w:val="clear" w:color="auto" w:fill="FFFFFF"/>
+        <w:spacing w:lineRule="auto" w:line="240" w:before="0" w:after="100"/>
+        <w:jc w:val="both"/>
+        <w:rPr>
+          <w:rFonts w:ascii="Comfortaa Light" w:hAnsi="Comfortaa Light" w:eastAsia="Times New Roman" w:cs="Arial"/>
+          <w:color w:val="000000" w:themeColor="text1"/>
+          <w:sz w:val="24"/>
+          <w:szCs w:val="24"/>
+          <w:lang w:val="es-MX" w:eastAsia="es-MX"/>
+        </w:rPr>
+      </w:pPr>
+      <w:r>
+        <w:rPr>
+          <w:rFonts w:eastAsia="Times New Roman" w:cs="Arial" w:ascii="Comfortaa Light" w:hAnsi="Comfortaa Light"/>
+          <w:color w:val="000000" w:themeColor="text1"/>
+          <w:sz w:val="24"/>
+          <w:szCs w:val="24"/>
+          <w:lang w:val="es-MX" w:eastAsia="es-MX"/>
+        </w:rPr>
+      </w:r>
+    </w:p>
+    <w:p>
+      <w:pPr>
+        <w:pStyle w:val="Normal"/>
+        <w:shd w:val="clear" w:color="auto" w:fill="FFFFFF"/>
+        <w:spacing w:lineRule="auto" w:line="240" w:before="0" w:after="100"/>
+        <w:jc w:val="both"/>
+        <w:rPr>
+          <w:rFonts w:ascii="Comfortaa Light" w:hAnsi="Comfortaa Light" w:eastAsia="Times New Roman" w:cs="Arial"/>
+          <w:color w:val="000000" w:themeColor="text1"/>
+          <w:sz w:val="24"/>
+          <w:szCs w:val="24"/>
+          <w:lang w:val="es-MX" w:eastAsia="es-MX"/>
+        </w:rPr>
+      </w:pPr>
+      <w:r>
+        <w:rPr>
+          <w:rFonts w:eastAsia="Times New Roman" w:cs="Arial" w:ascii="Comfortaa Light" w:hAnsi="Comfortaa Light"/>
+          <w:color w:val="000000" w:themeColor="text1"/>
+          <w:sz w:val="24"/>
+          <w:szCs w:val="24"/>
+          <w:lang w:val="es-MX" w:eastAsia="es-MX"/>
+        </w:rPr>
+      </w:r>
+    </w:p>
+    <w:p>
+      <w:pPr>
+        <w:pStyle w:val="Normal"/>
+        <w:shd w:val="clear" w:color="auto" w:fill="FFFFFF"/>
+        <w:spacing w:lineRule="auto" w:line="240" w:before="0" w:after="100"/>
+        <w:jc w:val="both"/>
+        <w:rPr>
+          <w:rFonts w:ascii="Comfortaa Light" w:hAnsi="Comfortaa Light" w:eastAsia="Times New Roman" w:cs="Arial"/>
+          <w:color w:val="000000" w:themeColor="text1"/>
+          <w:sz w:val="24"/>
+          <w:szCs w:val="24"/>
+          <w:lang w:val="es-MX" w:eastAsia="es-MX"/>
+        </w:rPr>
+      </w:pPr>
+      <w:r>
+        <w:rPr>
+          <w:rFonts w:eastAsia="Times New Roman" w:cs="Arial" w:ascii="Comfortaa Light" w:hAnsi="Comfortaa Light"/>
+          <w:color w:val="000000" w:themeColor="text1"/>
+          <w:sz w:val="24"/>
+          <w:szCs w:val="24"/>
+          <w:lang w:val="es-MX" w:eastAsia="es-MX"/>
+        </w:rPr>
+      </w:r>
+    </w:p>
+    <w:p>
+      <w:pPr>
+        <w:pStyle w:val="Normal"/>
+        <w:shd w:val="clear" w:color="auto" w:fill="FFFFFF"/>
+        <w:spacing w:lineRule="auto" w:line="240" w:before="0" w:after="100"/>
+        <w:jc w:val="both"/>
+        <w:rPr>
+          <w:rFonts w:ascii="Comfortaa Light" w:hAnsi="Comfortaa Light" w:eastAsia="Times New Roman" w:cs="Arial"/>
+          <w:color w:val="000000" w:themeColor="text1"/>
+          <w:sz w:val="24"/>
+          <w:szCs w:val="24"/>
+          <w:lang w:val="es-MX" w:eastAsia="es-MX"/>
+        </w:rPr>
+      </w:pPr>
+      <w:r>
+        <w:rPr>
+          <w:rFonts w:eastAsia="Times New Roman" w:cs="Arial" w:ascii="Comfortaa Light" w:hAnsi="Comfortaa Light"/>
+          <w:color w:val="000000" w:themeColor="text1"/>
+          <w:sz w:val="24"/>
+          <w:szCs w:val="24"/>
+          <w:lang w:val="es-MX" w:eastAsia="es-MX"/>
+        </w:rPr>
+      </w:r>
+    </w:p>
+    <w:p>
+      <w:pPr>
+        <w:pStyle w:val="Normal"/>
+        <w:shd w:val="clear" w:color="auto" w:fill="FFFFFF"/>
+        <w:spacing w:lineRule="auto" w:line="240" w:before="0" w:after="100"/>
+        <w:jc w:val="both"/>
+        <w:rPr>
+          <w:rFonts w:ascii="Comfortaa Light" w:hAnsi="Comfortaa Light" w:eastAsia="Times New Roman" w:cs="Arial"/>
+          <w:color w:val="000000" w:themeColor="text1"/>
+          <w:sz w:val="24"/>
+          <w:szCs w:val="24"/>
+          <w:lang w:val="es-MX" w:eastAsia="es-MX"/>
+        </w:rPr>
+      </w:pPr>
+      <w:r>
+        <w:rPr>
+          <w:rFonts w:eastAsia="Times New Roman" w:cs="Arial" w:ascii="Comfortaa Light" w:hAnsi="Comfortaa Light"/>
+          <w:color w:val="000000" w:themeColor="text1"/>
+          <w:sz w:val="24"/>
+          <w:szCs w:val="24"/>
+          <w:lang w:val="es-MX" w:eastAsia="es-MX"/>
+        </w:rPr>
+      </w:r>
+    </w:p>
+    <w:p>
+      <w:pPr>
+        <w:pStyle w:val="Normal"/>
+        <w:shd w:val="clear" w:color="auto" w:fill="FFFFFF"/>
+        <w:spacing w:lineRule="auto" w:line="240" w:before="0" w:after="100"/>
+        <w:jc w:val="both"/>
+        <w:rPr>
+          <w:rFonts w:ascii="Comfortaa Light" w:hAnsi="Comfortaa Light" w:eastAsia="Times New Roman" w:cs="Arial"/>
+          <w:color w:val="000000" w:themeColor="text1"/>
+          <w:sz w:val="24"/>
+          <w:szCs w:val="24"/>
+          <w:lang w:val="es-MX" w:eastAsia="es-MX"/>
+        </w:rPr>
+      </w:pPr>
+      <w:r>
+        <w:rPr>
+          <w:rFonts w:eastAsia="Times New Roman" w:cs="Arial" w:ascii="Comfortaa Light" w:hAnsi="Comfortaa Light"/>
+          <w:color w:val="000000" w:themeColor="text1"/>
+          <w:sz w:val="24"/>
+          <w:szCs w:val="24"/>
+          <w:lang w:val="es-MX" w:eastAsia="es-MX"/>
+        </w:rPr>
+      </w:r>
+    </w:p>
+    <w:p>
+      <w:pPr>
+        <w:pStyle w:val="Normal"/>
+        <w:shd w:val="clear" w:color="auto" w:fill="FFFFFF"/>
+        <w:spacing w:lineRule="auto" w:line="240" w:before="0" w:after="100"/>
+        <w:jc w:val="both"/>
+        <w:rPr>
+          <w:rFonts w:ascii="Comfortaa Light" w:hAnsi="Comfortaa Light" w:eastAsia="Times New Roman" w:cs="Arial"/>
+          <w:color w:val="000000" w:themeColor="text1"/>
+          <w:sz w:val="24"/>
+          <w:szCs w:val="24"/>
+          <w:lang w:val="es-MX" w:eastAsia="es-MX"/>
+        </w:rPr>
+      </w:pPr>
+      <w:r>
+        <w:rPr>
+          <w:rFonts w:eastAsia="Times New Roman" w:cs="Arial" w:ascii="Comfortaa Light" w:hAnsi="Comfortaa Light"/>
+          <w:color w:val="000000" w:themeColor="text1"/>
+          <w:sz w:val="24"/>
+          <w:szCs w:val="24"/>
+          <w:lang w:val="es-MX" w:eastAsia="es-MX"/>
+        </w:rPr>
+      </w:r>
+    </w:p>
+    <w:p>
+      <w:pPr>
+        <w:pStyle w:val="Normal"/>
+        <w:shd w:val="clear" w:color="auto" w:fill="FFFFFF"/>
+        <w:spacing w:lineRule="auto" w:line="240" w:before="0" w:after="100"/>
+        <w:jc w:val="both"/>
+        <w:rPr>
+          <w:rFonts w:ascii="Comfortaa Light" w:hAnsi="Comfortaa Light" w:eastAsia="Times New Roman" w:cs="Arial"/>
+          <w:color w:val="000000" w:themeColor="text1"/>
+          <w:sz w:val="24"/>
+          <w:szCs w:val="24"/>
+          <w:lang w:val="es-MX" w:eastAsia="es-MX"/>
+        </w:rPr>
+      </w:pPr>
+      <w:r>
+        <w:rPr>
+          <w:rFonts w:eastAsia="Times New Roman" w:cs="Arial" w:ascii="Comfortaa Light" w:hAnsi="Comfortaa Light"/>
+          <w:color w:val="000000" w:themeColor="text1"/>
+          <w:sz w:val="24"/>
+          <w:szCs w:val="24"/>
+          <w:lang w:val="es-MX" w:eastAsia="es-MX"/>
+        </w:rPr>
+      </w:r>
+    </w:p>
+    <w:p>
+      <w:pPr>
+        <w:pStyle w:val="Normal"/>
+        <w:shd w:val="clear" w:color="auto" w:fill="FFFFFF"/>
+        <w:spacing w:lineRule="auto" w:line="240" w:before="0" w:after="100"/>
+        <w:jc w:val="both"/>
+        <w:rPr>
+          <w:rFonts w:ascii="Comfortaa Light" w:hAnsi="Comfortaa Light" w:eastAsia="Times New Roman" w:cs="Arial"/>
+          <w:color w:val="000000" w:themeColor="text1"/>
+          <w:sz w:val="24"/>
+          <w:szCs w:val="24"/>
+          <w:lang w:val="es-MX" w:eastAsia="es-MX"/>
+        </w:rPr>
+      </w:pPr>
+      <w:r>
+        <w:rPr>
+          <w:rFonts w:eastAsia="Times New Roman" w:cs="Arial" w:ascii="Comfortaa Light" w:hAnsi="Comfortaa Light"/>
+          <w:color w:val="000000" w:themeColor="text1"/>
+          <w:sz w:val="24"/>
+          <w:szCs w:val="24"/>
+          <w:lang w:val="es-MX" w:eastAsia="es-MX"/>
+        </w:rPr>
+      </w:r>
+    </w:p>
+    <w:p>
+      <w:pPr>
+        <w:pStyle w:val="Normal"/>
+        <w:shd w:val="clear" w:color="auto" w:fill="FFFFFF"/>
+        <w:spacing w:lineRule="auto" w:line="240" w:before="0" w:after="100"/>
+        <w:jc w:val="both"/>
+        <w:rPr>
+          <w:rFonts w:ascii="Comfortaa Light" w:hAnsi="Comfortaa Light" w:eastAsia="Times New Roman" w:cs="Arial"/>
+          <w:color w:val="000000" w:themeColor="text1"/>
+          <w:sz w:val="24"/>
+          <w:szCs w:val="24"/>
+          <w:lang w:val="es-MX" w:eastAsia="es-MX"/>
+        </w:rPr>
+      </w:pPr>
+      <w:r>
+        <w:rPr>
+          <w:rFonts w:eastAsia="Times New Roman" w:cs="Arial" w:ascii="Comfortaa Light" w:hAnsi="Comfortaa Light"/>
+          <w:color w:val="000000" w:themeColor="text1"/>
+          <w:sz w:val="24"/>
+          <w:szCs w:val="24"/>
+          <w:lang w:val="es-MX" w:eastAsia="es-MX"/>
+        </w:rPr>
+      </w:r>
+    </w:p>
+    <w:p>
+      <w:pPr>
+        <w:pStyle w:val="Normal"/>
+        <w:shd w:val="clear" w:color="auto" w:fill="FFFFFF"/>
+        <w:spacing w:lineRule="auto" w:line="240" w:before="0" w:after="100"/>
+        <w:jc w:val="both"/>
+        <w:rPr>
+          <w:rFonts w:ascii="Comfortaa Light" w:hAnsi="Comfortaa Light" w:eastAsia="Times New Roman" w:cs="Arial"/>
+          <w:color w:val="000000" w:themeColor="text1"/>
+          <w:sz w:val="24"/>
+          <w:szCs w:val="24"/>
+          <w:lang w:val="es-MX" w:eastAsia="es-MX"/>
+        </w:rPr>
+      </w:pPr>
+      <w:r>
+        <w:rPr>
+          <w:rFonts w:eastAsia="Times New Roman" w:cs="Arial" w:ascii="Comfortaa Light" w:hAnsi="Comfortaa Light"/>
+          <w:color w:val="000000" w:themeColor="text1"/>
+          <w:sz w:val="24"/>
+          <w:szCs w:val="24"/>
+          <w:lang w:val="es-MX" w:eastAsia="es-MX"/>
+        </w:rPr>
+      </w:r>
+    </w:p>
+    <w:p>
+      <w:pPr>
+        <w:pStyle w:val="Normal"/>
+        <w:shd w:val="clear" w:color="auto" w:fill="FFFFFF"/>
+        <w:spacing w:lineRule="auto" w:line="240" w:before="0" w:after="100"/>
+        <w:jc w:val="both"/>
+        <w:rPr>
+          <w:rFonts w:ascii="Comfortaa Light" w:hAnsi="Comfortaa Light" w:eastAsia="Times New Roman" w:cs="Arial"/>
+          <w:color w:val="000000" w:themeColor="text1"/>
+          <w:sz w:val="24"/>
+          <w:szCs w:val="24"/>
+          <w:lang w:val="es-MX" w:eastAsia="es-MX"/>
+        </w:rPr>
+      </w:pPr>
+      <w:r>
+        <w:rPr>
+          <w:rFonts w:eastAsia="Times New Roman" w:cs="Arial" w:ascii="Comfortaa Light" w:hAnsi="Comfortaa Light"/>
+          <w:color w:val="000000" w:themeColor="text1"/>
+          <w:sz w:val="24"/>
+          <w:szCs w:val="24"/>
+          <w:lang w:val="es-MX" w:eastAsia="es-MX"/>
+        </w:rPr>
+      </w:r>
+    </w:p>
+    <w:p>
+      <w:pPr>
+        <w:pStyle w:val="Normal"/>
+        <w:shd w:val="clear" w:color="auto" w:fill="FFFFFF"/>
+        <w:spacing w:lineRule="auto" w:line="240" w:before="0" w:after="100"/>
+        <w:jc w:val="both"/>
+        <w:rPr>
+          <w:rFonts w:ascii="Comfortaa Light" w:hAnsi="Comfortaa Light" w:eastAsia="Times New Roman" w:cs="Arial"/>
+          <w:color w:val="000000" w:themeColor="text1"/>
+          <w:sz w:val="24"/>
+          <w:szCs w:val="24"/>
+          <w:lang w:val="es-MX" w:eastAsia="es-MX"/>
+        </w:rPr>
+      </w:pPr>
+      <w:r>
+        <w:rPr>
+          <w:rFonts w:eastAsia="Times New Roman" w:cs="Arial" w:ascii="Comfortaa Light" w:hAnsi="Comfortaa Light"/>
+          <w:color w:val="000000" w:themeColor="text1"/>
+          <w:sz w:val="24"/>
+          <w:szCs w:val="24"/>
+          <w:lang w:val="es-MX" w:eastAsia="es-MX"/>
+        </w:rPr>
+      </w:r>
+    </w:p>
+    <w:p>
+      <w:pPr>
+        <w:pStyle w:val="Normal"/>
+        <w:shd w:val="clear" w:color="auto" w:fill="FFFFFF"/>
+        <w:spacing w:lineRule="auto" w:line="240" w:before="0" w:after="100"/>
+        <w:jc w:val="both"/>
+        <w:rPr>
+          <w:rFonts w:ascii="Comfortaa Light" w:hAnsi="Comfortaa Light" w:eastAsia="Times New Roman" w:cs="Arial"/>
+          <w:color w:val="000000" w:themeColor="text1"/>
+          <w:sz w:val="24"/>
+          <w:szCs w:val="24"/>
+          <w:lang w:val="es-MX" w:eastAsia="es-MX"/>
+        </w:rPr>
+      </w:pPr>
+      <w:r>
+        <w:rPr>
+          <w:rFonts w:eastAsia="Times New Roman" w:cs="Arial" w:ascii="Comfortaa Light" w:hAnsi="Comfortaa Light"/>
+          <w:color w:val="000000" w:themeColor="text1"/>
+          <w:sz w:val="24"/>
+          <w:szCs w:val="24"/>
+          <w:lang w:val="es-MX" w:eastAsia="es-MX"/>
+        </w:rPr>
+      </w:r>
+    </w:p>
+    <w:p>
+      <w:pPr>
+        <w:pStyle w:val="Normal"/>
+        <w:shd w:val="clear" w:color="auto" w:fill="FFFFFF"/>
+        <w:spacing w:lineRule="auto" w:line="240" w:before="0" w:after="100"/>
+        <w:jc w:val="both"/>
+        <w:rPr>
+          <w:rFonts w:ascii="Comfortaa Light" w:hAnsi="Comfortaa Light" w:eastAsia="Times New Roman" w:cs="Arial"/>
+          <w:color w:val="000000" w:themeColor="text1"/>
+          <w:sz w:val="24"/>
+          <w:szCs w:val="24"/>
+          <w:lang w:val="es-MX" w:eastAsia="es-MX"/>
+        </w:rPr>
+      </w:pPr>
+      <w:r>
+        <w:rPr>
+          <w:rFonts w:eastAsia="Times New Roman" w:cs="Arial" w:ascii="Comfortaa Light" w:hAnsi="Comfortaa Light"/>
+          <w:color w:val="000000" w:themeColor="text1"/>
+          <w:sz w:val="24"/>
+          <w:szCs w:val="24"/>
+          <w:lang w:val="es-MX" w:eastAsia="es-MX"/>
+        </w:rPr>
+      </w:r>
+    </w:p>
+    <w:p>
+      <w:pPr>
+        <w:pStyle w:val="Normal"/>
+        <w:shd w:val="clear" w:color="auto" w:fill="FFFFFF"/>
+        <w:spacing w:lineRule="auto" w:line="240" w:before="0" w:after="100"/>
+        <w:jc w:val="both"/>
+        <w:rPr>
+          <w:rFonts w:ascii="Comfortaa Light" w:hAnsi="Comfortaa Light" w:eastAsia="Times New Roman" w:cs="Arial"/>
+          <w:color w:val="000000" w:themeColor="text1"/>
+          <w:sz w:val="24"/>
+          <w:szCs w:val="24"/>
+          <w:lang w:val="es-MX" w:eastAsia="es-MX"/>
+        </w:rPr>
+      </w:pPr>
+      <w:r>
+        <w:rPr>
+          <w:rFonts w:eastAsia="Times New Roman" w:cs="Arial" w:ascii="Comfortaa Light" w:hAnsi="Comfortaa Light"/>
+          <w:color w:val="000000" w:themeColor="text1"/>
+          <w:sz w:val="24"/>
+          <w:szCs w:val="24"/>
+          <w:lang w:val="es-MX" w:eastAsia="es-MX"/>
+        </w:rPr>
+      </w:r>
+    </w:p>
+    <w:p>
+      <w:pPr>
+        <w:pStyle w:val="Normal"/>
+        <w:shd w:val="clear" w:color="auto" w:fill="FFFFFF"/>
+        <w:spacing w:lineRule="auto" w:line="240" w:before="0" w:after="100"/>
+        <w:jc w:val="both"/>
+        <w:rPr>
+          <w:rFonts w:ascii="Comfortaa Light" w:hAnsi="Comfortaa Light" w:eastAsia="Times New Roman" w:cs="Arial"/>
+          <w:color w:val="000000" w:themeColor="text1"/>
+          <w:sz w:val="24"/>
+          <w:szCs w:val="24"/>
+          <w:lang w:val="es-MX" w:eastAsia="es-MX"/>
+        </w:rPr>
+      </w:pPr>
+      <w:r>
+        <w:rPr>
+          <w:rFonts w:eastAsia="Times New Roman" w:cs="Arial" w:ascii="Comfortaa Light" w:hAnsi="Comfortaa Light"/>
+          <w:color w:val="000000" w:themeColor="text1"/>
+          <w:sz w:val="24"/>
+          <w:szCs w:val="24"/>
+          <w:lang w:val="es-MX" w:eastAsia="es-MX"/>
+        </w:rPr>
       </w:r>
     </w:p>
     <w:tbl>
       <w:tblPr>
-        <w:tblStyle w:val="Tablaconcuadrcula"/>
+        <w:tblStyle w:val="TableGrid"/>
         <w:tblW w:w="9350" w:type="dxa"/>
         <w:jc w:val="left"/>
         <w:tblInd w:w="0" w:type="dxa"/>
+        <w:tblLayout w:type="fixed"/>
         <w:tblCellMar>
           <w:top w:w="0" w:type="dxa"/>
           <w:left w:w="108" w:type="dxa"/>
           <w:bottom w:w="0" w:type="dxa"/>
           <w:right w:w="108" w:type="dxa"/>
         </w:tblCellMar>
-        <w:tblLook w:lastRow="0" w:firstRow="1" w:lastColumn="0" w:firstColumn="1" w:val="04a0" w:noHBand="0" w:noVBand="1"/>
+        <w:tblLook w:val="04a0" w:noHBand="0" w:noVBand="1" w:firstColumn="1" w:lastRow="0" w:lastColumn="0" w:firstRow="1"/>
       </w:tblPr>
       <w:tblGrid>
         <w:gridCol w:w="4675"/>
@@ -8355,12 +8768,15 @@
           <w:tcPr>
             <w:tcW w:w="4675" w:type="dxa"/>
             <w:tcBorders/>
-            <w:shd w:fill="auto" w:val="clear"/>
+            <w:shd w:color="auto" w:fill="auto" w:val="clear"/>
           </w:tcPr>
           <w:p>
             <w:pPr>
               <w:pStyle w:val="NoSpacing"/>
+              <w:widowControl w:val="false"/>
+              <w:suppressAutoHyphens w:val="true"/>
               <w:spacing w:before="0" w:after="0"/>
+              <w:jc w:val="left"/>
               <w:rPr>
                 <w:rFonts w:cs="Times New Roman"/>
                 <w:sz w:val="27"/>
@@ -8380,7 +8796,10 @@
           <w:p>
             <w:pPr>
               <w:pStyle w:val="NoSpacing"/>
+              <w:widowControl w:val="false"/>
+              <w:suppressAutoHyphens w:val="true"/>
               <w:spacing w:before="0" w:after="0"/>
+              <w:jc w:val="left"/>
               <w:rPr>
                 <w:rFonts w:cs="Times New Roman"/>
                 <w:sz w:val="27"/>
@@ -8400,7 +8819,10 @@
           <w:p>
             <w:pPr>
               <w:pStyle w:val="NoSpacing"/>
+              <w:widowControl w:val="false"/>
+              <w:suppressAutoHyphens w:val="true"/>
               <w:spacing w:before="0" w:after="0"/>
+              <w:jc w:val="left"/>
               <w:rPr>
                 <w:rFonts w:ascii="Comfortaa Light" w:hAnsi="Comfortaa Light"/>
                 <w:sz w:val="20"/>
@@ -8410,28 +8832,58 @@
             </w:pPr>
             <w:r>
               <w:rPr>
-                <w:rFonts w:cs="Times New Roman"/>
+                <w:rFonts w:eastAsia="Calibri" w:cs="Times New Roman"/>
+                <w:kern w:val="0"/>
                 <w:sz w:val="27"/>
                 <w:szCs w:val="27"/>
-                <w:lang w:val="es-MX" w:eastAsia="es-MX"/>
+                <w:lang w:val="es-MX" w:eastAsia="es-MX" w:bidi="ar-SA"/>
               </w:rPr>
               <w:t>Vendedor</w:t>
               <w:br/>
             </w:r>
             <w:r>
+              <w:rPr>
+                <w:rFonts w:eastAsia="Calibri" w:cs="" w:ascii="Comfortaa Light" w:hAnsi="Comfortaa Light"/>
+                <w:kern w:val="0"/>
+                <w:sz w:val="20"/>
+                <w:szCs w:val="20"/>
+                <w:lang w:val="es-MX" w:eastAsia="es-MX" w:bidi="ar-SA"/>
+              </w:rPr>
+              <w:t>Representante legal: David Marin </w:t>
+            </w:r>
+          </w:p>
+          <w:p>
+            <w:pPr>
+              <w:pStyle w:val="NoSpacing"/>
+              <w:widowControl w:val="false"/>
+              <w:suppressAutoHyphens w:val="true"/>
+              <w:spacing w:before="0" w:after="0"/>
+              <w:jc w:val="left"/>
               <w:rPr>
                 <w:rFonts w:ascii="Comfortaa Light" w:hAnsi="Comfortaa Light"/>
                 <w:sz w:val="20"/>
                 <w:szCs w:val="20"/>
                 <w:lang w:val="es-MX" w:eastAsia="es-MX"/>
               </w:rPr>
-              <w:t>Representante legal: David Marin </w:t>
+            </w:pPr>
+            <w:r>
+              <w:rPr>
+                <w:rFonts w:eastAsia="Calibri" w:cs="" w:ascii="Comfortaa Light" w:hAnsi="Comfortaa Light"/>
+                <w:kern w:val="0"/>
+                <w:sz w:val="20"/>
+                <w:szCs w:val="20"/>
+                <w:lang w:val="es-MX" w:eastAsia="es-MX" w:bidi="ar-SA"/>
+              </w:rPr>
+              <w:t>Treeconomy, INC.</w:t>
             </w:r>
           </w:p>
           <w:p>
             <w:pPr>
               <w:pStyle w:val="NoSpacing"/>
+              <w:widowControl w:val="false"/>
+              <w:suppressAutoHyphens w:val="true"/>
               <w:spacing w:before="0" w:after="0"/>
+              <w:jc w:val="left"/>
               <w:rPr>
                 <w:rFonts w:ascii="Comfortaa Light" w:hAnsi="Comfortaa Light"/>
                 <w:sz w:val="20"/>
@@ -8441,64 +8893,49 @@
             </w:pPr>
             <w:r>
               <w:rPr>
+                <w:rFonts w:eastAsia="Calibri" w:cs="" w:ascii="Comfortaa Light" w:hAnsi="Comfortaa Light"/>
+                <w:kern w:val="0"/>
+                <w:sz w:val="20"/>
+                <w:szCs w:val="20"/>
+                <w:lang w:val="es-MX" w:eastAsia="es-MX" w:bidi="ar-SA"/>
+              </w:rPr>
+              <w:t>Para contactarnos: </w:t>
+            </w:r>
+          </w:p>
+          <w:p>
+            <w:pPr>
+              <w:pStyle w:val="NoSpacing"/>
+              <w:widowControl w:val="false"/>
+              <w:suppressAutoHyphens w:val="true"/>
+              <w:spacing w:before="0" w:after="0"/>
+              <w:jc w:val="left"/>
+              <w:rPr>
                 <w:rFonts w:ascii="Comfortaa Light" w:hAnsi="Comfortaa Light"/>
                 <w:sz w:val="20"/>
                 <w:szCs w:val="20"/>
                 <w:lang w:val="es-MX" w:eastAsia="es-MX"/>
               </w:rPr>
-              <w:t>Treeconomy, INC.</w:t>
-            </w:r>
-          </w:p>
-          <w:p>
-            <w:pPr>
-              <w:pStyle w:val="NoSpacing"/>
-              <w:spacing w:before="0" w:after="0"/>
-              <w:rPr>
-                <w:rFonts w:ascii="Comfortaa Light" w:hAnsi="Comfortaa Light"/>
+            </w:pPr>
+            <w:r>
+              <w:rPr>
+                <w:rFonts w:eastAsia="Calibri" w:cs="" w:ascii="Comfortaa Light" w:hAnsi="Comfortaa Light"/>
+                <w:kern w:val="0"/>
                 <w:sz w:val="20"/>
                 <w:szCs w:val="20"/>
-                <w:lang w:val="es-MX" w:eastAsia="es-MX"/>
-              </w:rPr>
-            </w:pPr>
-            <w:r>
-              <w:rPr>
-                <w:rFonts w:ascii="Comfortaa Light" w:hAnsi="Comfortaa Light"/>
-                <w:sz w:val="20"/>
-                <w:szCs w:val="20"/>
-                <w:lang w:val="es-MX" w:eastAsia="es-MX"/>
-              </w:rPr>
-              <w:t>Para contactarnos: </w:t>
-            </w:r>
-          </w:p>
-          <w:p>
-            <w:pPr>
-              <w:pStyle w:val="NoSpacing"/>
-              <w:spacing w:before="0" w:after="0"/>
-              <w:rPr>
-                <w:rFonts w:ascii="Comfortaa Light" w:hAnsi="Comfortaa Light"/>
-                <w:sz w:val="20"/>
-                <w:szCs w:val="20"/>
-                <w:lang w:val="es-MX" w:eastAsia="es-MX"/>
-              </w:rPr>
-            </w:pPr>
-            <w:r>
-              <w:rPr>
-                <w:rFonts w:ascii="Comfortaa Light" w:hAnsi="Comfortaa Light"/>
-                <w:sz w:val="20"/>
-                <w:szCs w:val="20"/>
-                <w:lang w:val="es-MX" w:eastAsia="es-MX"/>
+                <w:lang w:val="es-MX" w:eastAsia="es-MX" w:bidi="ar-SA"/>
               </w:rPr>
               <w:t xml:space="preserve">Correo electrónico: </w:t>
             </w:r>
-            <w:hyperlink r:id="rId5">
+            <w:hyperlink r:id="rId20">
               <w:r>
                 <w:rPr>
                   <w:rStyle w:val="EnlacedeInternet"/>
                   <w:rFonts w:eastAsia="Times New Roman" w:cs="Arial" w:ascii="Comfortaa Light" w:hAnsi="Comfortaa Light"/>
                   <w:color w:val="000000" w:themeColor="text1"/>
+                  <w:kern w:val="0"/>
                   <w:sz w:val="20"/>
                   <w:szCs w:val="20"/>
-                  <w:lang w:val="es-MX" w:eastAsia="es-MX"/>
+                  <w:lang w:val="es-MX" w:eastAsia="es-MX" w:bidi="ar-SA"/>
                 </w:rPr>
                 <w:t>invest@Treeconomy.com.co</w:t>
               </w:r>
@@ -8507,7 +8944,10 @@
           <w:p>
             <w:pPr>
               <w:pStyle w:val="NoSpacing"/>
+              <w:widowControl w:val="false"/>
+              <w:suppressAutoHyphens w:val="true"/>
               <w:spacing w:before="0" w:after="0"/>
+              <w:jc w:val="left"/>
               <w:rPr>
                 <w:rFonts w:ascii="Comfortaa Light" w:hAnsi="Comfortaa Light"/>
                 <w:sz w:val="20"/>
@@ -8517,10 +8957,11 @@
             </w:pPr>
             <w:r>
               <w:rPr>
-                <w:rFonts w:ascii="Comfortaa Light" w:hAnsi="Comfortaa Light"/>
+                <w:rFonts w:eastAsia="Calibri" w:cs="" w:ascii="Comfortaa Light" w:hAnsi="Comfortaa Light"/>
+                <w:kern w:val="0"/>
                 <w:sz w:val="20"/>
                 <w:szCs w:val="20"/>
-                <w:lang w:val="es-MX" w:eastAsia="es-MX"/>
+                <w:lang w:val="es-MX" w:eastAsia="es-MX" w:bidi="ar-SA"/>
               </w:rPr>
               <w:t>Número de teléfono: +1 (202) 766 6468</w:t>
             </w:r>
@@ -8528,7 +8969,10 @@
           <w:p>
             <w:pPr>
               <w:pStyle w:val="NoSpacing"/>
+              <w:widowControl w:val="false"/>
+              <w:suppressAutoHyphens w:val="true"/>
               <w:spacing w:before="0" w:after="0"/>
+              <w:jc w:val="left"/>
               <w:rPr>
                 <w:rFonts w:ascii="Comfortaa Light" w:hAnsi="Comfortaa Light"/>
                 <w:sz w:val="20"/>
@@ -8538,16 +8982,16 @@
                 <w:lang w:val="es-MX" w:eastAsia="es-MX"/>
               </w:rPr>
             </w:pPr>
-            <w:hyperlink r:id="rId6">
+            <w:hyperlink r:id="rId21">
               <w:r>
                 <w:rPr>
-                  <w:rStyle w:val="ListLabel35"/>
-                  <w:rFonts w:ascii="Comfortaa Light" w:hAnsi="Comfortaa Light"/>
+                  <w:rFonts w:eastAsia="Calibri" w:cs="" w:ascii="Comfortaa Light" w:hAnsi="Comfortaa Light"/>
+                  <w:kern w:val="0"/>
                   <w:sz w:val="20"/>
                   <w:szCs w:val="20"/>
                   <w:u w:val="single"/>
                   <w:shd w:fill="FFFFFF" w:val="clear"/>
-                  <w:lang w:val="es-MX" w:eastAsia="es-MX"/>
+                  <w:lang w:val="es-MX" w:eastAsia="es-MX" w:bidi="ar-SA"/>
                 </w:rPr>
                 <w:t>www.treeconomy.com.co</w:t>
               </w:r>
@@ -8556,6 +9000,8 @@
           <w:p>
             <w:pPr>
               <w:pStyle w:val="Normal"/>
+              <w:widowControl w:val="false"/>
+              <w:suppressAutoHyphens w:val="true"/>
               <w:spacing w:lineRule="atLeast" w:line="238" w:before="0" w:after="0"/>
               <w:jc w:val="both"/>
               <w:rPr>
@@ -8577,12 +9023,15 @@
           <w:tcPr>
             <w:tcW w:w="4674" w:type="dxa"/>
             <w:tcBorders/>
-            <w:shd w:fill="auto" w:val="clear"/>
+            <w:shd w:color="auto" w:fill="auto" w:val="clear"/>
           </w:tcPr>
           <w:p>
             <w:pPr>
               <w:pStyle w:val="NoSpacing"/>
+              <w:widowControl w:val="false"/>
+              <w:suppressAutoHyphens w:val="true"/>
               <w:spacing w:before="0" w:after="0"/>
+              <w:jc w:val="left"/>
               <w:rPr>
                 <w:rFonts w:cs="Times New Roman"/>
                 <w:sz w:val="27"/>
@@ -8602,7 +9051,10 @@
           <w:p>
             <w:pPr>
               <w:pStyle w:val="NoSpacing"/>
+              <w:widowControl w:val="false"/>
+              <w:suppressAutoHyphens w:val="true"/>
               <w:spacing w:before="0" w:after="0"/>
+              <w:jc w:val="left"/>
               <w:rPr>
                 <w:rFonts w:cs="Times New Roman"/>
                 <w:sz w:val="27"/>
@@ -8622,7 +9074,10 @@
           <w:p>
             <w:pPr>
               <w:pStyle w:val="NoSpacing"/>
+              <w:widowControl w:val="false"/>
+              <w:suppressAutoHyphens w:val="true"/>
               <w:spacing w:before="0" w:after="0"/>
+              <w:jc w:val="left"/>
               <w:rPr>
                 <w:rFonts w:ascii="Comfortaa Light" w:hAnsi="Comfortaa Light"/>
                 <w:sz w:val="20"/>
@@ -8634,10 +9089,11 @@
             </w:pPr>
             <w:r>
               <w:rPr>
-                <w:rFonts w:cs="Times New Roman"/>
+                <w:rFonts w:eastAsia="Calibri" w:cs="Times New Roman"/>
+                <w:kern w:val="0"/>
                 <w:sz w:val="27"/>
                 <w:szCs w:val="27"/>
-                <w:lang w:val="es-MX" w:eastAsia="es-MX"/>
+                <w:lang w:val="es-MX" w:eastAsia="es-MX" w:bidi="ar-SA"/>
               </w:rPr>
               <w:t>Comprador</w:t>
             </w:r>
@@ -8645,74 +9101,65 @@
           <w:p>
             <w:pPr>
               <w:pStyle w:val="NoSpacing"/>
+              <w:widowControl w:val="false"/>
+              <w:suppressAutoHyphens w:val="true"/>
               <w:spacing w:before="0" w:after="0"/>
-              <w:rPr/>
+              <w:jc w:val="left"/>
+              <w:rPr>
+                <w:lang w:val="es-CO"/>
+              </w:rPr>
             </w:pPr>
             <w:r>
               <w:rPr>
-                <w:rFonts w:ascii="Comfortaa Light" w:hAnsi="Comfortaa Light"/>
+                <w:rFonts w:eastAsia="Calibri" w:cs="" w:ascii="Comfortaa Light" w:hAnsi="Comfortaa Light"/>
+                <w:kern w:val="0"/>
                 <w:sz w:val="20"/>
                 <w:szCs w:val="20"/>
-                <w:lang w:val="es-MX" w:eastAsia="es-MX"/>
-              </w:rPr>
-              <w:t xml:space="preserve">Nombre: </w:t>
-            </w:r>
-            <w:r>
-              <w:rPr>
-                <w:rFonts w:ascii="Comfortaa Light" w:hAnsi="Comfortaa Light"/>
-                <w:sz w:val="20"/>
-                <w:szCs w:val="20"/>
-                <w:lang w:val="es-MX" w:eastAsia="es-MX"/>
-              </w:rPr>
-              <w:t>{{comprador_nombre}}</w:t>
+                <w:lang w:val="es-MX" w:eastAsia="es-MX" w:bidi="ar-SA"/>
+              </w:rPr>
+              <w:t>Nombre: {{comprador_nombre}}</w:t>
             </w:r>
           </w:p>
           <w:p>
             <w:pPr>
               <w:pStyle w:val="NoSpacing"/>
+              <w:widowControl w:val="false"/>
+              <w:suppressAutoHyphens w:val="true"/>
               <w:spacing w:before="0" w:after="0"/>
-              <w:rPr/>
+              <w:jc w:val="left"/>
+              <w:rPr>
+                <w:lang w:val="es-CO"/>
+              </w:rPr>
             </w:pPr>
             <w:r>
               <w:rPr>
-                <w:rFonts w:ascii="Comfortaa Light" w:hAnsi="Comfortaa Light"/>
+                <w:rFonts w:eastAsia="Calibri" w:cs="" w:ascii="Comfortaa Light" w:hAnsi="Comfortaa Light"/>
+                <w:kern w:val="0"/>
                 <w:sz w:val="20"/>
                 <w:szCs w:val="20"/>
-                <w:lang w:val="es-MX" w:eastAsia="es-MX"/>
-              </w:rPr>
-              <w:t>Documento de identidad</w:t>
-            </w:r>
-            <w:r>
-              <w:rPr>
-                <w:rFonts w:ascii="Comfortaa Light" w:hAnsi="Comfortaa Light"/>
-                <w:sz w:val="20"/>
-                <w:szCs w:val="20"/>
-                <w:lang w:val="es-MX" w:eastAsia="es-MX"/>
-              </w:rPr>
-              <w:t xml:space="preserve">: </w:t>
-            </w:r>
-            <w:r>
-              <w:rPr>
-                <w:rFonts w:ascii="Comfortaa Light" w:hAnsi="Comfortaa Light"/>
-                <w:sz w:val="20"/>
-                <w:szCs w:val="20"/>
-                <w:lang w:val="es-MX" w:eastAsia="es-MX"/>
-              </w:rPr>
-              <w:t>{{comprador_id}}</w:t>
+                <w:lang w:val="es-MX" w:eastAsia="es-MX" w:bidi="ar-SA"/>
+              </w:rPr>
+              <w:t>Documento de identidad: {{comprador_id}}</w:t>
             </w:r>
           </w:p>
           <w:p>
             <w:pPr>
               <w:pStyle w:val="NoSpacing"/>
+              <w:widowControl w:val="false"/>
+              <w:suppressAutoHyphens w:val="true"/>
               <w:spacing w:before="0" w:after="0"/>
-              <w:rPr/>
+              <w:jc w:val="left"/>
+              <w:rPr>
+                <w:lang w:val="es-CO"/>
+              </w:rPr>
             </w:pPr>
             <w:r>
               <w:rPr>
-                <w:rFonts w:ascii="Comfortaa Light" w:hAnsi="Comfortaa Light"/>
+                <w:rFonts w:eastAsia="Calibri" w:cs="" w:ascii="Comfortaa Light" w:hAnsi="Comfortaa Light"/>
+                <w:kern w:val="0"/>
                 <w:sz w:val="20"/>
                 <w:szCs w:val="20"/>
-                <w:lang w:val="es-MX" w:eastAsia="es-MX"/>
+                <w:lang w:val="es-MX" w:eastAsia="es-MX" w:bidi="ar-SA"/>
               </w:rPr>
               <w:t xml:space="preserve">Correo electrónico y Usuario: </w:t>
             </w:r>
@@ -8721,9 +9168,10 @@
                 <w:rStyle w:val="EnlacedeInternet"/>
                 <w:rFonts w:eastAsia="Times New Roman" w:cs="Arial" w:ascii="Comfortaa Light" w:hAnsi="Comfortaa Light"/>
                 <w:color w:val="000000" w:themeColor="text1"/>
+                <w:kern w:val="0"/>
                 <w:sz w:val="20"/>
                 <w:szCs w:val="20"/>
-                <w:lang w:val="es-MX" w:eastAsia="es-MX"/>
+                <w:lang w:val="es-MX" w:eastAsia="es-MX" w:bidi="ar-SA"/>
               </w:rPr>
               <w:t>{{comprador_email}}</w:t>
             </w:r>
@@ -8731,31 +9179,30 @@
           <w:p>
             <w:pPr>
               <w:pStyle w:val="NoSpacing"/>
+              <w:widowControl w:val="false"/>
+              <w:suppressAutoHyphens w:val="true"/>
               <w:spacing w:before="0" w:after="0"/>
-              <w:rPr/>
+              <w:jc w:val="left"/>
+              <w:rPr>
+                <w:lang w:val="es-CO"/>
+              </w:rPr>
             </w:pPr>
             <w:r>
               <w:rPr>
-                <w:rFonts w:ascii="Comfortaa Light" w:hAnsi="Comfortaa Light"/>
+                <w:rFonts w:eastAsia="Calibri" w:cs="" w:ascii="Comfortaa Light" w:hAnsi="Comfortaa Light"/>
+                <w:kern w:val="0"/>
                 <w:sz w:val="20"/>
                 <w:szCs w:val="20"/>
-                <w:lang w:val="es-MX" w:eastAsia="es-MX"/>
-              </w:rPr>
-              <w:t xml:space="preserve">Número de teléfono: </w:t>
-            </w:r>
-            <w:r>
-              <w:rPr>
-                <w:rFonts w:ascii="Comfortaa Light" w:hAnsi="Comfortaa Light"/>
-                <w:sz w:val="20"/>
-                <w:szCs w:val="20"/>
-                <w:lang w:val="es-MX" w:eastAsia="es-MX"/>
-              </w:rPr>
-              <w:t>{{comprador_telefono}}</w:t>
+                <w:lang w:val="es-MX" w:eastAsia="es-MX" w:bidi="ar-SA"/>
+              </w:rPr>
+              <w:t>Número de teléfono: {{comprador_telefono}}</w:t>
             </w:r>
           </w:p>
           <w:p>
             <w:pPr>
               <w:pStyle w:val="Normal"/>
+              <w:widowControl w:val="false"/>
+              <w:suppressAutoHyphens w:val="true"/>
               <w:spacing w:lineRule="atLeast" w:line="238" w:before="0" w:after="0"/>
               <w:jc w:val="both"/>
               <w:rPr>
@@ -8792,8 +9239,8 @@
           <w:rFonts w:ascii="Comfortaa Light" w:hAnsi="Comfortaa Light"/>
           <w:sz w:val="20"/>
           <w:szCs w:val="20"/>
+          <w:highlight w:val="white"/>
           <w:u w:val="single"/>
-          <w:shd w:fill="FFFFFF" w:val="clear"/>
           <w:lang w:val="es-MX" w:eastAsia="es-MX"/>
         </w:rPr>
       </w:r>
@@ -8803,29 +9250,33 @@
         <w:pStyle w:val="Normal"/>
         <w:spacing w:before="0" w:after="160"/>
         <w:jc w:val="both"/>
+        <w:rPr>
+          <w:lang w:val="es-CO"/>
+        </w:rPr>
+      </w:pPr>
+      <w:r>
         <w:rPr/>
-      </w:pPr>
-      <w:r>
-        <w:rPr/>
       </w:r>
     </w:p>
     <w:sectPr>
-      <w:headerReference w:type="default" r:id="rId7"/>
-      <w:footerReference w:type="default" r:id="rId8"/>
+      <w:headerReference w:type="even" r:id="rId22"/>
+      <w:headerReference w:type="default" r:id="rId23"/>
+      <w:headerReference w:type="first" r:id="rId24"/>
+      <w:footerReference w:type="default" r:id="rId25"/>
       <w:type w:val="nextPage"/>
       <w:pgSz w:w="12240" w:h="15840"/>
-      <w:pgMar w:left="1440" w:right="1440" w:header="720" w:top="1440" w:footer="720" w:bottom="1440" w:gutter="0"/>
+      <w:pgMar w:left="1440" w:right="1440" w:gutter="0" w:header="720" w:top="1440" w:footer="720" w:bottom="1440"/>
       <w:pgNumType w:fmt="decimal"/>
       <w:formProt w:val="false"/>
       <w:textDirection w:val="lrTb"/>
-      <w:docGrid w:type="default" w:linePitch="360" w:charSpace="4096"/>
+      <w:docGrid w:type="default" w:linePitch="360" w:charSpace="8192"/>
     </w:sectPr>
   </w:body>
 </w:document>
 </file>
 
 <file path=word/footer1.xml><?xml version="1.0" encoding="utf-8"?>
-<w:ftr xmlns:o="urn:schemas-microsoft-com:office:office" xmlns:r="http://schemas.openxmlformats.org/officeDocument/2006/relationships" xmlns:v="urn:schemas-microsoft-com:vml" xmlns:w="http://schemas.openxmlformats.org/wordprocessingml/2006/main" xmlns:w10="urn:schemas-microsoft-com:office:word" xmlns:wp="http://schemas.openxmlformats.org/drawingml/2006/wordprocessingDrawing" xmlns:wps="http://schemas.microsoft.com/office/word/2010/wordprocessingShape" xmlns:wpg="http://schemas.microsoft.com/office/word/2010/wordprocessingGroup" xmlns:mc="http://schemas.openxmlformats.org/markup-compatibility/2006" xmlns:wp14="http://schemas.microsoft.com/office/word/2010/wordprocessingDrawing" xmlns:w14="http://schemas.microsoft.com/office/word/2010/wordml" mc:Ignorable="w14 wp14">
+<w:ftr xmlns:o="urn:schemas-microsoft-com:office:office" xmlns:r="http://schemas.openxmlformats.org/officeDocument/2006/relationships" xmlns:v="urn:schemas-microsoft-com:vml" xmlns:w="http://schemas.openxmlformats.org/wordprocessingml/2006/main" xmlns:w10="urn:schemas-microsoft-com:office:word" xmlns:wp="http://schemas.openxmlformats.org/drawingml/2006/wordprocessingDrawing" xmlns:wps="http://schemas.microsoft.com/office/word/2010/wordprocessingShape" xmlns:wpg="http://schemas.microsoft.com/office/word/2010/wordprocessingGroup" xmlns:mc="http://schemas.openxmlformats.org/markup-compatibility/2006" xmlns:wp14="http://schemas.microsoft.com/office/word/2010/wordprocessingDrawing" xmlns:w14="http://schemas.microsoft.com/office/word/2010/wordml" xmlns:w15="http://schemas.microsoft.com/office/word/2012/wordml" mc:Ignorable="w14 wp14 w15">
   <w:p>
     <w:pPr>
       <w:pStyle w:val="Piedepgina"/>
@@ -8838,76 +9289,532 @@
 </w:ftr>
 </file>
 
+<file path=word/footer2.xml><?xml version="1.0" encoding="utf-8"?>
+<w:ftr xmlns:o="urn:schemas-microsoft-com:office:office" xmlns:r="http://schemas.openxmlformats.org/officeDocument/2006/relationships" xmlns:v="urn:schemas-microsoft-com:vml" xmlns:w="http://schemas.openxmlformats.org/wordprocessingml/2006/main" xmlns:w10="urn:schemas-microsoft-com:office:word" xmlns:wp="http://schemas.openxmlformats.org/drawingml/2006/wordprocessingDrawing" xmlns:wps="http://schemas.microsoft.com/office/word/2010/wordprocessingShape" xmlns:wpg="http://schemas.microsoft.com/office/word/2010/wordprocessingGroup" xmlns:mc="http://schemas.openxmlformats.org/markup-compatibility/2006" xmlns:wp14="http://schemas.microsoft.com/office/word/2010/wordprocessingDrawing" xmlns:w14="http://schemas.microsoft.com/office/word/2010/wordml" xmlns:w15="http://schemas.microsoft.com/office/word/2012/wordml" mc:Ignorable="w14 wp14 w15">
+  <w:p>
+    <w:pPr>
+      <w:pStyle w:val="Piedepgina"/>
+      <w:rPr/>
+    </w:pPr>
+    <w:r>
+      <w:rPr/>
+    </w:r>
+  </w:p>
+</w:ftr>
+</file>
+
+<file path=word/footer3.xml><?xml version="1.0" encoding="utf-8"?>
+<w:ftr xmlns:o="urn:schemas-microsoft-com:office:office" xmlns:r="http://schemas.openxmlformats.org/officeDocument/2006/relationships" xmlns:v="urn:schemas-microsoft-com:vml" xmlns:w="http://schemas.openxmlformats.org/wordprocessingml/2006/main" xmlns:w10="urn:schemas-microsoft-com:office:word" xmlns:wp="http://schemas.openxmlformats.org/drawingml/2006/wordprocessingDrawing" xmlns:wps="http://schemas.microsoft.com/office/word/2010/wordprocessingShape" xmlns:wpg="http://schemas.microsoft.com/office/word/2010/wordprocessingGroup" xmlns:mc="http://schemas.openxmlformats.org/markup-compatibility/2006" xmlns:wp14="http://schemas.microsoft.com/office/word/2010/wordprocessingDrawing" xmlns:w14="http://schemas.microsoft.com/office/word/2010/wordml" xmlns:w15="http://schemas.microsoft.com/office/word/2012/wordml" mc:Ignorable="w14 wp14 w15">
+  <w:p>
+    <w:pPr>
+      <w:pStyle w:val="Piedepgina"/>
+      <w:rPr/>
+    </w:pPr>
+    <w:r>
+      <w:rPr/>
+    </w:r>
+  </w:p>
+</w:ftr>
+</file>
+
+<file path=word/footer4.xml><?xml version="1.0" encoding="utf-8"?>
+<w:ftr xmlns:o="urn:schemas-microsoft-com:office:office" xmlns:r="http://schemas.openxmlformats.org/officeDocument/2006/relationships" xmlns:v="urn:schemas-microsoft-com:vml" xmlns:w="http://schemas.openxmlformats.org/wordprocessingml/2006/main" xmlns:w10="urn:schemas-microsoft-com:office:word" xmlns:wp="http://schemas.openxmlformats.org/drawingml/2006/wordprocessingDrawing" xmlns:wps="http://schemas.microsoft.com/office/word/2010/wordprocessingShape" xmlns:wpg="http://schemas.microsoft.com/office/word/2010/wordprocessingGroup" xmlns:mc="http://schemas.openxmlformats.org/markup-compatibility/2006" xmlns:wp14="http://schemas.microsoft.com/office/word/2010/wordprocessingDrawing" xmlns:w14="http://schemas.microsoft.com/office/word/2010/wordml" xmlns:w15="http://schemas.microsoft.com/office/word/2012/wordml" mc:Ignorable="w14 wp14 w15">
+  <w:p>
+    <w:pPr>
+      <w:pStyle w:val="Piedepgina"/>
+      <w:rPr/>
+    </w:pPr>
+    <w:r>
+      <w:rPr/>
+    </w:r>
+  </w:p>
+</w:ftr>
+</file>
+
+<file path=word/footer5.xml><?xml version="1.0" encoding="utf-8"?>
+<w:ftr xmlns:o="urn:schemas-microsoft-com:office:office" xmlns:r="http://schemas.openxmlformats.org/officeDocument/2006/relationships" xmlns:v="urn:schemas-microsoft-com:vml" xmlns:w="http://schemas.openxmlformats.org/wordprocessingml/2006/main" xmlns:w10="urn:schemas-microsoft-com:office:word" xmlns:wp="http://schemas.openxmlformats.org/drawingml/2006/wordprocessingDrawing" xmlns:wps="http://schemas.microsoft.com/office/word/2010/wordprocessingShape" xmlns:wpg="http://schemas.microsoft.com/office/word/2010/wordprocessingGroup" xmlns:mc="http://schemas.openxmlformats.org/markup-compatibility/2006" xmlns:wp14="http://schemas.microsoft.com/office/word/2010/wordprocessingDrawing" xmlns:w14="http://schemas.microsoft.com/office/word/2010/wordml" xmlns:w15="http://schemas.microsoft.com/office/word/2012/wordml" mc:Ignorable="w14 wp14 w15">
+  <w:p>
+    <w:pPr>
+      <w:pStyle w:val="Piedepgina"/>
+      <w:rPr/>
+    </w:pPr>
+    <w:r>
+      <w:rPr/>
+    </w:r>
+  </w:p>
+</w:ftr>
+</file>
+
+<file path=word/footer6.xml><?xml version="1.0" encoding="utf-8"?>
+<w:ftr xmlns:o="urn:schemas-microsoft-com:office:office" xmlns:r="http://schemas.openxmlformats.org/officeDocument/2006/relationships" xmlns:v="urn:schemas-microsoft-com:vml" xmlns:w="http://schemas.openxmlformats.org/wordprocessingml/2006/main" xmlns:w10="urn:schemas-microsoft-com:office:word" xmlns:wp="http://schemas.openxmlformats.org/drawingml/2006/wordprocessingDrawing" xmlns:wps="http://schemas.microsoft.com/office/word/2010/wordprocessingShape" xmlns:wpg="http://schemas.microsoft.com/office/word/2010/wordprocessingGroup" xmlns:mc="http://schemas.openxmlformats.org/markup-compatibility/2006" xmlns:wp14="http://schemas.microsoft.com/office/word/2010/wordprocessingDrawing" xmlns:w14="http://schemas.microsoft.com/office/word/2010/wordml" xmlns:w15="http://schemas.microsoft.com/office/word/2012/wordml" mc:Ignorable="w14 wp14 w15">
+  <w:p>
+    <w:pPr>
+      <w:pStyle w:val="Piedepgina"/>
+      <w:rPr/>
+    </w:pPr>
+    <w:r>
+      <w:rPr/>
+    </w:r>
+  </w:p>
+</w:ftr>
+</file>
+
+<file path=word/footer7.xml><?xml version="1.0" encoding="utf-8"?>
+<w:ftr xmlns:o="urn:schemas-microsoft-com:office:office" xmlns:r="http://schemas.openxmlformats.org/officeDocument/2006/relationships" xmlns:v="urn:schemas-microsoft-com:vml" xmlns:w="http://schemas.openxmlformats.org/wordprocessingml/2006/main" xmlns:w10="urn:schemas-microsoft-com:office:word" xmlns:wp="http://schemas.openxmlformats.org/drawingml/2006/wordprocessingDrawing" xmlns:wps="http://schemas.microsoft.com/office/word/2010/wordprocessingShape" xmlns:wpg="http://schemas.microsoft.com/office/word/2010/wordprocessingGroup" xmlns:mc="http://schemas.openxmlformats.org/markup-compatibility/2006" xmlns:wp14="http://schemas.microsoft.com/office/word/2010/wordprocessingDrawing" xmlns:w14="http://schemas.microsoft.com/office/word/2010/wordml" xmlns:w15="http://schemas.microsoft.com/office/word/2012/wordml" mc:Ignorable="w14 wp14 w15">
+  <w:p>
+    <w:pPr>
+      <w:pStyle w:val="Piedepgina"/>
+      <w:rPr/>
+    </w:pPr>
+    <w:r>
+      <w:rPr/>
+      <w:drawing>
+        <wp:anchor behindDoc="1" distT="0" distB="0" distL="0" distR="0" simplePos="0" locked="0" layoutInCell="0" allowOverlap="1" relativeHeight="5">
+          <wp:simplePos x="0" y="0"/>
+          <wp:positionH relativeFrom="margin">
+            <wp:posOffset>209550</wp:posOffset>
+          </wp:positionH>
+          <wp:positionV relativeFrom="margin">
+            <wp:posOffset>4188460</wp:posOffset>
+          </wp:positionV>
+          <wp:extent cx="5941060" cy="3128645"/>
+          <wp:effectExtent l="0" t="0" r="0" b="0"/>
+          <wp:wrapNone/>
+          <wp:docPr id="4" name="WordPictureWatermark23187939" descr=""/>
+          <wp:cNvGraphicFramePr>
+            <a:graphicFrameLocks xmlns:a="http://schemas.openxmlformats.org/drawingml/2006/main" noChangeAspect="1"/>
+          </wp:cNvGraphicFramePr>
+          <a:graphic xmlns:a="http://schemas.openxmlformats.org/drawingml/2006/main">
+            <a:graphicData uri="http://schemas.openxmlformats.org/drawingml/2006/picture">
+              <pic:pic xmlns:pic="http://schemas.openxmlformats.org/drawingml/2006/picture">
+                <pic:nvPicPr>
+                  <pic:cNvPr id="4" name="WordPictureWatermark23187939" descr=""/>
+                  <pic:cNvPicPr>
+                    <a:picLocks noChangeAspect="1" noChangeArrowheads="1"/>
+                  </pic:cNvPicPr>
+                </pic:nvPicPr>
+                <pic:blipFill>
+                  <a:blip r:embed="rId1">
+                    <a:lum bright="70000" contrast="-70000"/>
+                  </a:blip>
+                  <a:stretch>
+                    <a:fillRect/>
+                  </a:stretch>
+                </pic:blipFill>
+                <pic:spPr bwMode="auto">
+                  <a:xfrm>
+                    <a:off x="0" y="0"/>
+                    <a:ext cx="5941060" cy="3128645"/>
+                  </a:xfrm>
+                  <a:prstGeom prst="rect">
+                    <a:avLst/>
+                  </a:prstGeom>
+                </pic:spPr>
+              </pic:pic>
+            </a:graphicData>
+          </a:graphic>
+        </wp:anchor>
+      </w:drawing>
+    </w:r>
+  </w:p>
+</w:ftr>
+</file>
+
 <file path=word/header1.xml><?xml version="1.0" encoding="utf-8"?>
-<w:hdr xmlns:o="urn:schemas-microsoft-com:office:office" xmlns:r="http://schemas.openxmlformats.org/officeDocument/2006/relationships" xmlns:v="urn:schemas-microsoft-com:vml" xmlns:w="http://schemas.openxmlformats.org/wordprocessingml/2006/main" xmlns:w10="urn:schemas-microsoft-com:office:word" xmlns:wp="http://schemas.openxmlformats.org/drawingml/2006/wordprocessingDrawing" xmlns:wps="http://schemas.microsoft.com/office/word/2010/wordprocessingShape" xmlns:wpg="http://schemas.microsoft.com/office/word/2010/wordprocessingGroup" xmlns:mc="http://schemas.openxmlformats.org/markup-compatibility/2006" xmlns:wp14="http://schemas.microsoft.com/office/word/2010/wordprocessingDrawing" xmlns:w14="http://schemas.microsoft.com/office/word/2010/wordml" mc:Ignorable="w14 wp14">
+<w:hdr xmlns:o="urn:schemas-microsoft-com:office:office" xmlns:r="http://schemas.openxmlformats.org/officeDocument/2006/relationships" xmlns:v="urn:schemas-microsoft-com:vml" xmlns:w="http://schemas.openxmlformats.org/wordprocessingml/2006/main" xmlns:w10="urn:schemas-microsoft-com:office:word" xmlns:wp="http://schemas.openxmlformats.org/drawingml/2006/wordprocessingDrawing" xmlns:wps="http://schemas.microsoft.com/office/word/2010/wordprocessingShape" xmlns:wpg="http://schemas.microsoft.com/office/word/2010/wordprocessingGroup" xmlns:mc="http://schemas.openxmlformats.org/markup-compatibility/2006" xmlns:wp14="http://schemas.microsoft.com/office/word/2010/wordprocessingDrawing" xmlns:w14="http://schemas.microsoft.com/office/word/2010/wordml" xmlns:w15="http://schemas.microsoft.com/office/word/2012/wordml" mc:Ignorable="w14 wp14 w15">
   <w:p>
     <w:pPr>
       <w:pStyle w:val="Cabecera"/>
       <w:rPr/>
     </w:pPr>
     <w:r>
-      <mc:AlternateContent>
-        <mc:Choice Requires="wps">
-          <w:drawing>
-            <wp:anchor behindDoc="1" distT="0" distB="0" distL="0" distR="0" simplePos="0" locked="0" layoutInCell="1" allowOverlap="1" relativeHeight="25">
-              <wp:simplePos x="0" y="0"/>
-              <wp:positionH relativeFrom="column">
-                <wp:align>center</wp:align>
-              </wp:positionH>
-              <wp:positionV relativeFrom="margin">
-                <wp:align>center</wp:align>
-              </wp:positionV>
-              <wp:extent cx="5941695" cy="3129280"/>
-              <wp:effectExtent l="0" t="0" r="0" b="0"/>
-              <wp:wrapNone/>
-              <wp:docPr id="2" name="WordPictureWatermark1042537689"/>
-              <a:graphic xmlns:a="http://schemas.openxmlformats.org/drawingml/2006/main">
-                <a:graphicData uri="http://schemas.openxmlformats.org/drawingml/2006/picture">
-                  <pic:pic xmlns:pic="http://schemas.openxmlformats.org/drawingml/2006/picture">
-                    <pic:nvPicPr>
-                      <pic:cNvPr id="1" name="WordPictureWatermark1042537689" descr=""/>
-                      <pic:cNvPicPr/>
-                    </pic:nvPicPr>
-                    <pic:blipFill>
-                      <a:blip r:embed="rId1"/>
-                      <a:stretch/>
-                    </pic:blipFill>
-                    <pic:spPr>
-                      <a:xfrm>
-                        <a:off x="0" y="0"/>
-                        <a:ext cx="5941080" cy="3128760"/>
-                      </a:xfrm>
-                      <a:prstGeom prst="rect">
-                        <a:avLst/>
-                      </a:prstGeom>
-                      <a:ln>
-                        <a:noFill/>
-                      </a:ln>
-                    </pic:spPr>
-                  </pic:pic>
-                </a:graphicData>
-              </a:graphic>
-            </wp:anchor>
-          </w:drawing>
-        </mc:Choice>
-        <mc:Fallback>
-          <w:pict>
-            <v:shape id="WordPictureWatermark1042537689" o:spid="shape_0" stroked="f" style="position:absolute;margin-left:0.1pt;margin-top:200.8pt;width:467.75pt;height:246.3pt;mso-position-horizontal:center;mso-position-vertical:center;mso-position-vertical-relative:margin" type="shapetype_75">
-              <v:imagedata r:id="rId1" o:detectmouseclick="t"/>
-              <w10:wrap type="none"/>
-              <v:stroke color="#3465a4" joinstyle="round" endcap="flat"/>
-            </v:shape>
-          </w:pict>
-        </mc:Fallback>
-      </mc:AlternateContent>
+      <w:rPr/>
+      <w:drawing>
+        <wp:anchor behindDoc="1" distT="0" distB="0" distL="0" distR="0" simplePos="0" locked="0" layoutInCell="1" allowOverlap="1" relativeHeight="0">
+          <wp:simplePos x="0" y="0"/>
+          <wp:positionH relativeFrom="margin">
+            <wp:align>center</wp:align>
+          </wp:positionH>
+          <wp:positionV relativeFrom="margin">
+            <wp:align>center</wp:align>
+          </wp:positionV>
+          <wp:extent cx="5941060" cy="3128645"/>
+          <wp:effectExtent l="0" t="0" r="0" b="0"/>
+          <wp:wrapNone/>
+          <wp:docPr id="1" name="WordPictureWatermark24466157" descr=""/>
+          <wp:cNvGraphicFramePr>
+            <a:graphicFrameLocks xmlns:a="http://schemas.openxmlformats.org/drawingml/2006/main" noChangeAspect="1"/>
+          </wp:cNvGraphicFramePr>
+          <a:graphic xmlns:a="http://schemas.openxmlformats.org/drawingml/2006/main">
+            <a:graphicData uri="http://schemas.openxmlformats.org/drawingml/2006/picture">
+              <pic:pic xmlns:pic="http://schemas.openxmlformats.org/drawingml/2006/picture">
+                <pic:nvPicPr>
+                  <pic:cNvPr id="1" name="WordPictureWatermark24466157" descr=""/>
+                  <pic:cNvPicPr>
+                    <a:picLocks noChangeAspect="1" noChangeArrowheads="1"/>
+                  </pic:cNvPicPr>
+                </pic:nvPicPr>
+                <pic:blipFill>
+                  <a:blip r:embed="rId1">
+                    <a:lum bright="70000" contrast="-70000"/>
+                  </a:blip>
+                  <a:stretch>
+                    <a:fillRect/>
+                  </a:stretch>
+                </pic:blipFill>
+                <pic:spPr bwMode="auto">
+                  <a:xfrm>
+                    <a:off x="0" y="0"/>
+                    <a:ext cx="5941060" cy="3128645"/>
+                  </a:xfrm>
+                  <a:prstGeom prst="rect">
+                    <a:avLst/>
+                  </a:prstGeom>
+                </pic:spPr>
+              </pic:pic>
+            </a:graphicData>
+          </a:graphic>
+        </wp:anchor>
+      </w:drawing>
+    </w:r>
+  </w:p>
+</w:hdr>
+</file>
+
+<file path=word/header10.xml><?xml version="1.0" encoding="utf-8"?>
+<w:hdr xmlns:o="urn:schemas-microsoft-com:office:office" xmlns:r="http://schemas.openxmlformats.org/officeDocument/2006/relationships" xmlns:v="urn:schemas-microsoft-com:vml" xmlns:w="http://schemas.openxmlformats.org/wordprocessingml/2006/main" xmlns:w10="urn:schemas-microsoft-com:office:word" xmlns:wp="http://schemas.openxmlformats.org/drawingml/2006/wordprocessingDrawing" xmlns:wps="http://schemas.microsoft.com/office/word/2010/wordprocessingShape" xmlns:wpg="http://schemas.microsoft.com/office/word/2010/wordprocessingGroup" xmlns:mc="http://schemas.openxmlformats.org/markup-compatibility/2006" xmlns:wp14="http://schemas.microsoft.com/office/word/2010/wordprocessingDrawing" xmlns:w14="http://schemas.microsoft.com/office/word/2010/wordml" xmlns:w15="http://schemas.microsoft.com/office/word/2012/wordml" mc:Ignorable="w14 wp14 w15">
+  <w:p>
+    <w:pPr>
+      <w:pStyle w:val="Cabecera"/>
+      <w:rPr/>
+    </w:pPr>
+    <w:r>
+      <w:rPr/>
+      <w:t>Version 003 -Espa</w:t>
+    </w:r>
+    <w:r>
+      <w:rPr>
+        <w:lang w:val="es-MX"/>
+      </w:rPr>
+      <w:t xml:space="preserve">ñol </w:t>
     </w:r>
     <w:r>
       <w:rPr/>
-      <w:t>V</w:t>
+      <w:t>09/06/2021</w:t>
+    </w:r>
+  </w:p>
+</w:hdr>
+</file>
+
+<file path=word/header11.xml><?xml version="1.0" encoding="utf-8"?>
+<w:hdr xmlns:o="urn:schemas-microsoft-com:office:office" xmlns:r="http://schemas.openxmlformats.org/officeDocument/2006/relationships" xmlns:v="urn:schemas-microsoft-com:vml" xmlns:w="http://schemas.openxmlformats.org/wordprocessingml/2006/main" xmlns:w10="urn:schemas-microsoft-com:office:word" xmlns:wp="http://schemas.openxmlformats.org/drawingml/2006/wordprocessingDrawing" xmlns:wps="http://schemas.microsoft.com/office/word/2010/wordprocessingShape" xmlns:wpg="http://schemas.microsoft.com/office/word/2010/wordprocessingGroup" xmlns:mc="http://schemas.openxmlformats.org/markup-compatibility/2006" xmlns:wp14="http://schemas.microsoft.com/office/word/2010/wordprocessingDrawing" xmlns:w14="http://schemas.microsoft.com/office/word/2010/wordml" xmlns:w15="http://schemas.microsoft.com/office/word/2012/wordml" mc:Ignorable="w14 wp14 w15">
+  <w:p>
+    <w:pPr>
+      <w:pStyle w:val="Cabecera"/>
+      <w:rPr/>
+    </w:pPr>
+    <w:r>
+      <w:rPr/>
+    </w:r>
+  </w:p>
+</w:hdr>
+</file>
+
+<file path=word/header12.xml><?xml version="1.0" encoding="utf-8"?>
+<w:hdr xmlns:o="urn:schemas-microsoft-com:office:office" xmlns:r="http://schemas.openxmlformats.org/officeDocument/2006/relationships" xmlns:v="urn:schemas-microsoft-com:vml" xmlns:w="http://schemas.openxmlformats.org/wordprocessingml/2006/main" xmlns:w10="urn:schemas-microsoft-com:office:word" xmlns:wp="http://schemas.openxmlformats.org/drawingml/2006/wordprocessingDrawing" xmlns:wps="http://schemas.microsoft.com/office/word/2010/wordprocessingShape" xmlns:wpg="http://schemas.microsoft.com/office/word/2010/wordprocessingGroup" xmlns:mc="http://schemas.openxmlformats.org/markup-compatibility/2006" xmlns:wp14="http://schemas.microsoft.com/office/word/2010/wordprocessingDrawing" xmlns:w14="http://schemas.microsoft.com/office/word/2010/wordml" xmlns:w15="http://schemas.microsoft.com/office/word/2012/wordml" mc:Ignorable="w14 wp14 w15">
+  <w:p>
+    <w:pPr>
+      <w:pStyle w:val="Cabecera"/>
+      <w:rPr/>
+    </w:pPr>
+    <w:r>
+      <w:rPr/>
+    </w:r>
+    <w:bookmarkStart w:id="25" w:name="_GoBack"/>
+    <w:bookmarkStart w:id="26" w:name="_GoBack"/>
+    <w:bookmarkEnd w:id="26"/>
+  </w:p>
+</w:hdr>
+</file>
+
+<file path=word/header13.xml><?xml version="1.0" encoding="utf-8"?>
+<w:hdr xmlns:o="urn:schemas-microsoft-com:office:office" xmlns:r="http://schemas.openxmlformats.org/officeDocument/2006/relationships" xmlns:v="urn:schemas-microsoft-com:vml" xmlns:w="http://schemas.openxmlformats.org/wordprocessingml/2006/main" xmlns:w10="urn:schemas-microsoft-com:office:word" xmlns:wp="http://schemas.openxmlformats.org/drawingml/2006/wordprocessingDrawing" xmlns:wps="http://schemas.microsoft.com/office/word/2010/wordprocessingShape" xmlns:wpg="http://schemas.microsoft.com/office/word/2010/wordprocessingGroup" xmlns:mc="http://schemas.openxmlformats.org/markup-compatibility/2006" xmlns:wp14="http://schemas.microsoft.com/office/word/2010/wordprocessingDrawing" xmlns:w14="http://schemas.microsoft.com/office/word/2010/wordml" xmlns:w15="http://schemas.microsoft.com/office/word/2012/wordml" mc:Ignorable="w14 wp14 w15">
+  <w:p>
+    <w:pPr>
+      <w:pStyle w:val="Cabecera"/>
+      <w:rPr/>
+    </w:pPr>
+    <w:r>
+      <w:rPr/>
+    </w:r>
+    <w:bookmarkStart w:id="27" w:name="_GoBack"/>
+    <w:bookmarkStart w:id="28" w:name="_GoBack"/>
+    <w:bookmarkEnd w:id="28"/>
+  </w:p>
+</w:hdr>
+</file>
+
+<file path=word/header2.xml><?xml version="1.0" encoding="utf-8"?>
+<w:hdr xmlns:o="urn:schemas-microsoft-com:office:office" xmlns:r="http://schemas.openxmlformats.org/officeDocument/2006/relationships" xmlns:v="urn:schemas-microsoft-com:vml" xmlns:w="http://schemas.openxmlformats.org/wordprocessingml/2006/main" xmlns:w10="urn:schemas-microsoft-com:office:word" xmlns:wp="http://schemas.openxmlformats.org/drawingml/2006/wordprocessingDrawing" xmlns:wps="http://schemas.microsoft.com/office/word/2010/wordprocessingShape" xmlns:wpg="http://schemas.microsoft.com/office/word/2010/wordprocessingGroup" xmlns:mc="http://schemas.openxmlformats.org/markup-compatibility/2006" xmlns:wp14="http://schemas.microsoft.com/office/word/2010/wordprocessingDrawing" xmlns:w14="http://schemas.microsoft.com/office/word/2010/wordml" xmlns:w15="http://schemas.microsoft.com/office/word/2012/wordml" mc:Ignorable="w14 wp14 w15">
+  <w:p>
+    <w:pPr>
+      <w:pStyle w:val="Cabecera"/>
+      <w:rPr/>
+    </w:pPr>
+    <w:r>
+      <w:drawing>
+        <wp:anchor behindDoc="1" distT="0" distB="0" distL="0" distR="0" simplePos="0" locked="0" layoutInCell="0" allowOverlap="1" relativeHeight="6">
+          <wp:simplePos x="0" y="0"/>
+          <wp:positionH relativeFrom="margin">
+            <wp:align>center</wp:align>
+          </wp:positionH>
+          <wp:positionV relativeFrom="margin">
+            <wp:align>center</wp:align>
+          </wp:positionV>
+          <wp:extent cx="5941060" cy="3128645"/>
+          <wp:effectExtent l="0" t="0" r="0" b="0"/>
+          <wp:wrapNone/>
+          <wp:docPr id="2" name="WordPictureWatermark24466158" descr=""/>
+          <wp:cNvGraphicFramePr>
+            <a:graphicFrameLocks xmlns:a="http://schemas.openxmlformats.org/drawingml/2006/main" noChangeAspect="1"/>
+          </wp:cNvGraphicFramePr>
+          <a:graphic xmlns:a="http://schemas.openxmlformats.org/drawingml/2006/main">
+            <a:graphicData uri="http://schemas.openxmlformats.org/drawingml/2006/picture">
+              <pic:pic xmlns:pic="http://schemas.openxmlformats.org/drawingml/2006/picture">
+                <pic:nvPicPr>
+                  <pic:cNvPr id="2" name="WordPictureWatermark24466158" descr=""/>
+                  <pic:cNvPicPr>
+                    <a:picLocks noChangeAspect="1" noChangeArrowheads="1"/>
+                  </pic:cNvPicPr>
+                </pic:nvPicPr>
+                <pic:blipFill>
+                  <a:blip r:embed="rId1">
+                    <a:lum bright="70000" contrast="-70000"/>
+                  </a:blip>
+                  <a:stretch>
+                    <a:fillRect/>
+                  </a:stretch>
+                </pic:blipFill>
+                <pic:spPr bwMode="auto">
+                  <a:xfrm>
+                    <a:off x="0" y="0"/>
+                    <a:ext cx="5941060" cy="3128645"/>
+                  </a:xfrm>
+                  <a:prstGeom prst="rect">
+                    <a:avLst/>
+                  </a:prstGeom>
+                </pic:spPr>
+              </pic:pic>
+            </a:graphicData>
+          </a:graphic>
+        </wp:anchor>
+      </w:drawing>
     </w:r>
     <w:r>
       <w:rPr/>
-      <w:t>ersion 003 -Espa</w:t>
+      <w:t>Version 003 -Espa</w:t>
+    </w:r>
+    <w:r>
+      <w:rPr>
+        <w:lang w:val="es-MX"/>
+      </w:rPr>
+      <w:t xml:space="preserve">ñol </w:t>
+    </w:r>
+    <w:r>
+      <w:rPr/>
+      <w:t>09/06/2021</w:t>
+    </w:r>
+  </w:p>
+</w:hdr>
+</file>
+
+<file path=word/header3.xml><?xml version="1.0" encoding="utf-8"?>
+<w:hdr xmlns:o="urn:schemas-microsoft-com:office:office" xmlns:r="http://schemas.openxmlformats.org/officeDocument/2006/relationships" xmlns:v="urn:schemas-microsoft-com:vml" xmlns:w="http://schemas.openxmlformats.org/wordprocessingml/2006/main" xmlns:w10="urn:schemas-microsoft-com:office:word" xmlns:wp="http://schemas.openxmlformats.org/drawingml/2006/wordprocessingDrawing" xmlns:wps="http://schemas.microsoft.com/office/word/2010/wordprocessingShape" xmlns:wpg="http://schemas.microsoft.com/office/word/2010/wordprocessingGroup" xmlns:mc="http://schemas.openxmlformats.org/markup-compatibility/2006" xmlns:wp14="http://schemas.microsoft.com/office/word/2010/wordprocessingDrawing" xmlns:w14="http://schemas.microsoft.com/office/word/2010/wordml" xmlns:w15="http://schemas.microsoft.com/office/word/2012/wordml" mc:Ignorable="w14 wp14 w15">
+  <w:p>
+    <w:pPr>
+      <w:pStyle w:val="Cabecera"/>
+      <w:rPr/>
+    </w:pPr>
+    <w:r>
+      <w:drawing>
+        <wp:anchor behindDoc="1" distT="0" distB="0" distL="0" distR="0" simplePos="0" locked="0" layoutInCell="0" allowOverlap="1" relativeHeight="6">
+          <wp:simplePos x="0" y="0"/>
+          <wp:positionH relativeFrom="margin">
+            <wp:align>center</wp:align>
+          </wp:positionH>
+          <wp:positionV relativeFrom="margin">
+            <wp:align>center</wp:align>
+          </wp:positionV>
+          <wp:extent cx="5941060" cy="3128645"/>
+          <wp:effectExtent l="0" t="0" r="0" b="0"/>
+          <wp:wrapNone/>
+          <wp:docPr id="3" name="WordPictureWatermark24466158" descr=""/>
+          <wp:cNvGraphicFramePr>
+            <a:graphicFrameLocks xmlns:a="http://schemas.openxmlformats.org/drawingml/2006/main" noChangeAspect="1"/>
+          </wp:cNvGraphicFramePr>
+          <a:graphic xmlns:a="http://schemas.openxmlformats.org/drawingml/2006/main">
+            <a:graphicData uri="http://schemas.openxmlformats.org/drawingml/2006/picture">
+              <pic:pic xmlns:pic="http://schemas.openxmlformats.org/drawingml/2006/picture">
+                <pic:nvPicPr>
+                  <pic:cNvPr id="3" name="WordPictureWatermark24466158" descr=""/>
+                  <pic:cNvPicPr>
+                    <a:picLocks noChangeAspect="1" noChangeArrowheads="1"/>
+                  </pic:cNvPicPr>
+                </pic:nvPicPr>
+                <pic:blipFill>
+                  <a:blip r:embed="rId1">
+                    <a:lum bright="70000" contrast="-70000"/>
+                  </a:blip>
+                  <a:stretch>
+                    <a:fillRect/>
+                  </a:stretch>
+                </pic:blipFill>
+                <pic:spPr bwMode="auto">
+                  <a:xfrm>
+                    <a:off x="0" y="0"/>
+                    <a:ext cx="5941060" cy="3128645"/>
+                  </a:xfrm>
+                  <a:prstGeom prst="rect">
+                    <a:avLst/>
+                  </a:prstGeom>
+                </pic:spPr>
+              </pic:pic>
+            </a:graphicData>
+          </a:graphic>
+        </wp:anchor>
+      </w:drawing>
+    </w:r>
+    <w:r>
+      <w:rPr/>
+      <w:t>Version 003 -Espa</w:t>
+    </w:r>
+    <w:r>
+      <w:rPr>
+        <w:lang w:val="es-MX"/>
+      </w:rPr>
+      <w:t xml:space="preserve">ñol </w:t>
+    </w:r>
+    <w:r>
+      <w:rPr/>
+      <w:t>09/06/2021</w:t>
+    </w:r>
+  </w:p>
+</w:hdr>
+</file>
+
+<file path=word/header4.xml><?xml version="1.0" encoding="utf-8"?>
+<w:hdr xmlns:o="urn:schemas-microsoft-com:office:office" xmlns:r="http://schemas.openxmlformats.org/officeDocument/2006/relationships" xmlns:v="urn:schemas-microsoft-com:vml" xmlns:w="http://schemas.openxmlformats.org/wordprocessingml/2006/main" xmlns:w10="urn:schemas-microsoft-com:office:word" xmlns:wp="http://schemas.openxmlformats.org/drawingml/2006/wordprocessingDrawing" xmlns:wps="http://schemas.microsoft.com/office/word/2010/wordprocessingShape" xmlns:wpg="http://schemas.microsoft.com/office/word/2010/wordprocessingGroup" xmlns:mc="http://schemas.openxmlformats.org/markup-compatibility/2006" xmlns:wp14="http://schemas.microsoft.com/office/word/2010/wordprocessingDrawing" xmlns:w14="http://schemas.microsoft.com/office/word/2010/wordml" xmlns:w15="http://schemas.microsoft.com/office/word/2012/wordml" mc:Ignorable="w14 wp14 w15">
+  <w:p>
+    <w:pPr>
+      <w:pStyle w:val="Cabecera"/>
+      <w:rPr/>
+    </w:pPr>
+    <w:r>
+      <w:rPr/>
+    </w:r>
+  </w:p>
+</w:hdr>
+</file>
+
+<file path=word/header5.xml><?xml version="1.0" encoding="utf-8"?>
+<w:hdr xmlns:o="urn:schemas-microsoft-com:office:office" xmlns:r="http://schemas.openxmlformats.org/officeDocument/2006/relationships" xmlns:v="urn:schemas-microsoft-com:vml" xmlns:w="http://schemas.openxmlformats.org/wordprocessingml/2006/main" xmlns:w10="urn:schemas-microsoft-com:office:word" xmlns:wp="http://schemas.openxmlformats.org/drawingml/2006/wordprocessingDrawing" xmlns:wps="http://schemas.microsoft.com/office/word/2010/wordprocessingShape" xmlns:wpg="http://schemas.microsoft.com/office/word/2010/wordprocessingGroup" xmlns:mc="http://schemas.openxmlformats.org/markup-compatibility/2006" xmlns:wp14="http://schemas.microsoft.com/office/word/2010/wordprocessingDrawing" xmlns:w14="http://schemas.microsoft.com/office/word/2010/wordml" xmlns:w15="http://schemas.microsoft.com/office/word/2012/wordml" mc:Ignorable="w14 wp14 w15">
+  <w:p>
+    <w:pPr>
+      <w:pStyle w:val="Cabecera"/>
+      <w:rPr/>
+    </w:pPr>
+    <w:r>
+      <w:rPr/>
+      <w:t>Version 003 -Espa</w:t>
+    </w:r>
+    <w:r>
+      <w:rPr>
+        <w:lang w:val="es-MX"/>
+      </w:rPr>
+      <w:t xml:space="preserve">ñol </w:t>
+    </w:r>
+    <w:r>
+      <w:rPr/>
+      <w:t>09/06/2021</w:t>
+    </w:r>
+  </w:p>
+</w:hdr>
+</file>
+
+<file path=word/header6.xml><?xml version="1.0" encoding="utf-8"?>
+<w:hdr xmlns:o="urn:schemas-microsoft-com:office:office" xmlns:r="http://schemas.openxmlformats.org/officeDocument/2006/relationships" xmlns:v="urn:schemas-microsoft-com:vml" xmlns:w="http://schemas.openxmlformats.org/wordprocessingml/2006/main" xmlns:w10="urn:schemas-microsoft-com:office:word" xmlns:wp="http://schemas.openxmlformats.org/drawingml/2006/wordprocessingDrawing" xmlns:wps="http://schemas.microsoft.com/office/word/2010/wordprocessingShape" xmlns:wpg="http://schemas.microsoft.com/office/word/2010/wordprocessingGroup" xmlns:mc="http://schemas.openxmlformats.org/markup-compatibility/2006" xmlns:wp14="http://schemas.microsoft.com/office/word/2010/wordprocessingDrawing" xmlns:w14="http://schemas.microsoft.com/office/word/2010/wordml" xmlns:w15="http://schemas.microsoft.com/office/word/2012/wordml" mc:Ignorable="w14 wp14 w15">
+  <w:p>
+    <w:pPr>
+      <w:pStyle w:val="Cabecera"/>
+      <w:rPr/>
+    </w:pPr>
+    <w:r>
+      <w:rPr/>
+      <w:t>Version 003 -Espa</w:t>
+    </w:r>
+    <w:r>
+      <w:rPr>
+        <w:lang w:val="es-MX"/>
+      </w:rPr>
+      <w:t xml:space="preserve">ñol </w:t>
+    </w:r>
+    <w:r>
+      <w:rPr/>
+      <w:t>09/06/2021</w:t>
+    </w:r>
+  </w:p>
+</w:hdr>
+</file>
+
+<file path=word/header7.xml><?xml version="1.0" encoding="utf-8"?>
+<w:hdr xmlns:o="urn:schemas-microsoft-com:office:office" xmlns:r="http://schemas.openxmlformats.org/officeDocument/2006/relationships" xmlns:v="urn:schemas-microsoft-com:vml" xmlns:w="http://schemas.openxmlformats.org/wordprocessingml/2006/main" xmlns:w10="urn:schemas-microsoft-com:office:word" xmlns:wp="http://schemas.openxmlformats.org/drawingml/2006/wordprocessingDrawing" xmlns:wps="http://schemas.microsoft.com/office/word/2010/wordprocessingShape" xmlns:wpg="http://schemas.microsoft.com/office/word/2010/wordprocessingGroup" xmlns:mc="http://schemas.openxmlformats.org/markup-compatibility/2006" xmlns:wp14="http://schemas.microsoft.com/office/word/2010/wordprocessingDrawing" xmlns:w14="http://schemas.microsoft.com/office/word/2010/wordml" xmlns:w15="http://schemas.microsoft.com/office/word/2012/wordml" mc:Ignorable="w14 wp14 w15">
+  <w:p>
+    <w:pPr>
+      <w:pStyle w:val="Cabecera"/>
+      <w:rPr/>
+    </w:pPr>
+    <w:r>
+      <w:rPr/>
+      <w:t>Version 003 -Espa</w:t>
+    </w:r>
+    <w:r>
+      <w:rPr>
+        <w:lang w:val="es-MX"/>
+      </w:rPr>
+      <w:t xml:space="preserve">ñol </w:t>
+    </w:r>
+    <w:r>
+      <w:rPr/>
+      <w:t>09/06/2021</w:t>
+    </w:r>
+  </w:p>
+</w:hdr>
+</file>
+
+<file path=word/header8.xml><?xml version="1.0" encoding="utf-8"?>
+<w:hdr xmlns:o="urn:schemas-microsoft-com:office:office" xmlns:r="http://schemas.openxmlformats.org/officeDocument/2006/relationships" xmlns:v="urn:schemas-microsoft-com:vml" xmlns:w="http://schemas.openxmlformats.org/wordprocessingml/2006/main" xmlns:w10="urn:schemas-microsoft-com:office:word" xmlns:wp="http://schemas.openxmlformats.org/drawingml/2006/wordprocessingDrawing" xmlns:wps="http://schemas.microsoft.com/office/word/2010/wordprocessingShape" xmlns:wpg="http://schemas.microsoft.com/office/word/2010/wordprocessingGroup" xmlns:mc="http://schemas.openxmlformats.org/markup-compatibility/2006" xmlns:wp14="http://schemas.microsoft.com/office/word/2010/wordprocessingDrawing" xmlns:w14="http://schemas.microsoft.com/office/word/2010/wordml" xmlns:w15="http://schemas.microsoft.com/office/word/2012/wordml" mc:Ignorable="w14 wp14 w15">
+  <w:p>
+    <w:pPr>
+      <w:pStyle w:val="Cabecera"/>
+      <w:rPr/>
+    </w:pPr>
+    <w:r>
+      <w:rPr/>
+    </w:r>
+  </w:p>
+</w:hdr>
+</file>
+
+<file path=word/header9.xml><?xml version="1.0" encoding="utf-8"?>
+<w:hdr xmlns:o="urn:schemas-microsoft-com:office:office" xmlns:r="http://schemas.openxmlformats.org/officeDocument/2006/relationships" xmlns:v="urn:schemas-microsoft-com:vml" xmlns:w="http://schemas.openxmlformats.org/wordprocessingml/2006/main" xmlns:w10="urn:schemas-microsoft-com:office:word" xmlns:wp="http://schemas.openxmlformats.org/drawingml/2006/wordprocessingDrawing" xmlns:wps="http://schemas.microsoft.com/office/word/2010/wordprocessingShape" xmlns:wpg="http://schemas.microsoft.com/office/word/2010/wordprocessingGroup" xmlns:mc="http://schemas.openxmlformats.org/markup-compatibility/2006" xmlns:wp14="http://schemas.microsoft.com/office/word/2010/wordprocessingDrawing" xmlns:w14="http://schemas.microsoft.com/office/word/2010/wordml" xmlns:w15="http://schemas.microsoft.com/office/word/2012/wordml" mc:Ignorable="w14 wp14 w15">
+  <w:p>
+    <w:pPr>
+      <w:pStyle w:val="Cabecera"/>
+      <w:rPr/>
+    </w:pPr>
+    <w:r>
+      <w:rPr/>
+      <w:t>Version 003 -Espa</w:t>
     </w:r>
     <w:r>
       <w:rPr>
@@ -8924,7 +9831,7 @@
 </file>
 
 <file path=word/numbering.xml><?xml version="1.0" encoding="utf-8"?>
-<w:numbering xmlns:w="http://schemas.openxmlformats.org/wordprocessingml/2006/main" xmlns:o="urn:schemas-microsoft-com:office:office" xmlns:r="http://schemas.openxmlformats.org/officeDocument/2006/relationships" xmlns:v="urn:schemas-microsoft-com:vml">
+<w:numbering xmlns:w="http://schemas.openxmlformats.org/wordprocessingml/2006/main" xmlns:o="urn:schemas-microsoft-com:office:office" xmlns:r="http://schemas.openxmlformats.org/officeDocument/2006/relationships" xmlns:v="urn:schemas-microsoft-com:vml" xmlns:mc="http://schemas.openxmlformats.org/markup-compatibility/2006" xmlns:w14="http://schemas.microsoft.com/office/word/2010/wordml" mc:Ignorable="w14">
   <w:abstractNum w:abstractNumId="1">
     <w:lvl w:ilvl="0">
       <w:start w:val="1"/>
@@ -9224,8 +10131,12 @@
       <w:lvlText w:val="%1."/>
       <w:lvlJc w:val="left"/>
       <w:pPr>
+        <w:tabs>
+          <w:tab w:val="num" w:pos="0"/>
+        </w:tabs>
         <w:ind w:left="720" w:hanging="360"/>
       </w:pPr>
+      <w:rPr/>
     </w:lvl>
     <w:lvl w:ilvl="1">
       <w:start w:val="1"/>
@@ -9233,8 +10144,12 @@
       <w:lvlText w:val="%2."/>
       <w:lvlJc w:val="left"/>
       <w:pPr>
+        <w:tabs>
+          <w:tab w:val="num" w:pos="0"/>
+        </w:tabs>
         <w:ind w:left="1440" w:hanging="360"/>
       </w:pPr>
+      <w:rPr/>
     </w:lvl>
     <w:lvl w:ilvl="2">
       <w:start w:val="1"/>
@@ -9242,8 +10157,12 @@
       <w:lvlText w:val="%3."/>
       <w:lvlJc w:val="right"/>
       <w:pPr>
+        <w:tabs>
+          <w:tab w:val="num" w:pos="0"/>
+        </w:tabs>
         <w:ind w:left="2160" w:hanging="180"/>
       </w:pPr>
+      <w:rPr/>
     </w:lvl>
     <w:lvl w:ilvl="3">
       <w:start w:val="1"/>
@@ -9251,8 +10170,12 @@
       <w:lvlText w:val="%4."/>
       <w:lvlJc w:val="left"/>
       <w:pPr>
+        <w:tabs>
+          <w:tab w:val="num" w:pos="0"/>
+        </w:tabs>
         <w:ind w:left="2880" w:hanging="360"/>
       </w:pPr>
+      <w:rPr/>
     </w:lvl>
     <w:lvl w:ilvl="4">
       <w:start w:val="1"/>
@@ -9260,8 +10183,12 @@
       <w:lvlText w:val="%5."/>
       <w:lvlJc w:val="left"/>
       <w:pPr>
+        <w:tabs>
+          <w:tab w:val="num" w:pos="0"/>
+        </w:tabs>
         <w:ind w:left="3600" w:hanging="360"/>
       </w:pPr>
+      <w:rPr/>
     </w:lvl>
     <w:lvl w:ilvl="5">
       <w:start w:val="1"/>
@@ -9269,8 +10196,12 @@
       <w:lvlText w:val="%6."/>
       <w:lvlJc w:val="right"/>
       <w:pPr>
+        <w:tabs>
+          <w:tab w:val="num" w:pos="0"/>
+        </w:tabs>
         <w:ind w:left="4320" w:hanging="180"/>
       </w:pPr>
+      <w:rPr/>
     </w:lvl>
     <w:lvl w:ilvl="6">
       <w:start w:val="1"/>
@@ -9278,8 +10209,12 @@
       <w:lvlText w:val="%7."/>
       <w:lvlJc w:val="left"/>
       <w:pPr>
+        <w:tabs>
+          <w:tab w:val="num" w:pos="0"/>
+        </w:tabs>
         <w:ind w:left="5040" w:hanging="360"/>
       </w:pPr>
+      <w:rPr/>
     </w:lvl>
     <w:lvl w:ilvl="7">
       <w:start w:val="1"/>
@@ -9287,8 +10222,12 @@
       <w:lvlText w:val="%8."/>
       <w:lvlJc w:val="left"/>
       <w:pPr>
+        <w:tabs>
+          <w:tab w:val="num" w:pos="0"/>
+        </w:tabs>
         <w:ind w:left="5760" w:hanging="360"/>
       </w:pPr>
+      <w:rPr/>
     </w:lvl>
     <w:lvl w:ilvl="8">
       <w:start w:val="1"/>
@@ -9296,8 +10235,12 @@
       <w:lvlText w:val="%9."/>
       <w:lvlJc w:val="right"/>
       <w:pPr>
+        <w:tabs>
+          <w:tab w:val="num" w:pos="0"/>
+        </w:tabs>
         <w:ind w:left="6480" w:hanging="180"/>
       </w:pPr>
+      <w:rPr/>
     </w:lvl>
   </w:abstractNum>
   <w:abstractNum w:abstractNumId="4">
@@ -9307,8 +10250,12 @@
       <w:lvlText w:val="%1."/>
       <w:lvlJc w:val="left"/>
       <w:pPr>
+        <w:tabs>
+          <w:tab w:val="num" w:pos="0"/>
+        </w:tabs>
         <w:ind w:left="720" w:hanging="360"/>
       </w:pPr>
+      <w:rPr/>
     </w:lvl>
     <w:lvl w:ilvl="1">
       <w:start w:val="1"/>
@@ -9316,8 +10263,12 @@
       <w:lvlText w:val="%2."/>
       <w:lvlJc w:val="left"/>
       <w:pPr>
+        <w:tabs>
+          <w:tab w:val="num" w:pos="0"/>
+        </w:tabs>
         <w:ind w:left="1440" w:hanging="360"/>
       </w:pPr>
+      <w:rPr/>
     </w:lvl>
     <w:lvl w:ilvl="2">
       <w:start w:val="1"/>
@@ -9325,8 +10276,12 @@
       <w:lvlText w:val="%3."/>
       <w:lvlJc w:val="right"/>
       <w:pPr>
+        <w:tabs>
+          <w:tab w:val="num" w:pos="0"/>
+        </w:tabs>
         <w:ind w:left="2160" w:hanging="180"/>
       </w:pPr>
+      <w:rPr/>
     </w:lvl>
     <w:lvl w:ilvl="3">
       <w:start w:val="1"/>
@@ -9334,8 +10289,12 @@
       <w:lvlText w:val="%4."/>
       <w:lvlJc w:val="left"/>
       <w:pPr>
+        <w:tabs>
+          <w:tab w:val="num" w:pos="0"/>
+        </w:tabs>
         <w:ind w:left="2880" w:hanging="360"/>
       </w:pPr>
+      <w:rPr/>
     </w:lvl>
     <w:lvl w:ilvl="4">
       <w:start w:val="1"/>
@@ -9343,8 +10302,12 @@
       <w:lvlText w:val="%5."/>
       <w:lvlJc w:val="left"/>
       <w:pPr>
+        <w:tabs>
+          <w:tab w:val="num" w:pos="0"/>
+        </w:tabs>
         <w:ind w:left="3600" w:hanging="360"/>
       </w:pPr>
+      <w:rPr/>
     </w:lvl>
     <w:lvl w:ilvl="5">
       <w:start w:val="1"/>
@@ -9352,8 +10315,12 @@
       <w:lvlText w:val="%6."/>
       <w:lvlJc w:val="right"/>
       <w:pPr>
+        <w:tabs>
+          <w:tab w:val="num" w:pos="0"/>
+        </w:tabs>
         <w:ind w:left="4320" w:hanging="180"/>
       </w:pPr>
+      <w:rPr/>
     </w:lvl>
     <w:lvl w:ilvl="6">
       <w:start w:val="1"/>
@@ -9361,8 +10328,12 @@
       <w:lvlText w:val="%7."/>
       <w:lvlJc w:val="left"/>
       <w:pPr>
+        <w:tabs>
+          <w:tab w:val="num" w:pos="0"/>
+        </w:tabs>
         <w:ind w:left="5040" w:hanging="360"/>
       </w:pPr>
+      <w:rPr/>
     </w:lvl>
     <w:lvl w:ilvl="7">
       <w:start w:val="1"/>
@@ -9370,8 +10341,12 @@
       <w:lvlText w:val="%8."/>
       <w:lvlJc w:val="left"/>
       <w:pPr>
+        <w:tabs>
+          <w:tab w:val="num" w:pos="0"/>
+        </w:tabs>
         <w:ind w:left="5760" w:hanging="360"/>
       </w:pPr>
+      <w:rPr/>
     </w:lvl>
     <w:lvl w:ilvl="8">
       <w:start w:val="1"/>
@@ -9379,8 +10354,12 @@
       <w:lvlText w:val="%9."/>
       <w:lvlJc w:val="right"/>
       <w:pPr>
+        <w:tabs>
+          <w:tab w:val="num" w:pos="0"/>
+        </w:tabs>
         <w:ind w:left="6480" w:hanging="180"/>
       </w:pPr>
+      <w:rPr/>
     </w:lvl>
   </w:abstractNum>
   <w:abstractNum w:abstractNumId="5">
@@ -9390,8 +10369,12 @@
       <w:lvlText w:val="%1."/>
       <w:lvlJc w:val="left"/>
       <w:pPr>
+        <w:tabs>
+          <w:tab w:val="num" w:pos="0"/>
+        </w:tabs>
         <w:ind w:left="720" w:hanging="360"/>
       </w:pPr>
+      <w:rPr/>
     </w:lvl>
     <w:lvl w:ilvl="1">
       <w:start w:val="1"/>
@@ -9399,8 +10382,12 @@
       <w:lvlText w:val="%2."/>
       <w:lvlJc w:val="left"/>
       <w:pPr>
+        <w:tabs>
+          <w:tab w:val="num" w:pos="0"/>
+        </w:tabs>
         <w:ind w:left="1440" w:hanging="360"/>
       </w:pPr>
+      <w:rPr/>
     </w:lvl>
     <w:lvl w:ilvl="2">
       <w:start w:val="1"/>
@@ -9408,8 +10395,12 @@
       <w:lvlText w:val="%3."/>
       <w:lvlJc w:val="right"/>
       <w:pPr>
+        <w:tabs>
+          <w:tab w:val="num" w:pos="0"/>
+        </w:tabs>
         <w:ind w:left="2160" w:hanging="180"/>
       </w:pPr>
+      <w:rPr/>
     </w:lvl>
     <w:lvl w:ilvl="3">
       <w:start w:val="1"/>
@@ -9417,8 +10408,12 @@
       <w:lvlText w:val="%4."/>
       <w:lvlJc w:val="left"/>
       <w:pPr>
+        <w:tabs>
+          <w:tab w:val="num" w:pos="0"/>
+        </w:tabs>
         <w:ind w:left="2880" w:hanging="360"/>
       </w:pPr>
+      <w:rPr/>
     </w:lvl>
     <w:lvl w:ilvl="4">
       <w:start w:val="1"/>
@@ -9426,8 +10421,12 @@
       <w:lvlText w:val="%5."/>
       <w:lvlJc w:val="left"/>
       <w:pPr>
+        <w:tabs>
+          <w:tab w:val="num" w:pos="0"/>
+        </w:tabs>
         <w:ind w:left="3600" w:hanging="360"/>
       </w:pPr>
+      <w:rPr/>
     </w:lvl>
     <w:lvl w:ilvl="5">
       <w:start w:val="1"/>
@@ -9435,8 +10434,12 @@
       <w:lvlText w:val="%6."/>
       <w:lvlJc w:val="right"/>
       <w:pPr>
+        <w:tabs>
+          <w:tab w:val="num" w:pos="0"/>
+        </w:tabs>
         <w:ind w:left="4320" w:hanging="180"/>
       </w:pPr>
+      <w:rPr/>
     </w:lvl>
     <w:lvl w:ilvl="6">
       <w:start w:val="1"/>
@@ -9444,8 +10447,12 @@
       <w:lvlText w:val="%7."/>
       <w:lvlJc w:val="left"/>
       <w:pPr>
+        <w:tabs>
+          <w:tab w:val="num" w:pos="0"/>
+        </w:tabs>
         <w:ind w:left="5040" w:hanging="360"/>
       </w:pPr>
+      <w:rPr/>
     </w:lvl>
     <w:lvl w:ilvl="7">
       <w:start w:val="1"/>
@@ -9453,8 +10460,12 @@
       <w:lvlText w:val="%8."/>
       <w:lvlJc w:val="left"/>
       <w:pPr>
+        <w:tabs>
+          <w:tab w:val="num" w:pos="0"/>
+        </w:tabs>
         <w:ind w:left="5760" w:hanging="360"/>
       </w:pPr>
+      <w:rPr/>
     </w:lvl>
     <w:lvl w:ilvl="8">
       <w:start w:val="1"/>
@@ -9462,8 +10473,12 @@
       <w:lvlText w:val="%9."/>
       <w:lvlJc w:val="right"/>
       <w:pPr>
+        <w:tabs>
+          <w:tab w:val="num" w:pos="0"/>
+        </w:tabs>
         <w:ind w:left="6480" w:hanging="180"/>
       </w:pPr>
+      <w:rPr/>
     </w:lvl>
   </w:abstractNum>
   <w:abstractNum w:abstractNumId="6">
@@ -9473,8 +10488,12 @@
       <w:lvlText w:val="%1."/>
       <w:lvlJc w:val="left"/>
       <w:pPr>
+        <w:tabs>
+          <w:tab w:val="num" w:pos="0"/>
+        </w:tabs>
         <w:ind w:left="720" w:hanging="360"/>
       </w:pPr>
+      <w:rPr/>
     </w:lvl>
     <w:lvl w:ilvl="1">
       <w:start w:val="1"/>
@@ -9482,8 +10501,12 @@
       <w:lvlText w:val="%2."/>
       <w:lvlJc w:val="left"/>
       <w:pPr>
+        <w:tabs>
+          <w:tab w:val="num" w:pos="0"/>
+        </w:tabs>
         <w:ind w:left="1440" w:hanging="360"/>
       </w:pPr>
+      <w:rPr/>
     </w:lvl>
     <w:lvl w:ilvl="2">
       <w:start w:val="1"/>
@@ -9491,8 +10514,12 @@
       <w:lvlText w:val="%3."/>
       <w:lvlJc w:val="right"/>
       <w:pPr>
+        <w:tabs>
+          <w:tab w:val="num" w:pos="0"/>
+        </w:tabs>
         <w:ind w:left="2160" w:hanging="180"/>
       </w:pPr>
+      <w:rPr/>
     </w:lvl>
     <w:lvl w:ilvl="3">
       <w:start w:val="1"/>
@@ -9500,8 +10527,12 @@
       <w:lvlText w:val="%4."/>
       <w:lvlJc w:val="left"/>
       <w:pPr>
+        <w:tabs>
+          <w:tab w:val="num" w:pos="0"/>
+        </w:tabs>
         <w:ind w:left="2880" w:hanging="360"/>
       </w:pPr>
+      <w:rPr/>
     </w:lvl>
     <w:lvl w:ilvl="4">
       <w:start w:val="1"/>
@@ -9509,8 +10540,12 @@
       <w:lvlText w:val="%5."/>
       <w:lvlJc w:val="left"/>
       <w:pPr>
+        <w:tabs>
+          <w:tab w:val="num" w:pos="0"/>
+        </w:tabs>
         <w:ind w:left="3600" w:hanging="360"/>
       </w:pPr>
+      <w:rPr/>
     </w:lvl>
     <w:lvl w:ilvl="5">
       <w:start w:val="1"/>
@@ -9518,8 +10553,12 @@
       <w:lvlText w:val="%6."/>
       <w:lvlJc w:val="right"/>
       <w:pPr>
+        <w:tabs>
+          <w:tab w:val="num" w:pos="0"/>
+        </w:tabs>
         <w:ind w:left="4320" w:hanging="180"/>
       </w:pPr>
+      <w:rPr/>
     </w:lvl>
     <w:lvl w:ilvl="6">
       <w:start w:val="1"/>
@@ -9527,8 +10566,12 @@
       <w:lvlText w:val="%7."/>
       <w:lvlJc w:val="left"/>
       <w:pPr>
+        <w:tabs>
+          <w:tab w:val="num" w:pos="0"/>
+        </w:tabs>
         <w:ind w:left="5040" w:hanging="360"/>
       </w:pPr>
+      <w:rPr/>
     </w:lvl>
     <w:lvl w:ilvl="7">
       <w:start w:val="1"/>
@@ -9536,8 +10579,12 @@
       <w:lvlText w:val="%8."/>
       <w:lvlJc w:val="left"/>
       <w:pPr>
+        <w:tabs>
+          <w:tab w:val="num" w:pos="0"/>
+        </w:tabs>
         <w:ind w:left="5760" w:hanging="360"/>
       </w:pPr>
+      <w:rPr/>
     </w:lvl>
     <w:lvl w:ilvl="8">
       <w:start w:val="1"/>
@@ -9545,8 +10592,12 @@
       <w:lvlText w:val="%9."/>
       <w:lvlJc w:val="right"/>
       <w:pPr>
+        <w:tabs>
+          <w:tab w:val="num" w:pos="0"/>
+        </w:tabs>
         <w:ind w:left="6480" w:hanging="180"/>
       </w:pPr>
+      <w:rPr/>
     </w:lvl>
   </w:abstractNum>
   <w:abstractNum w:abstractNumId="7">
@@ -9557,6 +10608,9 @@
       <w:lvlText w:val=""/>
       <w:lvlJc w:val="left"/>
       <w:pPr>
+        <w:tabs>
+          <w:tab w:val="num" w:pos="0"/>
+        </w:tabs>
         <w:ind w:left="0" w:hanging="0"/>
       </w:pPr>
     </w:lvl>
@@ -9567,6 +10621,9 @@
       <w:lvlText w:val=""/>
       <w:lvlJc w:val="left"/>
       <w:pPr>
+        <w:tabs>
+          <w:tab w:val="num" w:pos="0"/>
+        </w:tabs>
         <w:ind w:left="0" w:hanging="0"/>
       </w:pPr>
     </w:lvl>
@@ -9577,6 +10634,9 @@
       <w:lvlText w:val=""/>
       <w:lvlJc w:val="left"/>
       <w:pPr>
+        <w:tabs>
+          <w:tab w:val="num" w:pos="0"/>
+        </w:tabs>
         <w:ind w:left="0" w:hanging="0"/>
       </w:pPr>
     </w:lvl>
@@ -9587,6 +10647,9 @@
       <w:lvlText w:val=""/>
       <w:lvlJc w:val="left"/>
       <w:pPr>
+        <w:tabs>
+          <w:tab w:val="num" w:pos="0"/>
+        </w:tabs>
         <w:ind w:left="0" w:hanging="0"/>
       </w:pPr>
     </w:lvl>
@@ -9597,6 +10660,9 @@
       <w:lvlText w:val=""/>
       <w:lvlJc w:val="left"/>
       <w:pPr>
+        <w:tabs>
+          <w:tab w:val="num" w:pos="0"/>
+        </w:tabs>
         <w:ind w:left="0" w:hanging="0"/>
       </w:pPr>
     </w:lvl>
@@ -9607,6 +10673,9 @@
       <w:lvlText w:val=""/>
       <w:lvlJc w:val="left"/>
       <w:pPr>
+        <w:tabs>
+          <w:tab w:val="num" w:pos="0"/>
+        </w:tabs>
         <w:ind w:left="0" w:hanging="0"/>
       </w:pPr>
     </w:lvl>
@@ -9617,6 +10686,9 @@
       <w:lvlText w:val=""/>
       <w:lvlJc w:val="left"/>
       <w:pPr>
+        <w:tabs>
+          <w:tab w:val="num" w:pos="0"/>
+        </w:tabs>
         <w:ind w:left="0" w:hanging="0"/>
       </w:pPr>
     </w:lvl>
@@ -9627,6 +10699,9 @@
       <w:lvlText w:val=""/>
       <w:lvlJc w:val="left"/>
       <w:pPr>
+        <w:tabs>
+          <w:tab w:val="num" w:pos="0"/>
+        </w:tabs>
         <w:ind w:left="0" w:hanging="0"/>
       </w:pPr>
     </w:lvl>
@@ -9637,6 +10712,9 @@
       <w:lvlText w:val=""/>
       <w:lvlJc w:val="left"/>
       <w:pPr>
+        <w:tabs>
+          <w:tab w:val="num" w:pos="0"/>
+        </w:tabs>
         <w:ind w:left="0" w:hanging="0"/>
       </w:pPr>
     </w:lvl>
@@ -9677,10 +10755,12 @@
       </w:rPr>
     </w:rPrDefault>
     <w:pPrDefault>
-      <w:pPr/>
+      <w:pPr>
+        <w:suppressAutoHyphens w:val="true"/>
+      </w:pPr>
     </w:pPrDefault>
   </w:docDefaults>
-  <w:latentStyles w:defLockedState="0" w:defUIPriority="99" w:defSemiHidden="0" w:defUnhideWhenUsed="0" w:defQFormat="0" w:count="376">
+  <w:latentStyles w:defLockedState="0" w:defUIPriority="99" w:defSemiHidden="0" w:defUnhideWhenUsed="0" w:defQFormat="0" w:count="375">
     <w:lsdException w:name="Normal" w:uiPriority="0" w:qFormat="1"/>
     <w:lsdException w:name="heading 1" w:uiPriority="9" w:qFormat="1"/>
     <w:lsdException w:name="heading 2" w:uiPriority="9" w:semiHidden="1" w:unhideWhenUsed="1" w:qFormat="1"/>
@@ -10056,13 +11136,13 @@
     <w:lsdException w:name="Smart Hyperlink" w:semiHidden="1" w:unhideWhenUsed="1"/>
     <w:lsdException w:name="Hashtag" w:semiHidden="1" w:unhideWhenUsed="1"/>
     <w:lsdException w:name="Unresolved Mention" w:semiHidden="1" w:unhideWhenUsed="1"/>
-    <w:lsdException w:name="Smart Link" w:semiHidden="1" w:unhideWhenUsed="1"/>
   </w:latentStyles>
   <w:style w:type="paragraph" w:styleId="Normal" w:default="1">
     <w:name w:val="Normal"/>
     <w:qFormat/>
     <w:pPr>
       <w:widowControl/>
+      <w:suppressAutoHyphens w:val="true"/>
       <w:bidi w:val="0"/>
       <w:spacing w:lineRule="auto" w:line="259" w:before="0" w:after="160"/>
       <w:jc w:val="left"/>
@@ -10080,7 +11160,7 @@
     <w:name w:val="Heading 1"/>
     <w:basedOn w:val="Normal"/>
     <w:next w:val="Normal"/>
-    <w:link w:val="Ttulo1Car"/>
+    <w:link w:val="Heading1Char"/>
     <w:autoRedefine/>
     <w:uiPriority w:val="9"/>
     <w:qFormat/>
@@ -10108,7 +11188,7 @@
     <w:qFormat/>
     <w:rPr/>
   </w:style>
-  <w:style w:type="character" w:styleId="EnlacedeInternet">
+  <w:style w:type="character" w:styleId="EnlacedeInternet" w:customStyle="1">
     <w:name w:val="Enlace de Internet"/>
     <w:basedOn w:val="DefaultParagraphFont"/>
     <w:uiPriority w:val="99"/>
@@ -10145,10 +11225,10 @@
       <w:szCs w:val="16"/>
     </w:rPr>
   </w:style>
-  <w:style w:type="character" w:styleId="TextocomentarioCar" w:customStyle="1">
-    <w:name w:val="Texto comentario Car"/>
+  <w:style w:type="character" w:styleId="CommentTextChar" w:customStyle="1">
+    <w:name w:val="Comment Text Char"/>
     <w:basedOn w:val="DefaultParagraphFont"/>
-    <w:link w:val="Textocomentario"/>
+    <w:link w:val="Annotationtext"/>
     <w:uiPriority w:val="99"/>
     <w:semiHidden/>
     <w:qFormat/>
@@ -10158,10 +11238,10 @@
       <w:szCs w:val="20"/>
     </w:rPr>
   </w:style>
-  <w:style w:type="character" w:styleId="AsuntodelcomentarioCar" w:customStyle="1">
-    <w:name w:val="Asunto del comentario Car"/>
-    <w:basedOn w:val="TextocomentarioCar"/>
-    <w:link w:val="Asuntodelcomentario"/>
+  <w:style w:type="character" w:styleId="CommentSubjectChar" w:customStyle="1">
+    <w:name w:val="Comment Subject Char"/>
+    <w:basedOn w:val="CommentTextChar"/>
+    <w:link w:val="Annotationsubject"/>
     <w:uiPriority w:val="99"/>
     <w:semiHidden/>
     <w:qFormat/>
@@ -10173,10 +11253,10 @@
       <w:szCs w:val="20"/>
     </w:rPr>
   </w:style>
-  <w:style w:type="character" w:styleId="TextodegloboCar" w:customStyle="1">
-    <w:name w:val="Texto de globo Car"/>
+  <w:style w:type="character" w:styleId="BalloonTextChar" w:customStyle="1">
+    <w:name w:val="Balloon Text Char"/>
     <w:basedOn w:val="DefaultParagraphFont"/>
-    <w:link w:val="Textodeglobo"/>
+    <w:link w:val="BalloonText"/>
     <w:uiPriority w:val="99"/>
     <w:semiHidden/>
     <w:qFormat/>
@@ -10187,10 +11267,9 @@
       <w:szCs w:val="18"/>
     </w:rPr>
   </w:style>
-  <w:style w:type="character" w:styleId="Ttulo1Car" w:customStyle="1">
-    <w:name w:val="Título 1 Car"/>
+  <w:style w:type="character" w:styleId="Heading1Char" w:customStyle="1">
+    <w:name w:val="Heading 1 Char"/>
     <w:basedOn w:val="DefaultParagraphFont"/>
-    <w:link w:val="Ttulo1"/>
     <w:uiPriority w:val="9"/>
     <w:qFormat/>
     <w:rsid w:val="00db456b"/>
@@ -10220,7 +11299,7 @@
   </w:style>
   <w:style w:type="character" w:styleId="BookTitle">
     <w:name w:val="Book Title"/>
-    <w:basedOn w:val="Ttulo1Car"/>
+    <w:basedOn w:val="Heading1Char"/>
     <w:uiPriority w:val="33"/>
     <w:qFormat/>
     <w:rsid w:val="009a5919"/>
@@ -10239,7 +11318,7 @@
   </w:style>
   <w:style w:type="character" w:styleId="Estilo1Car" w:customStyle="1">
     <w:name w:val="Estilo1 Car"/>
-    <w:basedOn w:val="Ttulo1Car"/>
+    <w:basedOn w:val="Heading1Char"/>
     <w:link w:val="Estilo1"/>
     <w:qFormat/>
     <w:rsid w:val="009a5919"/>
@@ -10252,301 +11331,32 @@
       <w:lang w:val="es-MX" w:eastAsia="es-MX"/>
     </w:rPr>
   </w:style>
-  <w:style w:type="character" w:styleId="EncabezadoCar" w:customStyle="1">
-    <w:name w:val="Encabezado Car"/>
+  <w:style w:type="character" w:styleId="HeaderChar" w:customStyle="1">
+    <w:name w:val="Header Char"/>
     <w:basedOn w:val="DefaultParagraphFont"/>
-    <w:link w:val="Encabezado"/>
     <w:uiPriority w:val="99"/>
     <w:qFormat/>
     <w:rsid w:val="00493375"/>
     <w:rPr/>
   </w:style>
-  <w:style w:type="character" w:styleId="PiedepginaCar" w:customStyle="1">
-    <w:name w:val="Pie de página Car"/>
+  <w:style w:type="character" w:styleId="FooterChar" w:customStyle="1">
+    <w:name w:val="Footer Char"/>
     <w:basedOn w:val="DefaultParagraphFont"/>
-    <w:link w:val="Piedepgina"/>
     <w:uiPriority w:val="99"/>
     <w:qFormat/>
     <w:rsid w:val="00493375"/>
     <w:rPr/>
   </w:style>
-  <w:style w:type="character" w:styleId="ListLabel1">
-    <w:name w:val="ListLabel 1"/>
-    <w:qFormat/>
-    <w:rPr>
-      <w:rFonts w:ascii="Comfortaa Light" w:hAnsi="Comfortaa Light"/>
-      <w:sz w:val="20"/>
-    </w:rPr>
-  </w:style>
-  <w:style w:type="character" w:styleId="ListLabel2">
-    <w:name w:val="ListLabel 2"/>
-    <w:qFormat/>
-    <w:rPr>
-      <w:sz w:val="20"/>
-    </w:rPr>
-  </w:style>
-  <w:style w:type="character" w:styleId="ListLabel3">
-    <w:name w:val="ListLabel 3"/>
-    <w:qFormat/>
-    <w:rPr>
-      <w:sz w:val="20"/>
-    </w:rPr>
-  </w:style>
-  <w:style w:type="character" w:styleId="ListLabel4">
-    <w:name w:val="ListLabel 4"/>
-    <w:qFormat/>
-    <w:rPr>
-      <w:sz w:val="20"/>
-    </w:rPr>
-  </w:style>
-  <w:style w:type="character" w:styleId="ListLabel5">
-    <w:name w:val="ListLabel 5"/>
-    <w:qFormat/>
-    <w:rPr>
-      <w:sz w:val="20"/>
-    </w:rPr>
-  </w:style>
-  <w:style w:type="character" w:styleId="ListLabel6">
-    <w:name w:val="ListLabel 6"/>
-    <w:qFormat/>
-    <w:rPr>
-      <w:sz w:val="20"/>
-    </w:rPr>
-  </w:style>
-  <w:style w:type="character" w:styleId="ListLabel7">
-    <w:name w:val="ListLabel 7"/>
-    <w:qFormat/>
-    <w:rPr>
-      <w:sz w:val="20"/>
-    </w:rPr>
-  </w:style>
-  <w:style w:type="character" w:styleId="ListLabel8">
-    <w:name w:val="ListLabel 8"/>
-    <w:qFormat/>
-    <w:rPr>
-      <w:sz w:val="20"/>
-    </w:rPr>
-  </w:style>
-  <w:style w:type="character" w:styleId="ListLabel9">
-    <w:name w:val="ListLabel 9"/>
-    <w:qFormat/>
-    <w:rPr>
-      <w:sz w:val="20"/>
-    </w:rPr>
-  </w:style>
-  <w:style w:type="character" w:styleId="ListLabel10">
-    <w:name w:val="ListLabel 10"/>
-    <w:qFormat/>
-    <w:rPr>
-      <w:sz w:val="20"/>
-    </w:rPr>
-  </w:style>
-  <w:style w:type="character" w:styleId="ListLabel11">
-    <w:name w:val="ListLabel 11"/>
-    <w:qFormat/>
-    <w:rPr>
-      <w:sz w:val="20"/>
-    </w:rPr>
-  </w:style>
-  <w:style w:type="character" w:styleId="ListLabel12">
-    <w:name w:val="ListLabel 12"/>
-    <w:qFormat/>
-    <w:rPr>
-      <w:sz w:val="20"/>
-    </w:rPr>
-  </w:style>
-  <w:style w:type="character" w:styleId="ListLabel13">
-    <w:name w:val="ListLabel 13"/>
-    <w:qFormat/>
-    <w:rPr>
-      <w:sz w:val="20"/>
-    </w:rPr>
-  </w:style>
-  <w:style w:type="character" w:styleId="ListLabel14">
-    <w:name w:val="ListLabel 14"/>
-    <w:qFormat/>
-    <w:rPr>
-      <w:sz w:val="20"/>
-    </w:rPr>
-  </w:style>
-  <w:style w:type="character" w:styleId="ListLabel15">
-    <w:name w:val="ListLabel 15"/>
-    <w:qFormat/>
-    <w:rPr>
-      <w:sz w:val="20"/>
-    </w:rPr>
-  </w:style>
-  <w:style w:type="character" w:styleId="ListLabel16">
-    <w:name w:val="ListLabel 16"/>
-    <w:qFormat/>
-    <w:rPr>
-      <w:sz w:val="20"/>
-    </w:rPr>
-  </w:style>
-  <w:style w:type="character" w:styleId="ListLabel17">
-    <w:name w:val="ListLabel 17"/>
-    <w:qFormat/>
-    <w:rPr>
-      <w:sz w:val="20"/>
-    </w:rPr>
-  </w:style>
-  <w:style w:type="character" w:styleId="ListLabel18">
-    <w:name w:val="ListLabel 18"/>
-    <w:qFormat/>
-    <w:rPr>
-      <w:sz w:val="20"/>
-    </w:rPr>
-  </w:style>
-  <w:style w:type="character" w:styleId="ListLabel19">
-    <w:name w:val="ListLabel 19"/>
-    <w:qFormat/>
-    <w:rPr>
-      <w:rFonts w:ascii="Comfortaa Light" w:hAnsi="Comfortaa Light"/>
-      <w:sz w:val="20"/>
-    </w:rPr>
-  </w:style>
-  <w:style w:type="character" w:styleId="ListLabel20">
-    <w:name w:val="ListLabel 20"/>
-    <w:qFormat/>
-    <w:rPr>
-      <w:sz w:val="20"/>
-    </w:rPr>
-  </w:style>
-  <w:style w:type="character" w:styleId="ListLabel21">
-    <w:name w:val="ListLabel 21"/>
-    <w:qFormat/>
-    <w:rPr>
-      <w:sz w:val="20"/>
-    </w:rPr>
-  </w:style>
-  <w:style w:type="character" w:styleId="ListLabel22">
-    <w:name w:val="ListLabel 22"/>
-    <w:qFormat/>
-    <w:rPr>
-      <w:sz w:val="20"/>
-    </w:rPr>
-  </w:style>
-  <w:style w:type="character" w:styleId="ListLabel23">
-    <w:name w:val="ListLabel 23"/>
-    <w:qFormat/>
-    <w:rPr>
-      <w:sz w:val="20"/>
-    </w:rPr>
-  </w:style>
-  <w:style w:type="character" w:styleId="ListLabel24">
-    <w:name w:val="ListLabel 24"/>
-    <w:qFormat/>
-    <w:rPr>
-      <w:sz w:val="20"/>
-    </w:rPr>
-  </w:style>
-  <w:style w:type="character" w:styleId="ListLabel25">
-    <w:name w:val="ListLabel 25"/>
-    <w:qFormat/>
-    <w:rPr>
-      <w:sz w:val="20"/>
-    </w:rPr>
-  </w:style>
-  <w:style w:type="character" w:styleId="ListLabel26">
-    <w:name w:val="ListLabel 26"/>
-    <w:qFormat/>
-    <w:rPr>
-      <w:sz w:val="20"/>
-    </w:rPr>
-  </w:style>
-  <w:style w:type="character" w:styleId="ListLabel27">
-    <w:name w:val="ListLabel 27"/>
-    <w:qFormat/>
-    <w:rPr>
-      <w:sz w:val="20"/>
-    </w:rPr>
-  </w:style>
-  <w:style w:type="character" w:styleId="ListLabel28">
-    <w:name w:val="ListLabel 28"/>
-    <w:qFormat/>
-    <w:rPr>
-      <w:rFonts w:cs="Courier New"/>
-    </w:rPr>
-  </w:style>
-  <w:style w:type="character" w:styleId="ListLabel29">
-    <w:name w:val="ListLabel 29"/>
-    <w:qFormat/>
-    <w:rPr>
-      <w:rFonts w:cs="Courier New"/>
-    </w:rPr>
-  </w:style>
-  <w:style w:type="character" w:styleId="ListLabel30">
-    <w:name w:val="ListLabel 30"/>
-    <w:qFormat/>
-    <w:rPr>
-      <w:rFonts w:cs="Courier New"/>
-    </w:rPr>
-  </w:style>
-  <w:style w:type="character" w:styleId="ListLabel31">
-    <w:name w:val="ListLabel 31"/>
-    <w:qFormat/>
-    <w:rPr>
-      <w:rFonts w:cs="Courier New"/>
-    </w:rPr>
-  </w:style>
-  <w:style w:type="character" w:styleId="ListLabel32">
-    <w:name w:val="ListLabel 32"/>
-    <w:qFormat/>
-    <w:rPr>
-      <w:rFonts w:cs="Courier New"/>
-    </w:rPr>
-  </w:style>
-  <w:style w:type="character" w:styleId="ListLabel33">
-    <w:name w:val="ListLabel 33"/>
-    <w:qFormat/>
-    <w:rPr>
-      <w:rFonts w:cs="Courier New"/>
-    </w:rPr>
-  </w:style>
-  <w:style w:type="character" w:styleId="ListLabel34">
-    <w:name w:val="ListLabel 34"/>
-    <w:qFormat/>
-    <w:rPr>
-      <w:rFonts w:ascii="Comfortaa Light" w:hAnsi="Comfortaa Light" w:eastAsia="Times New Roman" w:cs="Arial"/>
-      <w:color w:val="000000" w:themeColor="text1"/>
-      <w:sz w:val="20"/>
-      <w:szCs w:val="20"/>
-      <w:lang w:val="es-MX" w:eastAsia="es-MX"/>
-    </w:rPr>
-  </w:style>
-  <w:style w:type="character" w:styleId="ListLabel35">
-    <w:name w:val="ListLabel 35"/>
-    <w:qFormat/>
-    <w:rPr>
-      <w:rFonts w:ascii="Comfortaa Light" w:hAnsi="Comfortaa Light"/>
-      <w:sz w:val="20"/>
-      <w:szCs w:val="20"/>
-      <w:u w:val="single"/>
-      <w:shd w:fill="FFFFFF" w:val="clear"/>
-      <w:lang w:val="es-MX" w:eastAsia="es-MX"/>
-    </w:rPr>
-  </w:style>
-  <w:style w:type="character" w:styleId="ListLabel36">
-    <w:name w:val="ListLabel 36"/>
-    <w:qFormat/>
-    <w:rPr>
-      <w:rFonts w:ascii="Comfortaa Light" w:hAnsi="Comfortaa Light" w:eastAsia="Times New Roman" w:cs="Arial"/>
-      <w:color w:val="000000" w:themeColor="text1"/>
-      <w:sz w:val="20"/>
-      <w:szCs w:val="20"/>
-      <w:highlight w:val="yellow"/>
-      <w:lang w:val="es-MX" w:eastAsia="es-MX"/>
-    </w:rPr>
-  </w:style>
-  <w:style w:type="character" w:styleId="Enlacedelndice">
+  <w:style w:type="character" w:styleId="Enlacedelndice" w:customStyle="1">
     <w:name w:val="Enlace del índice"/>
     <w:qFormat/>
     <w:rPr/>
   </w:style>
-  <w:style w:type="paragraph" w:styleId="Ttulo">
+  <w:style w:type="paragraph" w:styleId="Ttulo" w:customStyle="1">
     <w:name w:val="Título"/>
     <w:basedOn w:val="Normal"/>
     <w:next w:val="Cuerpodetexto"/>
+    <w:link w:val="TtuloCar"/>
     <w:qFormat/>
     <w:pPr>
       <w:keepNext w:val="true"/>
@@ -10590,7 +11400,7 @@
       <w:szCs w:val="24"/>
     </w:rPr>
   </w:style>
-  <w:style w:type="paragraph" w:styleId="Ndice">
+  <w:style w:type="paragraph" w:styleId="Ndice" w:customStyle="1">
     <w:name w:val="Índice"/>
     <w:basedOn w:val="Normal"/>
     <w:qFormat/>
@@ -10599,6 +11409,22 @@
     </w:pPr>
     <w:rPr>
       <w:rFonts w:cs="Lohit Devanagari"/>
+    </w:rPr>
+  </w:style>
+  <w:style w:type="paragraph" w:styleId="Caption">
+    <w:name w:val="caption"/>
+    <w:basedOn w:val="Normal"/>
+    <w:qFormat/>
+    <w:pPr>
+      <w:suppressLineNumbers/>
+      <w:spacing w:before="120" w:after="120"/>
+    </w:pPr>
+    <w:rPr>
+      <w:rFonts w:cs="Lohit Devanagari"/>
+      <w:i/>
+      <w:iCs/>
+      <w:sz w:val="24"/>
+      <w:szCs w:val="24"/>
     </w:rPr>
   </w:style>
   <w:style w:type="paragraph" w:styleId="NormalWeb">
@@ -10622,7 +11448,7 @@
   <w:style w:type="paragraph" w:styleId="Annotationtext">
     <w:name w:val="annotation text"/>
     <w:basedOn w:val="Normal"/>
-    <w:link w:val="TextocomentarioCar"/>
+    <w:link w:val="CommentTextChar"/>
     <w:uiPriority w:val="99"/>
     <w:semiHidden/>
     <w:unhideWhenUsed/>
@@ -10639,7 +11465,7 @@
   <w:style w:type="paragraph" w:styleId="Annotationsubject">
     <w:name w:val="annotation subject"/>
     <w:basedOn w:val="Annotationtext"/>
-    <w:link w:val="AsuntodelcomentarioCar"/>
+    <w:link w:val="CommentSubjectChar"/>
     <w:uiPriority w:val="99"/>
     <w:semiHidden/>
     <w:unhideWhenUsed/>
@@ -10654,7 +11480,7 @@
   <w:style w:type="paragraph" w:styleId="BalloonText">
     <w:name w:val="Balloon Text"/>
     <w:basedOn w:val="Normal"/>
-    <w:link w:val="TextodegloboCar"/>
+    <w:link w:val="BalloonTextChar"/>
     <w:uiPriority w:val="99"/>
     <w:semiHidden/>
     <w:unhideWhenUsed/>
@@ -10669,11 +11495,10 @@
       <w:szCs w:val="18"/>
     </w:rPr>
   </w:style>
-  <w:style w:type="paragraph" w:styleId="Titular">
+  <w:style w:type="paragraph" w:styleId="Ttulogeneral">
     <w:name w:val="Title"/>
     <w:basedOn w:val="Normal"/>
     <w:next w:val="Normal"/>
-    <w:link w:val="TtuloCar"/>
     <w:uiPriority w:val="10"/>
     <w:qFormat/>
     <w:rsid w:val="009a5919"/>
@@ -10701,7 +11526,20 @@
       <w:lang w:eastAsia="es-MX"/>
     </w:rPr>
   </w:style>
-  <w:style w:type="paragraph" w:styleId="TOCHeading">
+  <w:style w:type="paragraph" w:styleId="Indexheading">
+    <w:name w:val="index heading"/>
+    <w:basedOn w:val="Ttulo"/>
+    <w:qFormat/>
+    <w:pPr/>
+    <w:rPr/>
+  </w:style>
+  <w:style w:type="paragraph" w:styleId="Ttulodelndice">
+    <w:name w:val="Index Heading"/>
+    <w:basedOn w:val="Ttulo"/>
+    <w:pPr/>
+    <w:rPr/>
+  </w:style>
+  <w:style w:type="paragraph" w:styleId="Ttulodelsumario">
     <w:name w:val="TOC Heading"/>
     <w:basedOn w:val="Ttulo1"/>
     <w:next w:val="Normal"/>
@@ -10740,15 +11578,23 @@
     </w:pPr>
     <w:rPr/>
   </w:style>
+  <w:style w:type="paragraph" w:styleId="Cabeceraypie" w:customStyle="1">
+    <w:name w:val="Cabecera y pie"/>
+    <w:basedOn w:val="Normal"/>
+    <w:qFormat/>
+    <w:pPr/>
+    <w:rPr/>
+  </w:style>
   <w:style w:type="paragraph" w:styleId="Cabecera">
     <w:name w:val="Header"/>
     <w:basedOn w:val="Normal"/>
-    <w:link w:val="EncabezadoCar"/>
+    <w:link w:val="HeaderChar"/>
     <w:uiPriority w:val="99"/>
     <w:unhideWhenUsed/>
     <w:rsid w:val="00493375"/>
     <w:pPr>
       <w:tabs>
+        <w:tab w:val="clear" w:pos="720"/>
         <w:tab w:val="center" w:pos="4680" w:leader="none"/>
         <w:tab w:val="right" w:pos="9360" w:leader="none"/>
       </w:tabs>
@@ -10759,12 +11605,13 @@
   <w:style w:type="paragraph" w:styleId="Piedepgina">
     <w:name w:val="Footer"/>
     <w:basedOn w:val="Normal"/>
-    <w:link w:val="PiedepginaCar"/>
+    <w:link w:val="FooterChar"/>
     <w:uiPriority w:val="99"/>
     <w:unhideWhenUsed/>
     <w:rsid w:val="00493375"/>
     <w:pPr>
       <w:tabs>
+        <w:tab w:val="clear" w:pos="720"/>
         <w:tab w:val="center" w:pos="4680" w:leader="none"/>
         <w:tab w:val="right" w:pos="9360" w:leader="none"/>
       </w:tabs>
@@ -10779,8 +11626,9 @@
     <w:rsid w:val="00493375"/>
     <w:pPr>
       <w:widowControl/>
+      <w:suppressAutoHyphens w:val="true"/>
       <w:bidi w:val="0"/>
-      <w:spacing w:lineRule="auto" w:line="240" w:before="0" w:after="0"/>
+      <w:spacing w:before="0" w:after="0"/>
       <w:jc w:val="left"/>
     </w:pPr>
     <w:rPr>
@@ -10799,13 +11647,12 @@
     <w:unhideWhenUsed/>
     <w:qFormat/>
   </w:style>
-  <w:style w:type="table" w:default="1" w:styleId="Tablanormal">
+  <w:style w:type="table" w:default="1" w:styleId="TableNormal">
     <w:name w:val="Normal Table"/>
     <w:uiPriority w:val="99"/>
     <w:semiHidden/>
     <w:unhideWhenUsed/>
     <w:tblPr>
-      <w:tblInd w:w="0" w:type="dxa"/>
       <w:tblCellMar>
         <w:top w:w="0" w:type="dxa"/>
         <w:left w:w="108" w:type="dxa"/>
@@ -10814,14 +11661,11 @@
       </w:tblCellMar>
     </w:tblPr>
   </w:style>
-  <w:style w:type="table" w:styleId="Tablaconcuadrcula">
+  <w:style w:type="table" w:styleId="TableGrid">
     <w:name w:val="Table Grid"/>
-    <w:basedOn w:val="Tablanormal"/>
+    <w:basedOn w:val="TableNormal"/>
     <w:uiPriority w:val="39"/>
     <w:rsid w:val="00ac6061"/>
-    <w:pPr>
-      <w:spacing w:after="0" w:line="240" w:lineRule="auto"/>
-    </w:pPr>
     <w:tblPr>
       <w:tblBorders>
         <w:top w:val="single" w:color="auto" w:sz="4" w:space="0"/>
@@ -11136,7 +11980,7 @@
 </file>
 
 <file path=customXml/itemProps1.xml><?xml version="1.0" encoding="utf-8"?>
-<ds:datastoreItem xmlns:ds="http://schemas.openxmlformats.org/officeDocument/2006/customXml" ds:itemID="{C1E379C2-FA85-42A7-B35B-844D9AB2AC35}">
+<ds:datastoreItem xmlns:ds="http://schemas.openxmlformats.org/officeDocument/2006/customXml" ds:itemID="{F282F569-8E9A-4EA9-B420-D6929F20A8B8}">
   <ds:schemaRefs>
     <ds:schemaRef ds:uri="http://schemas.openxmlformats.org/officeDocument/2006/bibliography"/>
   </ds:schemaRefs>

</xml_diff>